<commit_message>
report: align figures through 2.23 and specify stop at state 6
</commit_message>
<xml_diff>
--- a/deliverables/Курсовая_Блинов_текущая.docx
+++ b/deliverables/Курсовая_Блинов_текущая.docx
@@ -2327,9 +2327,9 @@
               <w:color w:val="000000"/>
               <w:sz w:val="24"/>
             </w:rPr>
-            <w:t>2.3.3 Временные диаграммы выходных сигналов генератора</w:t>
+            <w:t>2.3.3 Временные диаграммы таймера и D-триггера</w:t>
             <w:tab/>
-            <w:t>23</w:t>
+            <w:t>26</w:t>
           </w:r>
         </w:p>
         <w:p>
@@ -12688,7 +12688,7 @@
           <w:color w:val="000000"/>
           <w:sz w:val="28"/>
         </w:rPr>
-        <w:t>Для проверки DC1 к его входам подключаются Q3…Q0 и NOT_Q3…NOT_Q0 работающего ПСУ. Поскольку четыре входных и четырнадцать выходных сигналов не помещаются одновременно на шестнадцати каналах одного логического анализатора, используются два прибора XLA1 и XLA2. Карта подключения приведена на рисунке 2.11.</w:t>
+        <w:t>Для проверки четырнадцати выходов DC1 достаточно одного логического анализатора XLA1. Число его информационных каналов равно 16. Сигналы Q3…Q0 контролируются отдельно по уже подключённому HEX-индикатору. Точная карта каналов приведена на рисунке 2.11; каждый горизонтальный провод соответствует одному выходу.</w:t>
       </w:r>
     </w:p>
     <w:p>
@@ -12713,8 +12713,8 @@
       <w:r>
         <w:drawing>
           <wp:inline xmlns:a="http://schemas.openxmlformats.org/drawingml/2006/main" xmlns:pic="http://schemas.openxmlformats.org/drawingml/2006/picture">
-            <wp:extent cx="5940000" cy="2301750"/>
-            <wp:docPr id="918597018" name="Picture 918597018" descr="Рисунок 2.11 – Расчётная схема подключения приборов для проверки DC1"/>
+            <wp:extent cx="5760000" cy="4167529"/>
+            <wp:docPr id="918597018" name="Picture 918597018" descr="Рисунок 2.11 – Расчётная схема подключения DC1 к одному логическому анализатору"/>
             <wp:cNvGraphicFramePr>
               <a:graphicFrameLocks noChangeAspect="1"/>
             </wp:cNvGraphicFramePr>
@@ -12722,11 +12722,11 @@
               <a:graphicData uri="http://schemas.openxmlformats.org/drawingml/2006/picture">
                 <pic:pic>
                   <pic:nvPicPr>
-                    <pic:cNvPr id="0" name="fig_2_11_decoder_test.png"/>
+                    <pic:cNvPr id="0" name="fig_2_11.png"/>
                     <pic:cNvPicPr/>
                   </pic:nvPicPr>
                   <pic:blipFill>
-                    <a:blip r:embed="rId25"/>
+                    <a:blip r:embed="rId31"/>
                     <a:stretch>
                       <a:fillRect/>
                     </a:stretch>
@@ -12734,7 +12734,7 @@
                   <pic:spPr>
                     <a:xfrm>
                       <a:off x="0" y="0"/>
-                      <a:ext cx="5940000" cy="2301750"/>
+                      <a:ext cx="5760000" cy="4167529"/>
                     </a:xfrm>
                     <a:prstGeom prst="rect"/>
                   </pic:spPr>
@@ -12762,7 +12762,7 @@
           <w:color w:val="000000"/>
           <w:sz w:val="28"/>
         </w:rPr>
-        <w:t>Рисунок 2.11 – Расчётная схема подключения приборов для проверки DC1</w:t>
+        <w:t>Рисунок 2.11 – Расчётная схема подключения DC1 к одному логическому анализатору</w:t>
       </w:r>
     </w:p>
     <w:p>
@@ -12778,7 +12778,18 @@
           <w:color w:val="000000"/>
           <w:sz w:val="28"/>
         </w:rPr>
-        <w:t>Вход C обоих приборов соединяется с тактовой цепью CLK, а источник синхронизации выбирается External (C). Для обзорной диаграммы допускается использовать уже проверенный тестовый генератор ПСУ. Частота тестирования не изменяет таблицу истинности дешифратора.</w:t>
+        <w:t>Вход C соединяется с тактовой цепью CLK; выбирается External (C). Каналы 15 и 16, входы Q и T не используются. Два прибора нужны только для одновременной записи всех 18 сигналов: четырёх Q и четырнадцати Y. В образце с десятью состояниями такая запись занимает 14 каналов, поэтому там достаточно одного XLA.</w:t>
+      </w:r>
+    </w:p>
+    <w:p>
+      <w:pPr>
+        <w:spacing w:after="0" w:before="0" w:line="240" w:lineRule="auto"/>
+      </w:pPr>
+      <w:r>
+        <w:rPr>
+          <w:sz w:val="2"/>
+        </w:rPr>
+        <w:br w:type="page"/>
       </w:r>
     </w:p>
     <w:p>
@@ -12794,50 +12805,7 @@
           <w:color w:val="000000"/>
           <w:sz w:val="28"/>
         </w:rPr>
-        <w:t>Для каждого установившегося состояния проверяется соответствие активного выхода коду на HEX-индикаторе. Выходы должны включаться в порядке Y13, Y2, Y14, Y11, Y0, Y12, Y9, Y5, Y7, Y8, Y4, Y3, Y10, Y6. Затем последовательность повторяется.</w:t>
-      </w:r>
-    </w:p>
-    <w:p>
-      <w:pPr>
-        <w:spacing w:line="360" w:lineRule="auto" w:before="0" w:after="0"/>
-        <w:ind w:right="283" w:firstLine="709"/>
-        <w:jc w:val="both"/>
-      </w:pPr>
-      <w:r>
-        <w:rPr>
-          <w:rFonts w:ascii="Times New Roman" w:hAnsi="Times New Roman"/>
-          <w:b w:val="0"/>
-          <w:color w:val="000000"/>
-          <w:sz w:val="28"/>
-        </w:rPr>
-        <w:t>Отдельная проверка всех шестнадцати кодов выполняется четырьмя цифровыми переключателями с инверторами или генератором слов. При коде 1 активируются Y0, Y3, Y5 и Y9; при коде 15 — Y7, Y11, Y13 и Y14. Это следствие выбранной минимизации, а не ошибка таблицы рабочего цикла.</w:t>
-      </w:r>
-    </w:p>
-    <w:p>
-      <w:pPr>
-        <w:spacing w:after="0" w:before="0" w:line="240" w:lineRule="auto"/>
-      </w:pPr>
-      <w:r>
-        <w:rPr>
-          <w:sz w:val="2"/>
-        </w:rPr>
-        <w:br w:type="page"/>
-      </w:r>
-    </w:p>
-    <w:p>
-      <w:pPr>
-        <w:spacing w:line="360" w:lineRule="auto" w:before="0" w:after="0"/>
-        <w:ind w:right="283" w:firstLine="709"/>
-        <w:jc w:val="both"/>
-      </w:pPr>
-      <w:r>
-        <w:rPr>
-          <w:rFonts w:ascii="Times New Roman" w:hAnsi="Times New Roman"/>
-          <w:b w:val="0"/>
-          <w:color w:val="000000"/>
-          <w:sz w:val="28"/>
-        </w:rPr>
-        <w:t>На рисунке 2.12 приведена расчётная диаграмма одного полного цикла. Каждый столбец соответствует одному установившемуся состоянию; длительность столбца определяется периодом тактового сигнала.</w:t>
+        <w:t>На рисунке 2.12 показан порядок активизации выходов в рабочих состояниях. Над диаграммами указан шестнадцатеричный код HEX-индикатора; это поясняющая строка, а не четыре дополнительных канала анализатора.</w:t>
       </w:r>
     </w:p>
     <w:p>
@@ -12862,8 +12830,8 @@
       <w:r>
         <w:drawing>
           <wp:inline xmlns:a="http://schemas.openxmlformats.org/drawingml/2006/main" xmlns:pic="http://schemas.openxmlformats.org/drawingml/2006/picture">
-            <wp:extent cx="6120000" cy="3657931"/>
-            <wp:docPr id="918597019" name="Picture 918597019" descr="Рисунок 2.12 – Расчётные временные диаграммы сигналов Q3…Q0 и выходов дешифратора"/>
+            <wp:extent cx="5940000" cy="3703765"/>
+            <wp:docPr id="918597019" name="Picture 918597019" descr="Рисунок 2.12 – Расчётные временные диаграммы четырнадцати выходов дешифратора"/>
             <wp:cNvGraphicFramePr>
               <a:graphicFrameLocks noChangeAspect="1"/>
             </wp:cNvGraphicFramePr>
@@ -12871,11 +12839,11 @@
               <a:graphicData uri="http://schemas.openxmlformats.org/drawingml/2006/picture">
                 <pic:pic>
                   <pic:nvPicPr>
-                    <pic:cNvPr id="0" name="fig_2_12_decoder_timing.png"/>
+                    <pic:cNvPr id="0" name="fig_2_12.png"/>
                     <pic:cNvPicPr/>
                   </pic:nvPicPr>
                   <pic:blipFill>
-                    <a:blip r:embed="rId26"/>
+                    <a:blip r:embed="rId32"/>
                     <a:stretch>
                       <a:fillRect/>
                     </a:stretch>
@@ -12883,7 +12851,7 @@
                   <pic:spPr>
                     <a:xfrm>
                       <a:off x="0" y="0"/>
-                      <a:ext cx="6120000" cy="3657931"/>
+                      <a:ext cx="5940000" cy="3703765"/>
                     </a:xfrm>
                     <a:prstGeom prst="rect"/>
                   </pic:spPr>
@@ -12911,7 +12879,7 @@
           <w:color w:val="000000"/>
           <w:sz w:val="28"/>
         </w:rPr>
-        <w:t>Рисунок 2.12 – Расчётные временные диаграммы сигналов Q3…Q0 и выходов дешифратора</w:t>
+        <w:t>Рисунок 2.12 – Расчётные временные диаграммы четырнадцати выходов дешифратора</w:t>
       </w:r>
     </w:p>
     <w:p>
@@ -12927,7 +12895,7 @@
           <w:color w:val="000000"/>
           <w:sz w:val="28"/>
         </w:rPr>
-        <w:t>Перебор всех четырнадцати рабочих кодов подтверждает единственность активного выхода. Диаграмма построена по логическим функциям (2.1)–(2.14); для подтверждения работы схемной модели требуется сопоставить её со снимками логических анализаторов NI Multisim.</w:t>
+        <w:t>Последовательность выходов: Y13, Y2, Y14, Y11, Y0, Y12, Y9, Y5, Y7, Y8, Y4, Y3, Y10, Y6. При работе с управляющим генератором раздела 2.3 счёт останавливается на 6, и Y6 сохраняет единицу. При отдельной проверке ПСУ свободным тактовым источником цикл может повторяться.</w:t>
       </w:r>
     </w:p>
     <w:p>
@@ -12943,7 +12911,7 @@
           <w:color w:val="000000"/>
           <w:sz w:val="28"/>
         </w:rPr>
-        <w:t>При переключении нескольких разрядов ПСУ задержки реальных элементов могут создавать кратковременные выбросы на выходах комбинационного дешифратора. На расчётной диаграмме они не показаны. Поэтому проверка унитарности относится к установившимся уровням, а управляющие воздействия следует оценивать после завершения переходных процессов.</w:t>
+        <w:t>На неиспользуемом коде 1 активны Y0, Y3, Y5 и Y9; на коде 15 — Y7, Y11, Y13 и Y14. Это результат минимизации с факультативными наборами. Кратковременные выбросы при переключениях на расчётной диаграмме не изображены; унитарность проверяется после установления уровней. Фактическую запись XLA необходимо получить в Multisim.</w:t>
       </w:r>
     </w:p>
     <w:p>
@@ -12999,7 +12967,7 @@
           <w:color w:val="000000"/>
           <w:sz w:val="28"/>
         </w:rPr>
-        <w:t>1. Управляемый генератор — на базе микросхемы LM555.</w:t>
+        <w:t>1. Управляемый генератор — на базе LM555, питание 5 В.</w:t>
       </w:r>
     </w:p>
     <w:p>
@@ -13015,7 +12983,7 @@
           <w:color w:val="000000"/>
           <w:sz w:val="28"/>
         </w:rPr>
-        <w:t>2. Длительность высокого уровня выходного импульса tH = 0,66 с.</w:t>
+        <w:t>2. Длительность высокого уровня CLK: tH = 0,66 с; период T = 1,35 с.</w:t>
       </w:r>
     </w:p>
     <w:p>
@@ -13031,7 +12999,7 @@
           <w:color w:val="000000"/>
           <w:sz w:val="28"/>
         </w:rPr>
-        <w:t>3. Период повторения импульсов T = 1,35 с.</w:t>
+        <w:t>3. Запуск — отдельным сигналом START; автоматическая остановка после достижения состояния 6. Повторный запуск — после общей начальной установки 13.</w:t>
       </w:r>
     </w:p>
     <w:p>
@@ -13067,7 +13035,7 @@
           <w:color w:val="000000"/>
           <w:sz w:val="28"/>
         </w:rPr>
-        <w:t>Для формирования тактовой последовательности используется LM555 в автоколебательном режиме. Питание таймера и TTL-логики принято равным 5 В. Расположение выводов LM555 показано на рисунке 2.13 в соответствии с документацией Texas Instruments «LM555 Timer», раздел 5.</w:t>
+        <w:t>LM555 используется в астабильном режиме. Его выводы приведены на рисунке 2.13 по документации Texas Instruments. Низкий уровень /RESET принудительно устанавливает OUT в ноль и прекращает генерацию.</w:t>
       </w:r>
     </w:p>
     <w:p>
@@ -13101,7 +13069,7 @@
               <a:graphicData uri="http://schemas.openxmlformats.org/drawingml/2006/picture">
                 <pic:pic>
                   <pic:nvPicPr>
-                    <pic:cNvPr id="0" name="fig_2_13_lm555_pinout.png"/>
+                    <pic:cNvPr id="0" name="image.png"/>
                     <pic:cNvPicPr/>
                   </pic:nvPicPr>
                   <pic:blipFill>
@@ -13157,7 +13125,7 @@
           <w:color w:val="000000"/>
           <w:sz w:val="28"/>
         </w:rPr>
-        <w:t>Выводы 2 и 6 соединяются с времязадающим конденсатором. При достижении напряжения 2/3 питания включается разряд через вывод 7; при снижении до 1/3 питания начинается заряд. На выводе 3 формируется прямоугольный сигнал. Низкий уровень на входе /RESET (вывод 4) останавливает генерацию и устанавливает низкий уровень OUT.</w:t>
+        <w:t>Пороговые уровни конденсатора составляют приблизительно 1/3 и 2/3 напряжения питания. Во время заряда через R1 и R2 на OUT действует высокий уровень, а при разряде через R2 и вывод DISCH — низкий. Базовое включение показано на рисунке 2.14.</w:t>
       </w:r>
     </w:p>
     <w:p>
@@ -13169,6 +13137,80 @@
           <w:sz w:val="2"/>
         </w:rPr>
         <w:br w:type="page"/>
+      </w:r>
+    </w:p>
+    <w:p>
+      <w:pPr>
+        <w:keepNext/>
+        <w:keepLines/>
+        <w:spacing w:before="0" w:after="80" w:line="240" w:lineRule="auto"/>
+        <w:ind w:right="283" w:firstLine="0"/>
+        <w:jc w:val="center"/>
+        <w:rPr>
+          <w:sz w:val="28"/>
+        </w:rPr>
+      </w:pPr>
+      <w:r>
+        <w:rPr>
+          <w:rFonts w:ascii="Times New Roman" w:hAnsi="Times New Roman"/>
+          <w:b w:val="0"/>
+          <w:color w:val="000000"/>
+          <w:sz w:val="28"/>
+        </w:rPr>
+      </w:r>
+      <w:r>
+        <w:drawing>
+          <wp:inline xmlns:a="http://schemas.openxmlformats.org/drawingml/2006/main" xmlns:pic="http://schemas.openxmlformats.org/drawingml/2006/picture">
+            <wp:extent cx="5580000" cy="2894625"/>
+            <wp:docPr id="918597021" name="Picture 918597021" descr="Рисунок 2.14 – Базовая схема астабильного включения LM555"/>
+            <wp:cNvGraphicFramePr>
+              <a:graphicFrameLocks noChangeAspect="1"/>
+            </wp:cNvGraphicFramePr>
+            <a:graphic>
+              <a:graphicData uri="http://schemas.openxmlformats.org/drawingml/2006/picture">
+                <pic:pic>
+                  <pic:nvPicPr>
+                    <pic:cNvPr id="0" name="fig_2_14.png"/>
+                    <pic:cNvPicPr/>
+                  </pic:nvPicPr>
+                  <pic:blipFill>
+                    <a:blip r:embed="rId33"/>
+                    <a:stretch>
+                      <a:fillRect/>
+                    </a:stretch>
+                  </pic:blipFill>
+                  <pic:spPr>
+                    <a:xfrm>
+                      <a:off x="0" y="0"/>
+                      <a:ext cx="5580000" cy="2894625"/>
+                    </a:xfrm>
+                    <a:prstGeom prst="rect"/>
+                  </pic:spPr>
+                </pic:pic>
+              </a:graphicData>
+            </a:graphic>
+          </wp:inline>
+        </w:drawing>
+      </w:r>
+    </w:p>
+    <w:p>
+      <w:pPr>
+        <w:keepLines/>
+        <w:spacing w:before="0" w:after="160" w:line="276" w:lineRule="auto"/>
+        <w:ind w:right="283" w:firstLine="0"/>
+        <w:jc w:val="center"/>
+        <w:rPr>
+          <w:sz w:val="28"/>
+        </w:rPr>
+      </w:pPr>
+      <w:r>
+        <w:rPr>
+          <w:rFonts w:ascii="Times New Roman" w:hAnsi="Times New Roman"/>
+          <w:b w:val="0"/>
+          <w:color w:val="000000"/>
+          <w:sz w:val="28"/>
+        </w:rPr>
+        <w:t>Рисунок 2.14 – Базовая схема астабильного включения LM555</w:t>
       </w:r>
     </w:p>
     <w:p>
@@ -13184,7 +13226,124 @@
           <w:color w:val="000000"/>
           <w:sz w:val="28"/>
         </w:rPr>
-        <w:t>Длительность низкого уровня на требуемом выходе CLK и коэффициент заполнения определяются по заданным значениям:</w:t>
+        <w:t>Выводы 2 TRIG и 6 THRESH соединены с C1. R1 включён между питанием и выводом 7; R2 — между выводом 7 и C1. Конденсатор C2 подавляет помехи по входу CTRL. Для первоначальной проверки /RESET соединяется с +5 В, а прямой выход OUT подаётся на канал A осциллографа.</w:t>
+      </w:r>
+    </w:p>
+    <w:p>
+      <w:pPr>
+        <w:keepNext/>
+        <w:keepLines/>
+        <w:spacing w:before="0" w:after="80" w:line="240" w:lineRule="auto"/>
+        <w:ind w:right="283" w:firstLine="0"/>
+        <w:jc w:val="center"/>
+        <w:rPr>
+          <w:sz w:val="28"/>
+        </w:rPr>
+      </w:pPr>
+      <w:r>
+        <w:rPr>
+          <w:rFonts w:ascii="Times New Roman" w:hAnsi="Times New Roman"/>
+          <w:b w:val="0"/>
+          <w:color w:val="000000"/>
+          <w:sz w:val="28"/>
+        </w:rPr>
+      </w:r>
+      <w:r>
+        <w:drawing>
+          <wp:inline xmlns:a="http://schemas.openxmlformats.org/drawingml/2006/main" xmlns:pic="http://schemas.openxmlformats.org/drawingml/2006/picture">
+            <wp:extent cx="5580000" cy="2894625"/>
+            <wp:docPr id="918597022" name="Picture 918597022" descr="Рисунок 2.15 – Расчётная схема первоначальной проверки прямого выхода LM555"/>
+            <wp:cNvGraphicFramePr>
+              <a:graphicFrameLocks noChangeAspect="1"/>
+            </wp:cNvGraphicFramePr>
+            <a:graphic>
+              <a:graphicData uri="http://schemas.openxmlformats.org/drawingml/2006/picture">
+                <pic:pic>
+                  <pic:nvPicPr>
+                    <pic:cNvPr id="0" name="fig_2_15.png"/>
+                    <pic:cNvPicPr/>
+                  </pic:nvPicPr>
+                  <pic:blipFill>
+                    <a:blip r:embed="rId34"/>
+                    <a:stretch>
+                      <a:fillRect/>
+                    </a:stretch>
+                  </pic:blipFill>
+                  <pic:spPr>
+                    <a:xfrm>
+                      <a:off x="0" y="0"/>
+                      <a:ext cx="5580000" cy="2894625"/>
+                    </a:xfrm>
+                    <a:prstGeom prst="rect"/>
+                  </pic:spPr>
+                </pic:pic>
+              </a:graphicData>
+            </a:graphic>
+          </wp:inline>
+        </w:drawing>
+      </w:r>
+    </w:p>
+    <w:p>
+      <w:pPr>
+        <w:keepLines/>
+        <w:spacing w:before="0" w:after="160" w:line="276" w:lineRule="auto"/>
+        <w:ind w:right="283" w:firstLine="0"/>
+        <w:jc w:val="center"/>
+        <w:rPr>
+          <w:sz w:val="28"/>
+        </w:rPr>
+      </w:pPr>
+      <w:r>
+        <w:rPr>
+          <w:rFonts w:ascii="Times New Roman" w:hAnsi="Times New Roman"/>
+          <w:b w:val="0"/>
+          <w:color w:val="000000"/>
+          <w:sz w:val="28"/>
+        </w:rPr>
+        <w:t>Рисунок 2.15 – Расчётная схема первоначальной проверки прямого выхода LM555</w:t>
+      </w:r>
+    </w:p>
+    <w:p>
+      <w:pPr>
+        <w:spacing w:line="360" w:lineRule="auto" w:before="0" w:after="0"/>
+        <w:ind w:right="283" w:firstLine="709"/>
+        <w:jc w:val="both"/>
+      </w:pPr>
+      <w:r>
+        <w:rPr>
+          <w:rFonts w:ascii="Times New Roman" w:hAnsi="Times New Roman"/>
+          <w:b w:val="0"/>
+          <w:color w:val="000000"/>
+          <w:sz w:val="28"/>
+        </w:rPr>
+        <w:t>Рисунок 2.15 задаёт подключения прибора, а не результат моделирования. До расчёта R1 и R2 их числовые значения не назначаются. Окончательная схема с номиналами приведена на рисунке 2.17.</w:t>
+      </w:r>
+    </w:p>
+    <w:p>
+      <w:pPr>
+        <w:spacing w:after="0" w:before="0" w:line="240" w:lineRule="auto"/>
+      </w:pPr>
+      <w:r>
+        <w:rPr>
+          <w:sz w:val="2"/>
+        </w:rPr>
+        <w:br w:type="page"/>
+      </w:r>
+    </w:p>
+    <w:p>
+      <w:pPr>
+        <w:spacing w:line="360" w:lineRule="auto" w:before="0" w:after="0"/>
+        <w:ind w:right="283" w:firstLine="709"/>
+        <w:jc w:val="both"/>
+      </w:pPr>
+      <w:r>
+        <w:rPr>
+          <w:rFonts w:ascii="Times New Roman" w:hAnsi="Times New Roman"/>
+          <w:b w:val="0"/>
+          <w:color w:val="000000"/>
+          <w:sz w:val="28"/>
+        </w:rPr>
+        <w:t>По заданию длительность низкого уровня и коэффициент заполнения равны:</w:t>
       </w:r>
     </w:p>
     <w:p>
@@ -13289,7 +13448,7 @@
           </m:sub>
         </m:sSub>
         <m:r>
-          <m:t> / T = 0,66 / 1,35 ≈ 0,4889 = 48,89 %</m:t>
+          <m:t> / T = 0,66 / 1,35 ≈ 48,89 %</m:t>
         </m:r>
       </m:oMath>
       <w:r>
@@ -13316,7 +13475,7 @@
           <w:color w:val="000000"/>
           <w:sz w:val="28"/>
         </w:rPr>
-        <w:t>В стандартной астабильной схеме LM555 длительность высокого уровня OUT больше длительности низкого. Поэтому для получения заполнения менее 50 % на выходе устанавливается инвертор 74LS04. После инвертирования высокий уровень CLK соответствует разряду C1, а низкий — заряду. Схема с рассчитанными номиналами показана на рисунке 2.14.</w:t>
+        <w:t>У стандартного астабильного LM555 заполнение прямого выхода больше 50 %. Для требуемых 48,89 % необходим инвертор: в данном варианте применяется 74LS04. В отличие от образца, параметры которого другие, исключать инвертор нельзя.</w:t>
       </w:r>
     </w:p>
     <w:p>
@@ -13341,8 +13500,8 @@
       <w:r>
         <w:drawing>
           <wp:inline xmlns:a="http://schemas.openxmlformats.org/drawingml/2006/main" xmlns:pic="http://schemas.openxmlformats.org/drawingml/2006/picture">
-            <wp:extent cx="6120000" cy="3871084"/>
-            <wp:docPr id="918597021" name="Picture 918597021" descr="Рисунок 2.14 – Расчётная схема генератора на LM555 с инвертором"/>
+            <wp:extent cx="5940000" cy="2301750"/>
+            <wp:docPr id="918597023" name="Picture 918597023" descr="Рисунок 2.16 – Выбор инвертирующего каскада для заданной длительности импульса"/>
             <wp:cNvGraphicFramePr>
               <a:graphicFrameLocks noChangeAspect="1"/>
             </wp:cNvGraphicFramePr>
@@ -13350,11 +13509,11 @@
               <a:graphicData uri="http://schemas.openxmlformats.org/drawingml/2006/picture">
                 <pic:pic>
                   <pic:nvPicPr>
-                    <pic:cNvPr id="0" name="fig_2_14_generator_scheme.png"/>
+                    <pic:cNvPr id="0" name="fig_2_16.png"/>
                     <pic:cNvPicPr/>
                   </pic:nvPicPr>
                   <pic:blipFill>
-                    <a:blip r:embed="rId28"/>
+                    <a:blip r:embed="rId35"/>
                     <a:stretch>
                       <a:fillRect/>
                     </a:stretch>
@@ -13362,7 +13521,7 @@
                   <pic:spPr>
                     <a:xfrm>
                       <a:off x="0" y="0"/>
-                      <a:ext cx="6120000" cy="3871084"/>
+                      <a:ext cx="5940000" cy="2301750"/>
                     </a:xfrm>
                     <a:prstGeom prst="rect"/>
                   </pic:spPr>
@@ -13390,7 +13549,7 @@
           <w:color w:val="000000"/>
           <w:sz w:val="28"/>
         </w:rPr>
-        <w:t>Рисунок 2.14 – Расчётная схема генератора на LM555 с инвертором</w:t>
+        <w:t>Рисунок 2.16 – Выбор инвертирующего каскада для заданной длительности импульса</w:t>
       </w:r>
     </w:p>
     <w:p>
@@ -13406,34 +13565,7 @@
           <w:color w:val="000000"/>
           <w:sz w:val="28"/>
         </w:rPr>
-        <w:t>На выводе OUT таймера требуются высокий уровень 0,69 с и низкий уровень 0,66 с. После 74LS04 эти интервалы меняются местами. Точку измерения CLK следует выбирать именно после инвертора.</w:t>
-      </w:r>
-    </w:p>
-    <w:p>
-      <w:pPr>
-        <w:spacing w:after="0" w:before="0" w:line="240" w:lineRule="auto"/>
-      </w:pPr>
-      <w:r>
-        <w:rPr>
-          <w:sz w:val="2"/>
-        </w:rPr>
-        <w:br w:type="page"/>
-      </w:r>
-    </w:p>
-    <w:p>
-      <w:pPr>
-        <w:spacing w:line="360" w:lineRule="auto" w:before="0" w:after="0"/>
-        <w:ind w:right="283" w:firstLine="709"/>
-        <w:jc w:val="both"/>
-      </w:pPr>
-      <w:r>
-        <w:rPr>
-          <w:rFonts w:ascii="Times New Roman" w:hAnsi="Times New Roman"/>
-          <w:b w:val="0"/>
-          <w:color w:val="000000"/>
-          <w:sz w:val="28"/>
-        </w:rPr>
-        <w:t>Для стандартной схемы LM555 используются зависимости времени заряда и разряда из документации производителя, раздел 7.4.2. При расчёте коэффициент 0,693 уточнён до ln 2. Для инвертированного выхода получаем:</w:t>
+        <w:t>После инвертирования высокий уровень CLK соответствует разряду C1, низкий — заряду. Для установившегося режима справедливы зависимости производителя (коэффициент 0,693 уточнён до ln 2):</w:t>
       </w:r>
     </w:p>
     <w:p>
@@ -13721,6 +13853,17 @@
     </w:p>
     <w:p>
       <w:pPr>
+        <w:spacing w:after="0" w:before="0" w:line="240" w:lineRule="auto"/>
+      </w:pPr>
+      <w:r>
+        <w:rPr>
+          <w:sz w:val="2"/>
+        </w:rPr>
+        <w:br w:type="page"/>
+      </w:r>
+    </w:p>
+    <w:p>
+      <w:pPr>
         <w:spacing w:line="360" w:lineRule="auto" w:before="0" w:after="0"/>
         <w:ind w:right="283" w:firstLine="709"/>
         <w:jc w:val="both"/>
@@ -13732,7 +13875,7 @@
           <w:color w:val="000000"/>
           <w:sz w:val="28"/>
         </w:rPr>
-        <w:t>Принимаем C1 = 10 мкФ. Требуемые сопротивления составляют:</w:t>
+        <w:t>Принимаем C1 = 10 мкФ. Рассчитанные сопротивления составляют:</w:t>
       </w:r>
     </w:p>
     <w:p>
@@ -13846,7 +13989,108 @@
           <w:color w:val="000000"/>
           <w:sz w:val="28"/>
         </w:rPr>
-        <w:t>Выбираем ближайшие номиналы ряда E96: R1 = 4,32 кОм и R2 = 95,3 кОм. При идеальных номиналах и порогах таймера получаем значения таблицы 2.1. Погрешность рассчитана относительно технического задания.</w:t>
+        <w:t>Выбираем ближайшие номиналы E96: R1 = 4,32 кОм; R2 = 95,3 кОм. Полная схема с защитными и развязывающими конденсаторами показана на рисунке 2.17.</w:t>
+      </w:r>
+    </w:p>
+    <w:p>
+      <w:pPr>
+        <w:keepNext/>
+        <w:keepLines/>
+        <w:spacing w:before="0" w:after="80" w:line="240" w:lineRule="auto"/>
+        <w:ind w:right="283" w:firstLine="0"/>
+        <w:jc w:val="center"/>
+        <w:rPr>
+          <w:sz w:val="28"/>
+        </w:rPr>
+      </w:pPr>
+      <w:r>
+        <w:rPr>
+          <w:rFonts w:ascii="Times New Roman" w:hAnsi="Times New Roman"/>
+          <w:b w:val="0"/>
+          <w:color w:val="000000"/>
+          <w:sz w:val="28"/>
+        </w:rPr>
+      </w:r>
+      <w:r>
+        <w:drawing>
+          <wp:inline xmlns:a="http://schemas.openxmlformats.org/drawingml/2006/main" xmlns:pic="http://schemas.openxmlformats.org/drawingml/2006/picture">
+            <wp:extent cx="5940000" cy="3757229"/>
+            <wp:docPr id="918597024" name="Picture 918597024" descr="Рисунок 2.17 – Расчётная схема генератора с выбранными номиналами R1, R2 и C1"/>
+            <wp:cNvGraphicFramePr>
+              <a:graphicFrameLocks noChangeAspect="1"/>
+            </wp:cNvGraphicFramePr>
+            <a:graphic>
+              <a:graphicData uri="http://schemas.openxmlformats.org/drawingml/2006/picture">
+                <pic:pic>
+                  <pic:nvPicPr>
+                    <pic:cNvPr id="0" name="image.png"/>
+                    <pic:cNvPicPr/>
+                  </pic:nvPicPr>
+                  <pic:blipFill>
+                    <a:blip r:embed="rId28"/>
+                    <a:stretch>
+                      <a:fillRect/>
+                    </a:stretch>
+                  </pic:blipFill>
+                  <pic:spPr>
+                    <a:xfrm>
+                      <a:off x="0" y="0"/>
+                      <a:ext cx="5940000" cy="3757229"/>
+                    </a:xfrm>
+                    <a:prstGeom prst="rect"/>
+                  </pic:spPr>
+                </pic:pic>
+              </a:graphicData>
+            </a:graphic>
+          </wp:inline>
+        </w:drawing>
+      </w:r>
+    </w:p>
+    <w:p>
+      <w:pPr>
+        <w:keepLines/>
+        <w:spacing w:before="0" w:after="160" w:line="276" w:lineRule="auto"/>
+        <w:ind w:right="283" w:firstLine="0"/>
+        <w:jc w:val="center"/>
+        <w:rPr>
+          <w:sz w:val="28"/>
+        </w:rPr>
+      </w:pPr>
+      <w:r>
+        <w:rPr>
+          <w:rFonts w:ascii="Times New Roman" w:hAnsi="Times New Roman"/>
+          <w:b w:val="0"/>
+          <w:color w:val="000000"/>
+          <w:sz w:val="28"/>
+        </w:rPr>
+        <w:t>Рисунок 2.17 – Расчётная схема генератора с выбранными номиналами R1, R2 и C1</w:t>
+      </w:r>
+    </w:p>
+    <w:p>
+      <w:pPr>
+        <w:spacing w:line="360" w:lineRule="auto" w:before="0" w:after="0"/>
+        <w:ind w:right="283" w:firstLine="709"/>
+        <w:jc w:val="both"/>
+      </w:pPr>
+      <w:r>
+        <w:rPr>
+          <w:rFonts w:ascii="Times New Roman" w:hAnsi="Times New Roman"/>
+          <w:b w:val="0"/>
+          <w:color w:val="000000"/>
+          <w:sz w:val="28"/>
+        </w:rPr>
+        <w:t>При проверке только времязадающей части RUN временно заменяется постоянным уровнем +5 В. В составе устройства на вход /RESET подаётся выход триггера разрешения. Все точки GND объединяются; названия цепей на рисунках являются электрическими метками, а не отдельными источниками.</w:t>
+      </w:r>
+    </w:p>
+    <w:p>
+      <w:pPr>
+        <w:spacing w:after="0" w:before="0" w:line="240" w:lineRule="auto"/>
+      </w:pPr>
+      <w:r>
+        <w:rPr>
+          <w:sz w:val="2"/>
+        </w:rPr>
+        <w:br w:type="page"/>
       </w:r>
     </w:p>
     <w:p>
@@ -13892,7 +14136,7 @@
         </w:trPr>
         <w:tc>
           <w:tcPr>
-            <w:tcW w:type="dxa" w:w="3175"/>
+            <w:tcW w:type="dxa" w:w="2835"/>
           </w:tcPr>
           <w:p>
             <w:pPr>
@@ -13949,7 +14193,7 @@
         </w:tc>
         <w:tc>
           <w:tcPr>
-            <w:tcW w:type="dxa" w:w="2154"/>
+            <w:tcW w:type="dxa" w:w="2324"/>
           </w:tcPr>
           <w:p>
             <w:pPr>
@@ -13973,7 +14217,7 @@
         </w:trPr>
         <w:tc>
           <w:tcPr>
-            <w:tcW w:type="dxa" w:w="3175"/>
+            <w:tcW w:type="dxa" w:w="2835"/>
           </w:tcPr>
           <w:p>
             <w:pPr>
@@ -13986,7 +14230,7 @@
                 <w:color w:val="000000"/>
                 <w:sz w:val="24"/>
               </w:rPr>
-              <w:t>Высокий уровень CLK</w:t>
+              <w:t>tH CLK, с</w:t>
             </w:r>
           </w:p>
         </w:tc>
@@ -14005,7 +14249,7 @@
                 <w:color w:val="000000"/>
                 <w:sz w:val="24"/>
               </w:rPr>
-              <w:t>0,6600 с</w:t>
+              <w:t>0,6600</w:t>
             </w:r>
           </w:p>
         </w:tc>
@@ -14024,13 +14268,13 @@
                 <w:color w:val="000000"/>
                 <w:sz w:val="24"/>
               </w:rPr>
-              <w:t>0,660569 с</w:t>
-            </w:r>
-          </w:p>
-        </w:tc>
-        <w:tc>
-          <w:tcPr>
-            <w:tcW w:type="dxa" w:w="2154"/>
+              <w:t>0,660569</w:t>
+            </w:r>
+          </w:p>
+        </w:tc>
+        <w:tc>
+          <w:tcPr>
+            <w:tcW w:type="dxa" w:w="2324"/>
           </w:tcPr>
           <w:p>
             <w:pPr>
@@ -14054,7 +14298,7 @@
         </w:trPr>
         <w:tc>
           <w:tcPr>
-            <w:tcW w:type="dxa" w:w="3175"/>
+            <w:tcW w:type="dxa" w:w="2835"/>
           </w:tcPr>
           <w:p>
             <w:pPr>
@@ -14067,7 +14311,7 @@
                 <w:color w:val="000000"/>
                 <w:sz w:val="24"/>
               </w:rPr>
-              <w:t>Низкий уровень CLK</w:t>
+              <w:t>tL CLK, с</w:t>
             </w:r>
           </w:p>
         </w:tc>
@@ -14086,7 +14330,7 @@
                 <w:color w:val="000000"/>
                 <w:sz w:val="24"/>
               </w:rPr>
-              <w:t>0,6900 с</w:t>
+              <w:t>0,6900</w:t>
             </w:r>
           </w:p>
         </w:tc>
@@ -14105,13 +14349,13 @@
                 <w:color w:val="000000"/>
                 <w:sz w:val="24"/>
               </w:rPr>
-              <w:t>0,690513 с</w:t>
-            </w:r>
-          </w:p>
-        </w:tc>
-        <w:tc>
-          <w:tcPr>
-            <w:tcW w:type="dxa" w:w="2154"/>
+              <w:t>0,690513</w:t>
+            </w:r>
+          </w:p>
+        </w:tc>
+        <w:tc>
+          <w:tcPr>
+            <w:tcW w:type="dxa" w:w="2324"/>
           </w:tcPr>
           <w:p>
             <w:pPr>
@@ -14135,7 +14379,7 @@
         </w:trPr>
         <w:tc>
           <w:tcPr>
-            <w:tcW w:type="dxa" w:w="3175"/>
+            <w:tcW w:type="dxa" w:w="2835"/>
           </w:tcPr>
           <w:p>
             <w:pPr>
@@ -14148,7 +14392,7 @@
                 <w:color w:val="000000"/>
                 <w:sz w:val="24"/>
               </w:rPr>
-              <w:t>Период CLK</w:t>
+              <w:t>T CLK, с</w:t>
             </w:r>
           </w:p>
         </w:tc>
@@ -14167,7 +14411,7 @@
                 <w:color w:val="000000"/>
                 <w:sz w:val="24"/>
               </w:rPr>
-              <w:t>1,3500 с</w:t>
+              <w:t>1,3500</w:t>
             </w:r>
           </w:p>
         </w:tc>
@@ -14186,13 +14430,13 @@
                 <w:color w:val="000000"/>
                 <w:sz w:val="24"/>
               </w:rPr>
-              <w:t>1,351082 с</w:t>
-            </w:r>
-          </w:p>
-        </w:tc>
-        <w:tc>
-          <w:tcPr>
-            <w:tcW w:type="dxa" w:w="2154"/>
+              <w:t>1,351082</w:t>
+            </w:r>
+          </w:p>
+        </w:tc>
+        <w:tc>
+          <w:tcPr>
+            <w:tcW w:type="dxa" w:w="2324"/>
           </w:tcPr>
           <w:p>
             <w:pPr>
@@ -14216,7 +14460,7 @@
         </w:trPr>
         <w:tc>
           <w:tcPr>
-            <w:tcW w:type="dxa" w:w="3175"/>
+            <w:tcW w:type="dxa" w:w="2835"/>
           </w:tcPr>
           <w:p>
             <w:pPr>
@@ -14229,7 +14473,7 @@
                 <w:color w:val="000000"/>
                 <w:sz w:val="24"/>
               </w:rPr>
-              <w:t>Частота CLK</w:t>
+              <w:t>f CLK, Гц</w:t>
             </w:r>
           </w:p>
         </w:tc>
@@ -14248,7 +14492,7 @@
                 <w:color w:val="000000"/>
                 <w:sz w:val="24"/>
               </w:rPr>
-              <w:t>0,740741 Гц</w:t>
+              <w:t>0,7407</w:t>
             </w:r>
           </w:p>
         </w:tc>
@@ -14267,13 +14511,13 @@
                 <w:color w:val="000000"/>
                 <w:sz w:val="24"/>
               </w:rPr>
-              <w:t>0,740147 Гц</w:t>
-            </w:r>
-          </w:p>
-        </w:tc>
-        <w:tc>
-          <w:tcPr>
-            <w:tcW w:type="dxa" w:w="2154"/>
+              <w:t>0,740147</w:t>
+            </w:r>
+          </w:p>
+        </w:tc>
+        <w:tc>
+          <w:tcPr>
+            <w:tcW w:type="dxa" w:w="2324"/>
           </w:tcPr>
           <w:p>
             <w:pPr>
@@ -14305,50 +14549,7 @@
           <w:color w:val="000000"/>
           <w:sz w:val="28"/>
         </w:rPr>
-        <w:t>Отклонение из-за округления номиналов менее 0,09 %. Оно не является полной погрешностью устройства: фактические интервалы также зависят от допусков R и C, утечки конденсатора, порогов компараторов и напряжения насыщения разрядного транзистора.</w:t>
-      </w:r>
-    </w:p>
-    <w:p>
-      <w:pPr>
-        <w:spacing w:line="360" w:lineRule="auto" w:before="0" w:after="0"/>
-        <w:ind w:right="283" w:firstLine="709"/>
-        <w:jc w:val="both"/>
-      </w:pPr>
-      <w:r>
-        <w:rPr>
-          <w:rFonts w:ascii="Times New Roman" w:hAnsi="Times New Roman"/>
-          <w:b w:val="0"/>
-          <w:color w:val="000000"/>
-          <w:sz w:val="28"/>
-        </w:rPr>
-        <w:t>Например, при резисторах ±1 % и конденсаторе ±10 % только произведение RC меняется от 0,891 до 1,111 номинала. Дополнительная погрешность LM555 в этот интервал не включена. Для точной настройки сначала подбирают R2 по длительности высокого уровня CLK, затем R1 по периоду.</w:t>
-      </w:r>
-    </w:p>
-    <w:p>
-      <w:pPr>
-        <w:spacing w:after="0" w:before="0" w:line="240" w:lineRule="auto"/>
-      </w:pPr>
-      <w:r>
-        <w:rPr>
-          <w:sz w:val="2"/>
-        </w:rPr>
-        <w:br w:type="page"/>
-      </w:r>
-    </w:p>
-    <w:p>
-      <w:pPr>
-        <w:spacing w:line="360" w:lineRule="auto" w:before="0" w:after="0"/>
-        <w:ind w:right="283" w:firstLine="709"/>
-        <w:jc w:val="both"/>
-      </w:pPr>
-      <w:r>
-        <w:rPr>
-          <w:rFonts w:ascii="Times New Roman" w:hAnsi="Times New Roman"/>
-          <w:b w:val="0"/>
-          <w:color w:val="000000"/>
-          <w:sz w:val="28"/>
-        </w:rPr>
-        <w:t>Для переноса схемы в NI Multisim применяется карта соединений таблицы 2.2. Все обозначения относятся к рисунку 2.14. Времязадающий конденсатор C1 подключается положительным выводом к общей точке TRIG/THRESH, отрицательным — к земле.</w:t>
+        <w:t>Погрешность округления номиналов меньше 0,09 %. Это не полная погрешность устройства: допуски резисторов, ёмкость и утечки C1, пороги и разрядный транзистор LM555 также влияют на результат. При R ±1 % и C ±10 % только произведение RC меняется от 0,891 до 1,111 номинала.</w:t>
       </w:r>
     </w:p>
     <w:p>
@@ -14392,7 +14593,7 @@
         </w:trPr>
         <w:tc>
           <w:tcPr>
-            <w:tcW w:type="dxa" w:w="3515"/>
+            <w:tcW w:type="dxa" w:w="3572"/>
           </w:tcPr>
           <w:p>
             <w:pPr>
@@ -14411,7 +14612,7 @@
         </w:tc>
         <w:tc>
           <w:tcPr>
-            <w:tcW w:type="dxa" w:w="6009"/>
+            <w:tcW w:type="dxa" w:w="5783"/>
           </w:tcPr>
           <w:p>
             <w:pPr>
@@ -14435,7 +14636,7 @@
         </w:trPr>
         <w:tc>
           <w:tcPr>
-            <w:tcW w:type="dxa" w:w="3515"/>
+            <w:tcW w:type="dxa" w:w="3572"/>
           </w:tcPr>
           <w:p>
             <w:pPr>
@@ -14448,13 +14649,13 @@
                 <w:color w:val="000000"/>
                 <w:sz w:val="24"/>
               </w:rPr>
-              <w:t>LM555: 8 VCC; 1 GND</w:t>
-            </w:r>
-          </w:p>
-        </w:tc>
-        <w:tc>
-          <w:tcPr>
-            <w:tcW w:type="dxa" w:w="6009"/>
+              <w:t>LM555: 8; 1</w:t>
+            </w:r>
+          </w:p>
+        </w:tc>
+        <w:tc>
+          <w:tcPr>
+            <w:tcW w:type="dxa" w:w="5783"/>
           </w:tcPr>
           <w:p>
             <w:pPr>
@@ -14467,7 +14668,7 @@
                 <w:color w:val="000000"/>
                 <w:sz w:val="24"/>
               </w:rPr>
-              <w:t>8 → +5 В; 1 → общая земля</w:t>
+              <w:t>8 → +5 В; 1 → GND</w:t>
             </w:r>
           </w:p>
         </w:tc>
@@ -14478,7 +14679,7 @@
         </w:trPr>
         <w:tc>
           <w:tcPr>
-            <w:tcW w:type="dxa" w:w="3515"/>
+            <w:tcW w:type="dxa" w:w="3572"/>
           </w:tcPr>
           <w:p>
             <w:pPr>
@@ -14491,13 +14692,13 @@
                 <w:color w:val="000000"/>
                 <w:sz w:val="24"/>
               </w:rPr>
-              <w:t>LM555: 7 DISCH</w:t>
-            </w:r>
-          </w:p>
-        </w:tc>
-        <w:tc>
-          <w:tcPr>
-            <w:tcW w:type="dxa" w:w="6009"/>
+              <w:t>R1 = 4,32 кОм</w:t>
+            </w:r>
+          </w:p>
+        </w:tc>
+        <w:tc>
+          <w:tcPr>
+            <w:tcW w:type="dxa" w:w="5783"/>
           </w:tcPr>
           <w:p>
             <w:pPr>
@@ -14510,7 +14711,7 @@
                 <w:color w:val="000000"/>
                 <w:sz w:val="24"/>
               </w:rPr>
-              <w:t>К общей точке R1 и R2</w:t>
+              <w:t>+5 В ↔ LM555: 7</w:t>
             </w:r>
           </w:p>
         </w:tc>
@@ -14521,7 +14722,7 @@
         </w:trPr>
         <w:tc>
           <w:tcPr>
-            <w:tcW w:type="dxa" w:w="3515"/>
+            <w:tcW w:type="dxa" w:w="3572"/>
           </w:tcPr>
           <w:p>
             <w:pPr>
@@ -14534,13 +14735,13 @@
                 <w:color w:val="000000"/>
                 <w:sz w:val="24"/>
               </w:rPr>
-              <w:t>LM555: 2 TRIG и 6 THRESH</w:t>
-            </w:r>
-          </w:p>
-        </w:tc>
-        <w:tc>
-          <w:tcPr>
-            <w:tcW w:type="dxa" w:w="6009"/>
+              <w:t>R2 = 95,3 кОм</w:t>
+            </w:r>
+          </w:p>
+        </w:tc>
+        <w:tc>
+          <w:tcPr>
+            <w:tcW w:type="dxa" w:w="5783"/>
           </w:tcPr>
           <w:p>
             <w:pPr>
@@ -14553,7 +14754,7 @@
                 <w:color w:val="000000"/>
                 <w:sz w:val="24"/>
               </w:rPr>
-              <w:t>Объединить; к нижнему выводу R2 и плюсу C1</w:t>
+              <w:t>LM555: 7 ↔ узел 2, 6</w:t>
             </w:r>
           </w:p>
         </w:tc>
@@ -14564,7 +14765,7 @@
         </w:trPr>
         <w:tc>
           <w:tcPr>
-            <w:tcW w:type="dxa" w:w="3515"/>
+            <w:tcW w:type="dxa" w:w="3572"/>
           </w:tcPr>
           <w:p>
             <w:pPr>
@@ -14577,13 +14778,13 @@
                 <w:color w:val="000000"/>
                 <w:sz w:val="24"/>
               </w:rPr>
-              <w:t>R1 = 4,32 кОм</w:t>
-            </w:r>
-          </w:p>
-        </w:tc>
-        <w:tc>
-          <w:tcPr>
-            <w:tcW w:type="dxa" w:w="6009"/>
+              <w:t>C1 = 10 мкФ</w:t>
+            </w:r>
+          </w:p>
+        </w:tc>
+        <w:tc>
+          <w:tcPr>
+            <w:tcW w:type="dxa" w:w="5783"/>
           </w:tcPr>
           <w:p>
             <w:pPr>
@@ -14596,7 +14797,7 @@
                 <w:color w:val="000000"/>
                 <w:sz w:val="24"/>
               </w:rPr>
-              <w:t>Между +5 В и выводом 7</w:t>
+              <w:t>Плюс → узел 2, 6; минус → GND</w:t>
             </w:r>
           </w:p>
         </w:tc>
@@ -14607,7 +14808,7 @@
         </w:trPr>
         <w:tc>
           <w:tcPr>
-            <w:tcW w:type="dxa" w:w="3515"/>
+            <w:tcW w:type="dxa" w:w="3572"/>
           </w:tcPr>
           <w:p>
             <w:pPr>
@@ -14620,13 +14821,13 @@
                 <w:color w:val="000000"/>
                 <w:sz w:val="24"/>
               </w:rPr>
-              <w:t>R2 = 95,3 кОм</w:t>
-            </w:r>
-          </w:p>
-        </w:tc>
-        <w:tc>
-          <w:tcPr>
-            <w:tcW w:type="dxa" w:w="6009"/>
+              <w:t>C2 = 10 нФ; C3 = 100 нФ</w:t>
+            </w:r>
+          </w:p>
+        </w:tc>
+        <w:tc>
+          <w:tcPr>
+            <w:tcW w:type="dxa" w:w="5783"/>
           </w:tcPr>
           <w:p>
             <w:pPr>
@@ -14639,7 +14840,7 @@
                 <w:color w:val="000000"/>
                 <w:sz w:val="24"/>
               </w:rPr>
-              <w:t>Между выводом 7 и узлом выводов 2, 6</w:t>
+              <w:t>C2: 5 ↔ GND; C3: 8 ↔ 1</w:t>
             </w:r>
           </w:p>
         </w:tc>
@@ -14650,7 +14851,7 @@
         </w:trPr>
         <w:tc>
           <w:tcPr>
-            <w:tcW w:type="dxa" w:w="3515"/>
+            <w:tcW w:type="dxa" w:w="3572"/>
           </w:tcPr>
           <w:p>
             <w:pPr>
@@ -14663,13 +14864,13 @@
                 <w:color w:val="000000"/>
                 <w:sz w:val="24"/>
               </w:rPr>
-              <w:t>C1 = 10 мкФ</w:t>
-            </w:r>
-          </w:p>
-        </w:tc>
-        <w:tc>
-          <w:tcPr>
-            <w:tcW w:type="dxa" w:w="6009"/>
+              <w:t>LM555: 4 /RESET</w:t>
+            </w:r>
+          </w:p>
+        </w:tc>
+        <w:tc>
+          <w:tcPr>
+            <w:tcW w:type="dxa" w:w="5783"/>
           </w:tcPr>
           <w:p>
             <w:pPr>
@@ -14682,7 +14883,7 @@
                 <w:color w:val="000000"/>
                 <w:sz w:val="24"/>
               </w:rPr>
-              <w:t>Плюс к узлу 2, 6; минус к GND</w:t>
+              <w:t>RUN от U_CTRL:A, вывод 5</w:t>
             </w:r>
           </w:p>
         </w:tc>
@@ -14693,7 +14894,7 @@
         </w:trPr>
         <w:tc>
           <w:tcPr>
-            <w:tcW w:type="dxa" w:w="3515"/>
+            <w:tcW w:type="dxa" w:w="3572"/>
           </w:tcPr>
           <w:p>
             <w:pPr>
@@ -14706,13 +14907,13 @@
                 <w:color w:val="000000"/>
                 <w:sz w:val="24"/>
               </w:rPr>
-              <w:t>C2 = 10 нФ</w:t>
-            </w:r>
-          </w:p>
-        </w:tc>
-        <w:tc>
-          <w:tcPr>
-            <w:tcW w:type="dxa" w:w="6009"/>
+              <w:t>LM555: 3 OUT</w:t>
+            </w:r>
+          </w:p>
+        </w:tc>
+        <w:tc>
+          <w:tcPr>
+            <w:tcW w:type="dxa" w:w="5783"/>
           </w:tcPr>
           <w:p>
             <w:pPr>
@@ -14725,7 +14926,7 @@
                 <w:color w:val="000000"/>
                 <w:sz w:val="24"/>
               </w:rPr>
-              <w:t>Между выводом 5 CTRL и GND</w:t>
+              <w:t>74LS04: вход 1</w:t>
             </w:r>
           </w:p>
         </w:tc>
@@ -14736,7 +14937,7 @@
         </w:trPr>
         <w:tc>
           <w:tcPr>
-            <w:tcW w:type="dxa" w:w="3515"/>
+            <w:tcW w:type="dxa" w:w="3572"/>
           </w:tcPr>
           <w:p>
             <w:pPr>
@@ -14749,13 +14950,13 @@
                 <w:color w:val="000000"/>
                 <w:sz w:val="24"/>
               </w:rPr>
-              <w:t>C3 = 100 нФ</w:t>
-            </w:r>
-          </w:p>
-        </w:tc>
-        <w:tc>
-          <w:tcPr>
-            <w:tcW w:type="dxa" w:w="6009"/>
+              <w:t>74LS04: выход 2</w:t>
+            </w:r>
+          </w:p>
+        </w:tc>
+        <w:tc>
+          <w:tcPr>
+            <w:tcW w:type="dxa" w:w="5783"/>
           </w:tcPr>
           <w:p>
             <w:pPr>
@@ -14768,7 +14969,7 @@
                 <w:color w:val="000000"/>
                 <w:sz w:val="24"/>
               </w:rPr>
-              <w:t>Между 8 VCC и 1 GND, рядом с таймером</w:t>
+              <w:t>CLK → ПСУ и U_CTRL:B, вывод 11</w:t>
             </w:r>
           </w:p>
         </w:tc>
@@ -14779,7 +14980,7 @@
         </w:trPr>
         <w:tc>
           <w:tcPr>
-            <w:tcW w:type="dxa" w:w="3515"/>
+            <w:tcW w:type="dxa" w:w="3572"/>
           </w:tcPr>
           <w:p>
             <w:pPr>
@@ -14792,13 +14993,13 @@
                 <w:color w:val="000000"/>
                 <w:sz w:val="24"/>
               </w:rPr>
-              <w:t>LM555: 4 /RESET</w:t>
-            </w:r>
-          </w:p>
-        </w:tc>
-        <w:tc>
-          <w:tcPr>
-            <w:tcW w:type="dxa" w:w="6009"/>
+              <w:t>74LS04: 14; 7</w:t>
+            </w:r>
+          </w:p>
+        </w:tc>
+        <w:tc>
+          <w:tcPr>
+            <w:tcW w:type="dxa" w:w="5783"/>
           </w:tcPr>
           <w:p>
             <w:pPr>
@@ -14811,7 +15012,7 @@
                 <w:color w:val="000000"/>
                 <w:sz w:val="24"/>
               </w:rPr>
-              <w:t>К RUN; при отдельной проверке — к +5 В</w:t>
+              <w:t>14 → +5 В; 7 → GND; развязка 100 нФ</w:t>
             </w:r>
           </w:p>
         </w:tc>
@@ -14822,7 +15023,7 @@
         </w:trPr>
         <w:tc>
           <w:tcPr>
-            <w:tcW w:type="dxa" w:w="3515"/>
+            <w:tcW w:type="dxa" w:w="3572"/>
           </w:tcPr>
           <w:p>
             <w:pPr>
@@ -14835,13 +15036,13 @@
                 <w:color w:val="000000"/>
                 <w:sz w:val="24"/>
               </w:rPr>
-              <w:t>LM555: 3 OUT</w:t>
-            </w:r>
-          </w:p>
-        </w:tc>
-        <w:tc>
-          <w:tcPr>
-            <w:tcW w:type="dxa" w:w="6009"/>
+              <w:t>Свободные входы 74LS04</w:t>
+            </w:r>
+          </w:p>
+        </w:tc>
+        <w:tc>
+          <w:tcPr>
+            <w:tcW w:type="dxa" w:w="5783"/>
           </w:tcPr>
           <w:p>
             <w:pPr>
@@ -14854,179 +15055,7 @@
                 <w:color w:val="000000"/>
                 <w:sz w:val="24"/>
               </w:rPr>
-              <w:t>На вход 1 первого инвертора 74LS04</w:t>
-            </w:r>
-          </w:p>
-        </w:tc>
-      </w:tr>
-      <w:tr>
-        <w:trPr>
-          <w:cantSplit/>
-        </w:trPr>
-        <w:tc>
-          <w:tcPr>
-            <w:tcW w:type="dxa" w:w="3515"/>
-          </w:tcPr>
-          <w:p>
-            <w:pPr>
-              <w:spacing w:after="60" w:before="60" w:line="252" w:lineRule="auto"/>
-            </w:pPr>
-            <w:r>
-              <w:rPr>
-                <w:rFonts w:ascii="Times New Roman" w:hAnsi="Times New Roman"/>
-                <w:b w:val="0"/>
-                <w:color w:val="000000"/>
-                <w:sz w:val="24"/>
-              </w:rPr>
-              <w:t>74LS04: 2</w:t>
-            </w:r>
-          </w:p>
-        </w:tc>
-        <w:tc>
-          <w:tcPr>
-            <w:tcW w:type="dxa" w:w="6009"/>
-          </w:tcPr>
-          <w:p>
-            <w:pPr>
-              <w:spacing w:after="60" w:before="60" w:line="252" w:lineRule="auto"/>
-            </w:pPr>
-            <w:r>
-              <w:rPr>
-                <w:rFonts w:ascii="Times New Roman" w:hAnsi="Times New Roman"/>
-                <w:b w:val="0"/>
-                <w:color w:val="000000"/>
-                <w:sz w:val="24"/>
-              </w:rPr>
-              <w:t>Выход CLK на тактовые входы ПСУ</w:t>
-            </w:r>
-          </w:p>
-        </w:tc>
-      </w:tr>
-      <w:tr>
-        <w:trPr>
-          <w:cantSplit/>
-        </w:trPr>
-        <w:tc>
-          <w:tcPr>
-            <w:tcW w:type="dxa" w:w="3515"/>
-          </w:tcPr>
-          <w:p>
-            <w:pPr>
-              <w:spacing w:after="60" w:before="60" w:line="252" w:lineRule="auto"/>
-            </w:pPr>
-            <w:r>
-              <w:rPr>
-                <w:rFonts w:ascii="Times New Roman" w:hAnsi="Times New Roman"/>
-                <w:b w:val="0"/>
-                <w:color w:val="000000"/>
-                <w:sz w:val="24"/>
-              </w:rPr>
-              <w:t>74LS04: 14; 7</w:t>
-            </w:r>
-          </w:p>
-        </w:tc>
-        <w:tc>
-          <w:tcPr>
-            <w:tcW w:type="dxa" w:w="6009"/>
-          </w:tcPr>
-          <w:p>
-            <w:pPr>
-              <w:spacing w:after="60" w:before="60" w:line="252" w:lineRule="auto"/>
-            </w:pPr>
-            <w:r>
-              <w:rPr>
-                <w:rFonts w:ascii="Times New Roman" w:hAnsi="Times New Roman"/>
-                <w:b w:val="0"/>
-                <w:color w:val="000000"/>
-                <w:sz w:val="24"/>
-              </w:rPr>
-              <w:t>14 → +5 В; 7 → GND; между ними 100 нФ</w:t>
-            </w:r>
-          </w:p>
-        </w:tc>
-      </w:tr>
-      <w:tr>
-        <w:trPr>
-          <w:cantSplit/>
-        </w:trPr>
-        <w:tc>
-          <w:tcPr>
-            <w:tcW w:type="dxa" w:w="3515"/>
-          </w:tcPr>
-          <w:p>
-            <w:pPr>
-              <w:spacing w:after="60" w:before="60" w:line="252" w:lineRule="auto"/>
-            </w:pPr>
-            <w:r>
-              <w:rPr>
-                <w:rFonts w:ascii="Times New Roman" w:hAnsi="Times New Roman"/>
-                <w:b w:val="0"/>
-                <w:color w:val="000000"/>
-                <w:sz w:val="24"/>
-              </w:rPr>
-              <w:t>Остальные входы 74LS04</w:t>
-            </w:r>
-          </w:p>
-        </w:tc>
-        <w:tc>
-          <w:tcPr>
-            <w:tcW w:type="dxa" w:w="6009"/>
-          </w:tcPr>
-          <w:p>
-            <w:pPr>
-              <w:spacing w:after="60" w:before="60" w:line="252" w:lineRule="auto"/>
-            </w:pPr>
-            <w:r>
-              <w:rPr>
-                <w:rFonts w:ascii="Times New Roman" w:hAnsi="Times New Roman"/>
-                <w:b w:val="0"/>
-                <w:color w:val="000000"/>
-                <w:sz w:val="24"/>
-              </w:rPr>
-              <w:t>Подключить к GND; соответствующие выходы оставить свободными</w:t>
-            </w:r>
-          </w:p>
-        </w:tc>
-      </w:tr>
-      <w:tr>
-        <w:trPr>
-          <w:cantSplit/>
-        </w:trPr>
-        <w:tc>
-          <w:tcPr>
-            <w:tcW w:type="dxa" w:w="3515"/>
-          </w:tcPr>
-          <w:p>
-            <w:pPr>
-              <w:spacing w:after="60" w:before="60" w:line="252" w:lineRule="auto"/>
-            </w:pPr>
-            <w:r>
-              <w:rPr>
-                <w:rFonts w:ascii="Times New Roman" w:hAnsi="Times New Roman"/>
-                <w:b w:val="0"/>
-                <w:color w:val="000000"/>
-                <w:sz w:val="24"/>
-              </w:rPr>
-              <w:t>Осциллограф XSC1</w:t>
-            </w:r>
-          </w:p>
-        </w:tc>
-        <w:tc>
-          <w:tcPr>
-            <w:tcW w:type="dxa" w:w="6009"/>
-          </w:tcPr>
-          <w:p>
-            <w:pPr>
-              <w:spacing w:after="60" w:before="60" w:line="252" w:lineRule="auto"/>
-            </w:pPr>
-            <w:r>
-              <w:rPr>
-                <w:rFonts w:ascii="Times New Roman" w:hAnsi="Times New Roman"/>
-                <w:b w:val="0"/>
-                <w:color w:val="000000"/>
-                <w:sz w:val="24"/>
-              </w:rPr>
-              <w:t>A+ → CLK; B+ → OUT; A− и B− → GND</w:t>
+              <w:t>GND; соответствующие выходы свободны</w:t>
             </w:r>
           </w:p>
         </w:tc>
@@ -15045,7 +15074,7 @@
           <w:color w:val="000000"/>
           <w:sz w:val="28"/>
         </w:rPr>
-        <w:t>Управление генератором выполняется сигналом RUN. При RUN = 1 таймер формирует импульсы; при RUN = 0 вывод OUT удерживается в нуле. Поскольку за таймером установлен инвертор, остановленному генератору соответствует CLK = 1, а не CLK = 0. Это необходимо учитывать при начальной установке и остановке ПСУ.</w:t>
+        <w:t>При RUN = 0 таймер удерживает OUT = 0, поэтому CLK после инвертора равен 1. Нельзя останавливать таймер произвольным асинхронным сигналом при CLK = 0: это создаст лишний положительный фронт.</w:t>
       </w:r>
     </w:p>
     <w:p>
@@ -15072,7 +15101,127 @@
           <w:color w:val="000000"/>
           <w:sz w:val="28"/>
         </w:rPr>
-        <w:t>Разрешение работы хранится в дополнительном D-триггере 74AS74: D = 1, /PRE = 1, CLK = START, /CLR = P_RES. Его прямой выход RUN подключён к выводу 4 LM555. Схема управления приведена на рисунке 2.15.</w:t>
+        <w:t>Для остановки на последнем состоянии введён блок STOP_UNIT (рисунок 2.18). Прямой комбинационный детектор кода 6 мог бы реагировать на кратковременные переходные коды. Поэтому сигнал остановки регистрируется отдельным D-триггером на фронте, переводящем ПСУ из 10 в 6.</w:t>
+      </w:r>
+    </w:p>
+    <w:p>
+      <w:pPr>
+        <w:tabs>
+          <w:tab w:pos="4649" w:val="center"/>
+          <w:tab w:pos="9751" w:val="right"/>
+        </w:tabs>
+        <w:spacing w:line="240" w:lineRule="auto" w:before="0" w:after="100"/>
+        <w:ind w:right="283" w:firstLine="0"/>
+        <w:jc w:val="left"/>
+      </w:pPr>
+      <w:r>
+        <w:rPr>
+          <w:rFonts w:ascii="Times New Roman" w:hAnsi="Times New Roman"/>
+          <w:b w:val="0"/>
+          <w:color w:val="000000"/>
+          <w:sz w:val="28"/>
+        </w:rPr>
+      </w:r>
+      <w:r>
+        <w:tab/>
+      </w:r>
+      <m:oMath>
+        <m:sSub>
+          <m:e>
+            <m:r>
+              <m:t>E</m:t>
+            </m:r>
+          </m:e>
+          <m:sub>
+            <m:r>
+              <m:t>10</m:t>
+            </m:r>
+          </m:sub>
+        </m:sSub>
+        <m:r>
+          <m:t> = </m:t>
+        </m:r>
+        <m:sSub>
+          <m:e>
+            <m:r>
+              <m:t>Q</m:t>
+            </m:r>
+          </m:e>
+          <m:sub>
+            <m:r>
+              <m:t>3</m:t>
+            </m:r>
+          </m:sub>
+        </m:sSub>
+        <m:r>
+          <m:t> · </m:t>
+        </m:r>
+        <m:bar>
+          <m:barPr>
+            <m:pos m:val="top"/>
+          </m:barPr>
+          <m:e>
+            <m:sSub>
+              <m:e>
+                <m:r>
+                  <m:t>Q</m:t>
+                </m:r>
+              </m:e>
+              <m:sub>
+                <m:r>
+                  <m:t>2</m:t>
+                </m:r>
+              </m:sub>
+            </m:sSub>
+          </m:e>
+        </m:bar>
+        <m:r>
+          <m:t> · </m:t>
+        </m:r>
+        <m:sSub>
+          <m:e>
+            <m:r>
+              <m:t>Q</m:t>
+            </m:r>
+          </m:e>
+          <m:sub>
+            <m:r>
+              <m:t>1</m:t>
+            </m:r>
+          </m:sub>
+        </m:sSub>
+        <m:r>
+          <m:t> · </m:t>
+        </m:r>
+        <m:bar>
+          <m:barPr>
+            <m:pos m:val="top"/>
+          </m:barPr>
+          <m:e>
+            <m:sSub>
+              <m:e>
+                <m:r>
+                  <m:t>Q</m:t>
+                </m:r>
+              </m:e>
+              <m:sub>
+                <m:r>
+                  <m:t>0</m:t>
+                </m:r>
+              </m:sub>
+            </m:sSub>
+          </m:e>
+        </m:bar>
+      </m:oMath>
+      <w:r>
+        <w:rPr>
+          <w:rFonts w:ascii="Times New Roman" w:hAnsi="Times New Roman"/>
+          <w:b w:val="0"/>
+          <w:color w:val="000000"/>
+          <w:sz w:val="28"/>
+        </w:rPr>
+        <w:tab/>
+        <w:t>(2.23)</w:t>
       </w:r>
     </w:p>
     <w:p>
@@ -15097,8 +15246,8 @@
       <w:r>
         <w:drawing>
           <wp:inline xmlns:a="http://schemas.openxmlformats.org/drawingml/2006/main" xmlns:pic="http://schemas.openxmlformats.org/drawingml/2006/picture">
-            <wp:extent cx="5580000" cy="2511000"/>
-            <wp:docPr id="918597022" name="Picture 918597022" descr="Рисунок 2.15 – Расчётная схема управления генератором на D-триггере"/>
+            <wp:extent cx="5940000" cy="3074824"/>
+            <wp:docPr id="918597025" name="Picture 918597025" descr="Рисунок 2.18 – Расчётная схема блока STOP_UNIT с регистрацией сигнала остановки"/>
             <wp:cNvGraphicFramePr>
               <a:graphicFrameLocks noChangeAspect="1"/>
             </wp:cNvGraphicFramePr>
@@ -15106,11 +15255,11 @@
               <a:graphicData uri="http://schemas.openxmlformats.org/drawingml/2006/picture">
                 <pic:pic>
                   <pic:nvPicPr>
-                    <pic:cNvPr id="0" name="fig_2_15_run_control.png"/>
+                    <pic:cNvPr id="0" name="fig_2_18.png"/>
                     <pic:cNvPicPr/>
                   </pic:nvPicPr>
                   <pic:blipFill>
-                    <a:blip r:embed="rId29"/>
+                    <a:blip r:embed="rId36"/>
                     <a:stretch>
                       <a:fillRect/>
                     </a:stretch>
@@ -15118,7 +15267,7 @@
                   <pic:spPr>
                     <a:xfrm>
                       <a:off x="0" y="0"/>
-                      <a:ext cx="5580000" cy="2511000"/>
+                      <a:ext cx="5940000" cy="3074824"/>
                     </a:xfrm>
                     <a:prstGeom prst="rect"/>
                   </pic:spPr>
@@ -15146,7 +15295,7 @@
           <w:color w:val="000000"/>
           <w:sz w:val="28"/>
         </w:rPr>
-        <w:t>Рисунок 2.15 – Расчётная схема управления генератором на D-триггере</w:t>
+        <w:t>Рисунок 2.18 – Расчётная схема блока STOP_UNIT с регистрацией сигнала остановки</w:t>
       </w:r>
     </w:p>
     <w:p>
@@ -15162,7 +15311,7 @@
           <w:color w:val="000000"/>
           <w:sz w:val="28"/>
         </w:rPr>
-        <w:t>При P_RES = 0 триггер разрешения сброшен, генератор остановлен, ПСУ установлен в код D (1101). После снятия P_RES положительный фронт START записывает единицу в триггер разрешения. Таймер запускается; CLK сначала падает, поэтому D-триггеры ПСУ не переключаются.</w:t>
+        <w:t>Код 10 распознаётся точно, без факультативных наборов. E10 подаётся на D секции B дополнительной микросхемы 74AS74; её CLK соединён с CLK ПСУ. До фронта код 10 уже установился, поэтому на этом фронте ПСУ принимает 6, а секция B записывает STOP = 1. Задержки распространения элементов не меняют выборку установившегося предшествующего кода.</w:t>
       </w:r>
     </w:p>
     <w:p>
@@ -15178,7 +15327,18 @@
           <w:color w:val="000000"/>
           <w:sz w:val="28"/>
         </w:rPr>
-        <w:t>При первом запуске C1 заряжается почти от нуля. Задержка первого фронта составляет ln 3 · (R1 + R2) · C1 ≈ 1,0944 с и отличается от установившейся паузы. Заданный период измеряется по последующим импульсам.</w:t>
+        <w:t>Инверсный выход NOT_STOP снимает разрешение RUN. В этот момент CLK уже высокий, а OUT таймера низкий, поэтому сброс LM555 сохраняет текущий уровень и не создаёт дополнительного фронта. STOP удерживается до P_RES = 0. Переход 6 → 13 в логике ПСУ остаётся, но в режиме автоматической остановки такт для него не поступает.</w:t>
+      </w:r>
+    </w:p>
+    <w:p>
+      <w:pPr>
+        <w:spacing w:after="0" w:before="0" w:line="240" w:lineRule="auto"/>
+      </w:pPr>
+      <w:r>
+        <w:rPr>
+          <w:sz w:val="2"/>
+        </w:rPr>
+        <w:br w:type="page"/>
       </w:r>
     </w:p>
     <w:p>
@@ -15194,70 +15354,7 @@
           <w:color w:val="000000"/>
           <w:sz w:val="28"/>
         </w:rPr>
-        <w:t>Повторный P_RES останавливает генератор и возвращает ПСУ в начальный код. Сброс только таймера при низком CLK может вызвать лишний пересчёт: после инвертора возникнет положительный фронт. Поэтому остановка совмещена с общей начальной установкой. Автоматическая остановка по конечному состоянию не вводится; замкнутый цикл сохранён.</w:t>
-      </w:r>
-    </w:p>
-    <w:p>
-      <w:pPr>
-        <w:spacing w:line="360" w:lineRule="auto" w:before="0" w:after="0"/>
-        <w:ind w:right="283" w:firstLine="709"/>
-        <w:jc w:val="both"/>
-      </w:pPr>
-      <w:r>
-        <w:rPr>
-          <w:rFonts w:ascii="Times New Roman" w:hAnsi="Times New Roman"/>
-          <w:b w:val="0"/>
-          <w:color w:val="000000"/>
-          <w:sz w:val="28"/>
-        </w:rPr>
-        <w:t>START и P_RES задаются цифровыми источниками. Для физических кнопок необходима защита от дребезга. Входы свободной секции 74AS74 фиксируются; одновременный ноль на /PRE и /CLR запрещён.</w:t>
-      </w:r>
-    </w:p>
-    <w:p>
-      <w:pPr>
-        <w:spacing w:after="0" w:before="0" w:line="240" w:lineRule="auto"/>
-      </w:pPr>
-      <w:r>
-        <w:rPr>
-          <w:sz w:val="2"/>
-        </w:rPr>
-        <w:br w:type="page"/>
-      </w:r>
-    </w:p>
-    <w:p>
-      <w:pPr>
-        <w:pStyle w:val="1"/>
-        <w:keepNext/>
-        <w:pageBreakBefore w:val="0"/>
-        <w:spacing w:line="276" w:lineRule="auto" w:before="200" w:after="160"/>
-        <w:ind w:right="283" w:firstLine="709"/>
-        <w:jc w:val="left"/>
-        <w:outlineLvl w:val="2"/>
-      </w:pPr>
-      <w:r>
-        <w:rPr>
-          <w:rFonts w:ascii="Times New Roman" w:hAnsi="Times New Roman"/>
-          <w:b/>
-          <w:color w:val="000000"/>
-          <w:sz w:val="28"/>
-        </w:rPr>
-        <w:t>2.3.3 Временные диаграммы выходных сигналов генератора</w:t>
-      </w:r>
-    </w:p>
-    <w:p>
-      <w:pPr>
-        <w:spacing w:line="360" w:lineRule="auto" w:before="0" w:after="0"/>
-        <w:ind w:right="283" w:firstLine="709"/>
-        <w:jc w:val="both"/>
-      </w:pPr>
-      <w:r>
-        <w:rPr>
-          <w:rFonts w:ascii="Times New Roman" w:hAnsi="Times New Roman"/>
-          <w:b w:val="0"/>
-          <w:color w:val="000000"/>
-          <w:sz w:val="28"/>
-        </w:rPr>
-        <w:t>Расчётная диаграмма сигналов OUT и CLK приведена на рисунке 2.16. Начало отсчёта выбрано по положительному фронту CLK после установления колебаний. На выходе инвертора высокий уровень составляет около 0,6606 с, низкий — 0,6905 с, а период — 1,3511 с.</w:t>
+        <w:t>P_RES_GEN формирует активную нулём начальную установку (рисунок 2.19). RC-цепь дополнена двумя инверторами Шмитта 74HC14 и буфером 74LS07 с открытым коллектором (OC). Буфер обеспечивает ток сброса нескольких 74AS74; R4 подтягивает P_RES к +5 В. При C4 = 0 В действует сброс; после заряда он снимается. R3C4 = 0,1 с, но длительность импульса зависит от порога Шмитта.</w:t>
       </w:r>
     </w:p>
     <w:p>
@@ -15282,8 +15379,8 @@
       <w:r>
         <w:drawing>
           <wp:inline xmlns:a="http://schemas.openxmlformats.org/drawingml/2006/main" xmlns:pic="http://schemas.openxmlformats.org/drawingml/2006/picture">
-            <wp:extent cx="5760000" cy="2255422"/>
-            <wp:docPr id="918597023" name="Picture 918597023" descr="Рисунок 2.16 – Расчётные временные диаграммы OUT и CLK"/>
+            <wp:extent cx="5580000" cy="2637818"/>
+            <wp:docPr id="918597026" name="Picture 918597026" descr="Рисунок 2.19 – Расчётная схема блока P_RES_GEN с RC-цепью и формирователем"/>
             <wp:cNvGraphicFramePr>
               <a:graphicFrameLocks noChangeAspect="1"/>
             </wp:cNvGraphicFramePr>
@@ -15291,11 +15388,11 @@
               <a:graphicData uri="http://schemas.openxmlformats.org/drawingml/2006/picture">
                 <pic:pic>
                   <pic:nvPicPr>
-                    <pic:cNvPr id="0" name="fig_2_16_generator_timing.png"/>
+                    <pic:cNvPr id="0" name="fig_2_19.png"/>
                     <pic:cNvPicPr/>
                   </pic:nvPicPr>
                   <pic:blipFill>
-                    <a:blip r:embed="rId30"/>
+                    <a:blip r:embed="rId37"/>
                     <a:stretch>
                       <a:fillRect/>
                     </a:stretch>
@@ -15303,7 +15400,7 @@
                   <pic:spPr>
                     <a:xfrm>
                       <a:off x="0" y="0"/>
-                      <a:ext cx="5760000" cy="2255422"/>
+                      <a:ext cx="5580000" cy="2637818"/>
                     </a:xfrm>
                     <a:prstGeom prst="rect"/>
                   </pic:spPr>
@@ -15331,7 +15428,7 @@
           <w:color w:val="000000"/>
           <w:sz w:val="28"/>
         </w:rPr>
-        <w:t>Рисунок 2.16 – Расчётные временные диаграммы OUT и CLK</w:t>
+        <w:t>Рисунок 2.19 – Расчётная схема блока P_RES_GEN с RC-цепью и формирователем</w:t>
       </w:r>
     </w:p>
     <w:p>
@@ -15347,7 +15444,7 @@
           <w:color w:val="000000"/>
           <w:sz w:val="28"/>
         </w:rPr>
-        <w:t>В NI Multisim канал A осциллографа XSC1 подключается к CLK, канал B — к OUT таймера. Для обзора можно начать с масштаба 0,5 с/деление. После установления колебаний моделирование приостанавливается.</w:t>
+        <w:t>При P_RES = 0 устанавливаются Q3Q2Q1Q0 = 1101, STOP = 0 и RUN = 0. Для единичных разрядов Q3, Q2, Q0 общий сигнал подаётся на /PRE, а /CLR удерживается в единице. Для Q1 он подаётся на /CLR, а /PRE удерживается в единице. Одновременный ноль на /PRE и /CLR одного триггера недопустим.</w:t>
       </w:r>
     </w:p>
     <w:p>
@@ -15363,7 +15460,7 @@
           <w:color w:val="000000"/>
           <w:sz w:val="28"/>
         </w:rPr>
-        <w:t>Для измерения импульса первый курсор устанавливается на положительный фронт CLK, второй — на следующий отрицательный: ожидается около 0,6606 с. Для измерения периода курсоры ставятся на соседние положительные фронты CLK: ожидается около 1,3511 с. На OUT длительности высокого и низкого уровней меняются местами.</w:t>
+        <w:t>P_RES также подаётся на /CLR секции B и через AND2 с NOT_STOP — на /CLR секции A. Для запуска: START = 0; дождаться P_RES = 1; подать START: 0 → 1 → 0. Для повторного цикла замкнуть S_RST не менее чем на 5 с, чтобы разрядился и времязадающий C1, затем разомкнуть, дождаться P_RES = 1 и повторить START.</w:t>
       </w:r>
     </w:p>
     <w:p>
@@ -15379,14 +15476,545 @@
           <w:color w:val="000000"/>
           <w:sz w:val="28"/>
         </w:rPr>
-        <w:t>Расчёт соответствует заданным параметрам с отклонением номиналов менее 0,09 %. Схемная модель требует проверки в Multisim: расчётная диаграмма не является записью осциллографа. Для отчёта сохраняются схема генератора и два снимка с курсорами — измерение импульса и периода.</w:t>
+        <w:t>В Multisim задать C4: IC = 0 В и проверить импульс P_RES; прежний цифровой источник отключить. Для физического устройства отдельно проверить нарастание питания и дребезг кнопок.</w:t>
+      </w:r>
+    </w:p>
+    <w:p>
+      <w:pPr>
+        <w:pageBreakBefore/>
+        <w:spacing w:line="360" w:lineRule="auto" w:before="0" w:after="0"/>
+        <w:ind w:right="283" w:firstLine="709"/>
+        <w:jc w:val="both"/>
+      </w:pPr>
+      <w:r>
+        <w:rPr>
+          <w:rFonts w:ascii="Times New Roman" w:hAnsi="Times New Roman"/>
+          <w:b w:val="0"/>
+          <w:color w:val="000000"/>
+          <w:sz w:val="28"/>
+        </w:rPr>
+        <w:t>Секция A дополнительного 74AS74 хранит RUN: D = 1, /PRE = 1, CLK = START. Её активный нулём сброс равен P_RES AND NOT_STOP. На рисунке 2.20 объединены таймер, триггеры управления и ПСУ.</w:t>
+      </w:r>
+    </w:p>
+    <w:p>
+      <w:pPr>
+        <w:keepNext/>
+        <w:keepLines/>
+        <w:spacing w:before="0" w:after="80" w:line="240" w:lineRule="auto"/>
+        <w:ind w:right="283" w:firstLine="0"/>
+        <w:jc w:val="center"/>
+        <w:rPr>
+          <w:sz w:val="28"/>
+        </w:rPr>
+      </w:pPr>
+      <w:r>
+        <w:rPr>
+          <w:rFonts w:ascii="Times New Roman" w:hAnsi="Times New Roman"/>
+          <w:b w:val="0"/>
+          <w:color w:val="000000"/>
+          <w:sz w:val="28"/>
+        </w:rPr>
+      </w:r>
+      <w:r>
+        <w:drawing>
+          <wp:inline xmlns:a="http://schemas.openxmlformats.org/drawingml/2006/main" xmlns:pic="http://schemas.openxmlformats.org/drawingml/2006/picture">
+            <wp:extent cx="5940000" cy="3699771"/>
+            <wp:docPr id="918597027" name="Picture 918597027" descr="Рисунок 2.20 – Расчётная схема блока CLK_GEN с запуском и остановкой на 6"/>
+            <wp:cNvGraphicFramePr>
+              <a:graphicFrameLocks noChangeAspect="1"/>
+            </wp:cNvGraphicFramePr>
+            <a:graphic>
+              <a:graphicData uri="http://schemas.openxmlformats.org/drawingml/2006/picture">
+                <pic:pic>
+                  <pic:nvPicPr>
+                    <pic:cNvPr id="0" name="fig_2_20.png"/>
+                    <pic:cNvPicPr/>
+                  </pic:nvPicPr>
+                  <pic:blipFill>
+                    <a:blip r:embed="rId38"/>
+                    <a:stretch>
+                      <a:fillRect/>
+                    </a:stretch>
+                  </pic:blipFill>
+                  <pic:spPr>
+                    <a:xfrm>
+                      <a:off x="0" y="0"/>
+                      <a:ext cx="5940000" cy="3699771"/>
+                    </a:xfrm>
+                    <a:prstGeom prst="rect"/>
+                  </pic:spPr>
+                </pic:pic>
+              </a:graphicData>
+            </a:graphic>
+          </wp:inline>
+        </w:drawing>
+      </w:r>
+    </w:p>
+    <w:p>
+      <w:pPr>
+        <w:keepLines/>
+        <w:spacing w:before="0" w:after="160" w:line="276" w:lineRule="auto"/>
+        <w:ind w:right="283" w:firstLine="0"/>
+        <w:jc w:val="center"/>
+        <w:rPr>
+          <w:sz w:val="28"/>
+        </w:rPr>
+      </w:pPr>
+      <w:r>
+        <w:rPr>
+          <w:rFonts w:ascii="Times New Roman" w:hAnsi="Times New Roman"/>
+          <w:b w:val="0"/>
+          <w:color w:val="000000"/>
+          <w:sz w:val="28"/>
+        </w:rPr>
+        <w:t>Рисунок 2.20 – Расчётная схема блока CLK_GEN с запуском и остановкой на 6</w:t>
+      </w:r>
+    </w:p>
+    <w:p>
+      <w:pPr>
+        <w:spacing w:line="360" w:lineRule="auto" w:before="0" w:after="0"/>
+        <w:ind w:right="283" w:firstLine="709"/>
+        <w:jc w:val="both"/>
+      </w:pPr>
+      <w:r>
+        <w:rPr>
+          <w:rFonts w:ascii="Times New Roman" w:hAnsi="Times New Roman"/>
+          <w:b w:val="0"/>
+          <w:color w:val="000000"/>
+          <w:sz w:val="28"/>
+        </w:rPr>
+        <w:t>При START ↑ после снятого сброса RUN становится равным 1. Сначала OUT таймера повышается, а CLK падает; ПСУ на отрицательном фронте не переключается. При начальном C1 = 0 В задержка первого положительного фронта составляет ln 3 · (R1 + R2) · C1 ≈ 1,0944 с. Период 1,3511 с относится к последующим фронтам.</w:t>
+      </w:r>
+    </w:p>
+    <w:p>
+      <w:pPr>
+        <w:spacing w:line="360" w:lineRule="auto" w:before="0" w:after="0"/>
+        <w:ind w:right="283" w:firstLine="709"/>
+        <w:jc w:val="both"/>
+      </w:pPr>
+      <w:r>
+        <w:rPr>
+          <w:rFonts w:ascii="Times New Roman" w:hAnsi="Times New Roman"/>
+          <w:b w:val="0"/>
+          <w:color w:val="000000"/>
+          <w:sz w:val="28"/>
+        </w:rPr>
+        <w:t>На тринадцатом положительном фронте после запуска выполняется переход 10 → 6 и снимается RUN. Дальнейшие фронты отсутствуют; HEX показывает 6, активен Y6. Повторный START без P_RES не запускает генератор, поскольку STOP остаётся единицей. U_CTRL:A и U_CTRL:B занимают обе секции одного дополнительного корпуса 74AS74.</w:t>
+      </w:r>
+    </w:p>
+    <w:p>
+      <w:pPr>
+        <w:pStyle w:val="1"/>
+        <w:keepNext/>
+        <w:pageBreakBefore/>
+        <w:spacing w:line="276" w:lineRule="auto" w:before="200" w:after="160"/>
+        <w:ind w:right="283" w:firstLine="709"/>
+        <w:jc w:val="left"/>
+        <w:outlineLvl w:val="2"/>
+      </w:pPr>
+      <w:r>
+        <w:rPr>
+          <w:rFonts w:ascii="Times New Roman" w:hAnsi="Times New Roman"/>
+          <w:b/>
+          <w:color w:val="000000"/>
+          <w:sz w:val="28"/>
+        </w:rPr>
+        <w:t>2.3.3 Временные диаграммы выходного сигнала таймера и D-триггера</w:t>
+      </w:r>
+    </w:p>
+    <w:p>
+      <w:pPr>
+        <w:spacing w:line="360" w:lineRule="auto" w:before="0" w:after="0"/>
+        <w:ind w:right="283" w:firstLine="709"/>
+        <w:jc w:val="both"/>
+      </w:pPr>
+      <w:r>
+        <w:rPr>
+          <w:rFonts w:ascii="Times New Roman" w:hAnsi="Times New Roman"/>
+          <w:b w:val="0"/>
+          <w:color w:val="000000"/>
+          <w:sz w:val="28"/>
+        </w:rPr>
+        <w:t>Для измерений применяется один двухканальный осциллограф XSC1 (рисунок 2.21). Канал A подключается к выходу CLK после инвертора, канал B — к RUN. Для дополнительной проверки инверсии вход B+ временно переносится с RUN на OUT таймера; выходы RUN и OUT между собой не соединяются.</w:t>
+      </w:r>
+    </w:p>
+    <w:p>
+      <w:pPr>
+        <w:keepNext/>
+        <w:keepLines/>
+        <w:spacing w:before="0" w:after="80" w:line="240" w:lineRule="auto"/>
+        <w:ind w:right="283" w:firstLine="0"/>
+        <w:jc w:val="center"/>
+        <w:rPr>
+          <w:sz w:val="28"/>
+        </w:rPr>
+      </w:pPr>
+      <w:r>
+        <w:rPr>
+          <w:rFonts w:ascii="Times New Roman" w:hAnsi="Times New Roman"/>
+          <w:b w:val="0"/>
+          <w:color w:val="000000"/>
+          <w:sz w:val="28"/>
+        </w:rPr>
+      </w:r>
+      <w:r>
+        <w:drawing>
+          <wp:inline xmlns:a="http://schemas.openxmlformats.org/drawingml/2006/main" xmlns:pic="http://schemas.openxmlformats.org/drawingml/2006/picture">
+            <wp:extent cx="5940000" cy="2808000"/>
+            <wp:docPr id="918597028" name="Picture 918597028" descr="Рисунок 2.21 – Расчётная схема проверки временных характеристик генератора и триггера"/>
+            <wp:cNvGraphicFramePr>
+              <a:graphicFrameLocks noChangeAspect="1"/>
+            </wp:cNvGraphicFramePr>
+            <a:graphic>
+              <a:graphicData uri="http://schemas.openxmlformats.org/drawingml/2006/picture">
+                <pic:pic>
+                  <pic:nvPicPr>
+                    <pic:cNvPr id="0" name="fig_2_21.png"/>
+                    <pic:cNvPicPr/>
+                  </pic:nvPicPr>
+                  <pic:blipFill>
+                    <a:blip r:embed="rId39"/>
+                    <a:stretch>
+                      <a:fillRect/>
+                    </a:stretch>
+                  </pic:blipFill>
+                  <pic:spPr>
+                    <a:xfrm>
+                      <a:off x="0" y="0"/>
+                      <a:ext cx="5940000" cy="2808000"/>
+                    </a:xfrm>
+                    <a:prstGeom prst="rect"/>
+                  </pic:spPr>
+                </pic:pic>
+              </a:graphicData>
+            </a:graphic>
+          </wp:inline>
+        </w:drawing>
+      </w:r>
+    </w:p>
+    <w:p>
+      <w:pPr>
+        <w:keepLines/>
+        <w:spacing w:before="0" w:after="160" w:line="276" w:lineRule="auto"/>
+        <w:ind w:right="283" w:firstLine="0"/>
+        <w:jc w:val="center"/>
+        <w:rPr>
+          <w:sz w:val="28"/>
+        </w:rPr>
+      </w:pPr>
+      <w:r>
+        <w:rPr>
+          <w:rFonts w:ascii="Times New Roman" w:hAnsi="Times New Roman"/>
+          <w:b w:val="0"/>
+          <w:color w:val="000000"/>
+          <w:sz w:val="28"/>
+        </w:rPr>
+        <w:t>Рисунок 2.21 – Расчётная схема проверки временных характеристик генератора и триггера</w:t>
+      </w:r>
+    </w:p>
+    <w:p>
+      <w:pPr>
+        <w:spacing w:line="360" w:lineRule="auto" w:before="0" w:after="0"/>
+        <w:ind w:right="283" w:firstLine="709"/>
+        <w:jc w:val="both"/>
+      </w:pPr>
+      <w:r>
+        <w:rPr>
+          <w:rFonts w:ascii="Times New Roman" w:hAnsi="Times New Roman"/>
+          <w:b w:val="0"/>
+          <w:color w:val="000000"/>
+          <w:sz w:val="28"/>
+        </w:rPr>
+        <w:t>Рекомендуемая начальная временная база — 0,5 с/деление. После появления нескольких импульсов моделирование приостанавливается. Первую задержку запуска не следует использовать как измерение установившегося периода. На следующих рисунках показаны расчётные ориентиры для курсоров, а не результаты моделирования в Multisim.</w:t>
+      </w:r>
+    </w:p>
+    <w:p>
+      <w:pPr>
+        <w:spacing w:line="360" w:lineRule="auto" w:before="0" w:after="0"/>
+        <w:ind w:right="283" w:firstLine="709"/>
+        <w:jc w:val="both"/>
+      </w:pPr>
+      <w:r>
+        <w:rPr>
+          <w:rFonts w:ascii="Times New Roman" w:hAnsi="Times New Roman"/>
+          <w:b w:val="0"/>
+          <w:color w:val="000000"/>
+          <w:sz w:val="28"/>
+        </w:rPr>
+        <w:t>Проверка остановки выполняется отдельно: после 13 положительных фронтов относительно начального кода 13 должны наблюдаться HEX = 6, Y6 = 1, STOP = 1, RUN = 0 и неизменный CLK = 1. Необходимо также проверить отсутствие самопроизвольной остановки при переходе 7 → 8 и невозможность повторного запуска без общей начальной установки.</w:t>
+      </w:r>
+    </w:p>
+    <w:p>
+      <w:pPr>
+        <w:spacing w:after="0" w:before="0" w:line="240" w:lineRule="auto"/>
+      </w:pPr>
+      <w:r>
+        <w:rPr>
+          <w:sz w:val="2"/>
+        </w:rPr>
+        <w:br w:type="page"/>
+      </w:r>
+    </w:p>
+    <w:p>
+      <w:pPr>
+        <w:spacing w:line="360" w:lineRule="auto" w:before="0" w:after="0"/>
+        <w:ind w:right="283" w:firstLine="709"/>
+        <w:jc w:val="both"/>
+      </w:pPr>
+      <w:r>
+        <w:rPr>
+          <w:rFonts w:ascii="Times New Roman" w:hAnsi="Times New Roman"/>
+          <w:b w:val="0"/>
+          <w:color w:val="000000"/>
+          <w:sz w:val="28"/>
+        </w:rPr>
+        <w:t>Для измерения длительности высокого уровня курсор T1 устанавливается на положительный фронт CLK, T2 — на следующий отрицательный фронт. На рисунке 2.22 начало относительного отсчёта совмещено с установившимся положительным фронтом; курсоры в реальной записи будут иметь другое абсолютное время.</w:t>
+      </w:r>
+    </w:p>
+    <w:p>
+      <w:pPr>
+        <w:keepNext/>
+        <w:keepLines/>
+        <w:spacing w:before="0" w:after="80" w:line="240" w:lineRule="auto"/>
+        <w:ind w:right="283" w:firstLine="0"/>
+        <w:jc w:val="center"/>
+        <w:rPr>
+          <w:sz w:val="28"/>
+        </w:rPr>
+      </w:pPr>
+      <w:r>
+        <w:rPr>
+          <w:rFonts w:ascii="Times New Roman" w:hAnsi="Times New Roman"/>
+          <w:b w:val="0"/>
+          <w:color w:val="000000"/>
+          <w:sz w:val="28"/>
+        </w:rPr>
+      </w:r>
+      <w:r>
+        <w:drawing>
+          <wp:inline xmlns:a="http://schemas.openxmlformats.org/drawingml/2006/main" xmlns:pic="http://schemas.openxmlformats.org/drawingml/2006/picture">
+            <wp:extent cx="5940000" cy="3041566"/>
+            <wp:docPr id="918597029" name="Picture 918597029" descr="Рисунок 2.22 – Расчётная диаграмма измерения длительности импульса CLK"/>
+            <wp:cNvGraphicFramePr>
+              <a:graphicFrameLocks noChangeAspect="1"/>
+            </wp:cNvGraphicFramePr>
+            <a:graphic>
+              <a:graphicData uri="http://schemas.openxmlformats.org/drawingml/2006/picture">
+                <pic:pic>
+                  <pic:nvPicPr>
+                    <pic:cNvPr id="0" name="fig_2_22.png"/>
+                    <pic:cNvPicPr/>
+                  </pic:nvPicPr>
+                  <pic:blipFill>
+                    <a:blip r:embed="rId40"/>
+                    <a:stretch>
+                      <a:fillRect/>
+                    </a:stretch>
+                  </pic:blipFill>
+                  <pic:spPr>
+                    <a:xfrm>
+                      <a:off x="0" y="0"/>
+                      <a:ext cx="5940000" cy="3041566"/>
+                    </a:xfrm>
+                    <a:prstGeom prst="rect"/>
+                  </pic:spPr>
+                </pic:pic>
+              </a:graphicData>
+            </a:graphic>
+          </wp:inline>
+        </w:drawing>
+      </w:r>
+    </w:p>
+    <w:p>
+      <w:pPr>
+        <w:keepLines/>
+        <w:spacing w:before="0" w:after="160" w:line="276" w:lineRule="auto"/>
+        <w:ind w:right="283" w:firstLine="0"/>
+        <w:jc w:val="center"/>
+        <w:rPr>
+          <w:sz w:val="28"/>
+        </w:rPr>
+      </w:pPr>
+      <w:r>
+        <w:rPr>
+          <w:rFonts w:ascii="Times New Roman" w:hAnsi="Times New Roman"/>
+          <w:b w:val="0"/>
+          <w:color w:val="000000"/>
+          <w:sz w:val="28"/>
+        </w:rPr>
+        <w:t>Рисунок 2.22 – Расчётная диаграмма измерения длительности импульса CLK</w:t>
+      </w:r>
+    </w:p>
+    <w:p>
+      <w:pPr>
+        <w:spacing w:line="360" w:lineRule="auto" w:before="0" w:after="0"/>
+        <w:ind w:right="283" w:firstLine="709"/>
+        <w:jc w:val="both"/>
+      </w:pPr>
+      <w:r>
+        <w:rPr>
+          <w:rFonts w:ascii="Times New Roman" w:hAnsi="Times New Roman"/>
+          <w:b w:val="0"/>
+          <w:color w:val="000000"/>
+          <w:sz w:val="28"/>
+        </w:rPr>
+        <w:t>Ожидаемая разность T2 − T1 ≈ 0,660569 с. Заданная длительность 0,66 с соблюдается с погрешностью округления около +0,0863 %. RUN во время этих импульсов должен сохранять единицу. Амплитуды нарисованы как условные логические уровни, а не гарантированные аналоговые напряжения TTL.</w:t>
+      </w:r>
+    </w:p>
+    <w:p>
+      <w:pPr>
+        <w:spacing w:line="360" w:lineRule="auto" w:before="0" w:after="0"/>
+        <w:ind w:right="283" w:firstLine="709"/>
+        <w:jc w:val="both"/>
+      </w:pPr>
+      <w:r>
+        <w:rPr>
+          <w:rFonts w:ascii="Times New Roman" w:hAnsi="Times New Roman"/>
+          <w:b w:val="0"/>
+          <w:color w:val="000000"/>
+          <w:sz w:val="28"/>
+        </w:rPr>
+        <w:t>Для отчёта эту иллюстрацию следует заменить собственным снимком XSC1 с видимыми курсорами и полем разности времени. Если измеренная длительность заметно отличается, сначала проверяется точка CLK после инвертора, затем номиналы R2 и C1. Одного визуального сходства формы сигнала недостаточно.</w:t>
+      </w:r>
+    </w:p>
+    <w:p>
+      <w:pPr>
+        <w:spacing w:after="0" w:before="0" w:line="240" w:lineRule="auto"/>
+      </w:pPr>
+      <w:r>
+        <w:rPr>
+          <w:sz w:val="2"/>
+        </w:rPr>
+        <w:br w:type="page"/>
+      </w:r>
+    </w:p>
+    <w:p>
+      <w:pPr>
+        <w:spacing w:line="360" w:lineRule="auto" w:before="0" w:after="0"/>
+        <w:ind w:right="283" w:firstLine="709"/>
+        <w:jc w:val="both"/>
+      </w:pPr>
+      <w:r>
+        <w:rPr>
+          <w:rFonts w:ascii="Times New Roman" w:hAnsi="Times New Roman"/>
+          <w:b w:val="0"/>
+          <w:color w:val="000000"/>
+          <w:sz w:val="28"/>
+        </w:rPr>
+        <w:t>Для измерения периода курсор T1 остаётся на положительном фронте CLK, T2 переносится на следующий положительный фронт. Расчётное положение курсоров показано на рисунке 2.23.</w:t>
+      </w:r>
+    </w:p>
+    <w:p>
+      <w:pPr>
+        <w:keepNext/>
+        <w:keepLines/>
+        <w:spacing w:before="0" w:after="80" w:line="240" w:lineRule="auto"/>
+        <w:ind w:right="283" w:firstLine="0"/>
+        <w:jc w:val="center"/>
+        <w:rPr>
+          <w:sz w:val="28"/>
+        </w:rPr>
+      </w:pPr>
+      <w:r>
+        <w:rPr>
+          <w:rFonts w:ascii="Times New Roman" w:hAnsi="Times New Roman"/>
+          <w:b w:val="0"/>
+          <w:color w:val="000000"/>
+          <w:sz w:val="28"/>
+        </w:rPr>
+      </w:r>
+      <w:r>
+        <w:drawing>
+          <wp:inline xmlns:a="http://schemas.openxmlformats.org/drawingml/2006/main" xmlns:pic="http://schemas.openxmlformats.org/drawingml/2006/picture">
+            <wp:extent cx="5940000" cy="3041566"/>
+            <wp:docPr id="918597030" name="Picture 918597030" descr="Рисунок 2.23 – Расчётная диаграмма измерения периода повторения CLK"/>
+            <wp:cNvGraphicFramePr>
+              <a:graphicFrameLocks noChangeAspect="1"/>
+            </wp:cNvGraphicFramePr>
+            <a:graphic>
+              <a:graphicData uri="http://schemas.openxmlformats.org/drawingml/2006/picture">
+                <pic:pic>
+                  <pic:nvPicPr>
+                    <pic:cNvPr id="0" name="fig_2_23.png"/>
+                    <pic:cNvPicPr/>
+                  </pic:nvPicPr>
+                  <pic:blipFill>
+                    <a:blip r:embed="rId41"/>
+                    <a:stretch>
+                      <a:fillRect/>
+                    </a:stretch>
+                  </pic:blipFill>
+                  <pic:spPr>
+                    <a:xfrm>
+                      <a:off x="0" y="0"/>
+                      <a:ext cx="5940000" cy="3041566"/>
+                    </a:xfrm>
+                    <a:prstGeom prst="rect"/>
+                  </pic:spPr>
+                </pic:pic>
+              </a:graphicData>
+            </a:graphic>
+          </wp:inline>
+        </w:drawing>
+      </w:r>
+    </w:p>
+    <w:p>
+      <w:pPr>
+        <w:keepLines/>
+        <w:spacing w:before="0" w:after="160" w:line="276" w:lineRule="auto"/>
+        <w:ind w:right="283" w:firstLine="0"/>
+        <w:jc w:val="center"/>
+        <w:rPr>
+          <w:sz w:val="28"/>
+        </w:rPr>
+      </w:pPr>
+      <w:r>
+        <w:rPr>
+          <w:rFonts w:ascii="Times New Roman" w:hAnsi="Times New Roman"/>
+          <w:b w:val="0"/>
+          <w:color w:val="000000"/>
+          <w:sz w:val="28"/>
+        </w:rPr>
+        <w:t>Рисунок 2.23 – Расчётная диаграмма измерения периода повторения CLK</w:t>
+      </w:r>
+    </w:p>
+    <w:p>
+      <w:pPr>
+        <w:spacing w:line="360" w:lineRule="auto" w:before="0" w:after="0"/>
+        <w:ind w:right="283" w:firstLine="709"/>
+        <w:jc w:val="both"/>
+      </w:pPr>
+      <w:r>
+        <w:rPr>
+          <w:rFonts w:ascii="Times New Roman" w:hAnsi="Times New Roman"/>
+          <w:b w:val="0"/>
+          <w:color w:val="000000"/>
+          <w:sz w:val="28"/>
+        </w:rPr>
+        <w:t>Ожидаемый период T2 − T1 ≈ 1,351082 с, что отличается от заданных 1,35 с приблизительно на +0,0802 %. Длительность низкого уровня составляет 0,690513 с. После проверки tH период уточняется подбором R1, затем оба параметра измеряются повторно.</w:t>
+      </w:r>
+    </w:p>
+    <w:p>
+      <w:pPr>
+        <w:spacing w:line="360" w:lineRule="auto" w:before="0" w:after="0"/>
+        <w:ind w:right="283" w:firstLine="709"/>
+        <w:jc w:val="both"/>
+      </w:pPr>
+      <w:r>
+        <w:rPr>
+          <w:rFonts w:ascii="Times New Roman" w:hAnsi="Times New Roman"/>
+          <w:b w:val="0"/>
+          <w:color w:val="000000"/>
+          <w:sz w:val="28"/>
+        </w:rPr>
+        <w:t>Завершение схемного этапа подтверждается тремя проверками: длительности импульса, периода и удержания конечного состояния 6. Представленные расчёты и логическая проверка не заменяют запуск схемы в Multisim; реальные осциллограммы и снимок остановленного устройства требуется получить после ручной сборки.</w:t>
       </w:r>
     </w:p>
     <w:p>
       <w:pPr>
         <w:spacing w:line="240" w:lineRule="auto" w:before="160" w:after="0"/>
         <w:ind w:right="283" w:firstLine="709"/>
-        <w:jc w:val="both"/>
+        <w:jc w:val="left"/>
       </w:pPr>
       <w:r>
         <w:rPr>
@@ -15395,7 +16023,7 @@
           <w:color w:val="000000"/>
           <w:sz w:val="24"/>
         </w:rPr>
-        <w:t>Технические источники: Texas Instruments, LM555 Timer (SNAS548D), разделы 5 и 7.4.2, https://www.ti.com/lit/ds/symlink/lm555.pdf; Hex Inverters (SDLS029C), https://www.ti.com/lit/ds/symlink/sn74ls04.pdf; D-Type Flip-Flops With Clear And Preset (SDAS143C), https://www.ti.com/lit/ds/symlink/sn74as74a.pdf. Дата обращения: 06.09.2026.</w:t>
+        <w:t>Технические источники: Texas Instruments, LM555 Timer, https://www.ti.com/lit/ds/symlink/lm555.pdf; 74AS74, https://www.ti.com/lit/ds/symlink/sn74as74a.pdf; 74LS04, https://www.ti.com/lit/ds/symlink/sn74ls04.pdf; 74HC14, https://www.ti.com/lit/ds/symlink/sn74hc14.pdf. NI, Multisim User Guide, https://download.ni.com/support/manuals/374483a.pdf (Logic Analyzer: 16 channels). Дата обращения: 06.09.2026.</w:t>
       </w:r>
     </w:p>
     <w:sectPr>

</xml_diff>

<commit_message>
report: complete coursework narrative and final system diagrams
</commit_message>
<xml_diff>
--- a/deliverables/Курсовая_Блинов_текущая.docx
+++ b/deliverables/Курсовая_Блинов_текущая.docx
@@ -2330,6 +2330,126 @@
             <w:t>2.3.3 Временные диаграммы таймера и D-триггера</w:t>
             <w:tab/>
             <w:t>26</w:t>
+          </w:r>
+        </w:p>
+        <w:p>
+          <w:pPr>
+            <w:tabs>
+              <w:tab w:pos="9694" w:val="right" w:leader="dot"/>
+            </w:tabs>
+            <w:spacing w:after="100" w:line="276" w:lineRule="auto"/>
+            <w:ind w:left="0" w:right="283"/>
+          </w:pPr>
+          <w:r>
+            <w:rPr>
+              <w:rFonts w:ascii="Times New Roman" w:hAnsi="Times New Roman"/>
+              <w:b w:val="0"/>
+              <w:color w:val="000000"/>
+              <w:sz w:val="24"/>
+            </w:rPr>
+            <w:t>3. Результаты синтеза управляющего устройства</w:t>
+            <w:tab/>
+            <w:t>29</w:t>
+          </w:r>
+        </w:p>
+        <w:p>
+          <w:pPr>
+            <w:tabs>
+              <w:tab w:pos="9694" w:val="right" w:leader="dot"/>
+            </w:tabs>
+            <w:spacing w:after="100" w:line="276" w:lineRule="auto"/>
+            <w:ind w:left="198" w:right="283"/>
+          </w:pPr>
+          <w:r>
+            <w:rPr>
+              <w:rFonts w:ascii="Times New Roman" w:hAnsi="Times New Roman"/>
+              <w:b w:val="0"/>
+              <w:color w:val="000000"/>
+              <w:sz w:val="24"/>
+            </w:rPr>
+            <w:t>3.1 Схемная реализация управляющего устройства</w:t>
+            <w:tab/>
+            <w:t>29</w:t>
+          </w:r>
+        </w:p>
+        <w:p>
+          <w:pPr>
+            <w:tabs>
+              <w:tab w:pos="9694" w:val="right" w:leader="dot"/>
+            </w:tabs>
+            <w:spacing w:after="100" w:line="276" w:lineRule="auto"/>
+            <w:ind w:left="198" w:right="283"/>
+          </w:pPr>
+          <w:r>
+            <w:rPr>
+              <w:rFonts w:ascii="Times New Roman" w:hAnsi="Times New Roman"/>
+              <w:b w:val="0"/>
+              <w:color w:val="000000"/>
+              <w:sz w:val="24"/>
+            </w:rPr>
+            <w:t>3.2 Временные диаграммы сигналов устройства управления</w:t>
+            <w:tab/>
+            <w:t>31</w:t>
+          </w:r>
+        </w:p>
+        <w:p>
+          <w:pPr>
+            <w:tabs>
+              <w:tab w:pos="9694" w:val="right" w:leader="dot"/>
+            </w:tabs>
+            <w:spacing w:after="100" w:line="276" w:lineRule="auto"/>
+            <w:ind w:left="198" w:right="283"/>
+          </w:pPr>
+          <w:r>
+            <w:rPr>
+              <w:rFonts w:ascii="Times New Roman" w:hAnsi="Times New Roman"/>
+              <w:b w:val="0"/>
+              <w:color w:val="000000"/>
+              <w:sz w:val="24"/>
+            </w:rPr>
+            <w:t>3.3 Работа схемы</w:t>
+            <w:tab/>
+            <w:t>32</w:t>
+          </w:r>
+        </w:p>
+        <w:p>
+          <w:pPr>
+            <w:tabs>
+              <w:tab w:pos="9694" w:val="right" w:leader="dot"/>
+            </w:tabs>
+            <w:spacing w:after="100" w:line="276" w:lineRule="auto"/>
+            <w:ind w:left="0" w:right="283"/>
+          </w:pPr>
+          <w:r>
+            <w:rPr>
+              <w:rFonts w:ascii="Times New Roman" w:hAnsi="Times New Roman"/>
+              <w:b w:val="0"/>
+              <w:color w:val="000000"/>
+              <w:sz w:val="24"/>
+            </w:rPr>
+            <w:t>Заключение</w:t>
+            <w:tab/>
+            <w:t>33</w:t>
+          </w:r>
+        </w:p>
+        <w:p>
+          <w:pPr>
+            <w:tabs>
+              <w:tab w:pos="9694" w:val="right" w:leader="dot"/>
+            </w:tabs>
+            <w:spacing w:after="100" w:line="276" w:lineRule="auto"/>
+            <w:ind w:left="0" w:right="283"/>
+          </w:pPr>
+          <w:r>
+            <w:rPr>
+              <w:rFonts w:ascii="Times New Roman" w:hAnsi="Times New Roman"/>
+              <w:b w:val="0"/>
+              <w:color w:val="000000"/>
+              <w:sz w:val="24"/>
+            </w:rPr>
+            <w:t>Список используемых источников литературы</w:t>
+            <w:tab/>
+            <w:t>34</w:t>
           </w:r>
         </w:p>
         <w:p>
@@ -16023,7 +16143,1387 @@
           <w:color w:val="000000"/>
           <w:sz w:val="24"/>
         </w:rPr>
-        <w:t>Технические источники: Texas Instruments, LM555 Timer, https://www.ti.com/lit/ds/symlink/lm555.pdf; 74AS74, https://www.ti.com/lit/ds/symlink/sn74as74a.pdf; 74LS04, https://www.ti.com/lit/ds/symlink/sn74ls04.pdf; 74HC14, https://www.ti.com/lit/ds/symlink/sn74hc14.pdf. NI, Multisim User Guide, https://download.ni.com/support/manuals/374483a.pdf (Logic Analyzer: 16 channels). Дата обращения: 06.09.2026.</w:t>
+        <w:t>Расчёт генератора и выбор элементов выполнены по технической документации [1–5]; средства наблюдения в Multisim описаны в руководстве [6].</w:t>
+      </w:r>
+    </w:p>
+    <w:p>
+      <w:pPr>
+        <w:pStyle w:val="1"/>
+        <w:keepNext/>
+        <w:pageBreakBefore/>
+        <w:spacing w:line="276" w:lineRule="auto" w:before="200" w:after="160"/>
+        <w:ind w:right="283" w:firstLine="709"/>
+        <w:jc w:val="left"/>
+        <w:outlineLvl w:val="0"/>
+      </w:pPr>
+      <w:r>
+        <w:rPr>
+          <w:rFonts w:ascii="Times New Roman" w:hAnsi="Times New Roman"/>
+          <w:b/>
+          <w:color w:val="000000"/>
+          <w:sz w:val="28"/>
+        </w:rPr>
+        <w:t>3. Результаты синтеза управляющего устройства</w:t>
+      </w:r>
+    </w:p>
+    <w:p>
+      <w:pPr>
+        <w:pStyle w:val="1"/>
+        <w:keepNext/>
+        <w:pageBreakBefore w:val="0"/>
+        <w:spacing w:line="276" w:lineRule="auto" w:before="200" w:after="160"/>
+        <w:ind w:right="283" w:firstLine="709"/>
+        <w:jc w:val="left"/>
+        <w:outlineLvl w:val="1"/>
+      </w:pPr>
+      <w:r>
+        <w:rPr>
+          <w:rFonts w:ascii="Times New Roman" w:hAnsi="Times New Roman"/>
+          <w:b/>
+          <w:color w:val="000000"/>
+          <w:sz w:val="28"/>
+        </w:rPr>
+        <w:t>3.1 Схемная реализация управляющего устройства</w:t>
+      </w:r>
+    </w:p>
+    <w:p>
+      <w:pPr>
+        <w:spacing w:line="360" w:lineRule="auto" w:before="0" w:after="0"/>
+        <w:ind w:right="283" w:firstLine="709"/>
+        <w:jc w:val="both"/>
+      </w:pPr>
+      <w:r>
+        <w:rPr>
+          <w:rFonts w:ascii="Times New Roman" w:hAnsi="Times New Roman"/>
+          <w:b w:val="0"/>
+          <w:color w:val="000000"/>
+          <w:sz w:val="28"/>
+        </w:rPr>
+        <w:t>На основе синтезированных блоков разработана функциональная схема управляющего устройства (рисунок 3.1). ПСУ формирует заданную последовательность четырёхразрядных кодов, дешифратор преобразует их в четырнадцать управляющих сигналов, а генератор задаёт моменты переключения и прекращает счёт в состоянии 6.</w:t>
+      </w:r>
+    </w:p>
+    <w:p>
+      <w:pPr>
+        <w:keepNext/>
+        <w:keepLines/>
+        <w:spacing w:before="0" w:after="80" w:line="240" w:lineRule="auto"/>
+        <w:ind w:right="283" w:firstLine="0"/>
+        <w:jc w:val="center"/>
+        <w:rPr>
+          <w:sz w:val="28"/>
+        </w:rPr>
+      </w:pPr>
+      <w:r>
+        <w:rPr>
+          <w:rFonts w:ascii="Times New Roman" w:hAnsi="Times New Roman"/>
+          <w:b w:val="0"/>
+          <w:color w:val="000000"/>
+          <w:sz w:val="28"/>
+        </w:rPr>
+      </w:r>
+      <w:r>
+        <w:drawing>
+          <wp:inline xmlns:a="http://schemas.openxmlformats.org/drawingml/2006/main" xmlns:pic="http://schemas.openxmlformats.org/drawingml/2006/picture">
+            <wp:extent cx="5508000" cy="3702600"/>
+            <wp:docPr id="918597031" name="Picture 918597031" descr="Рисунок 3.1 – Расчётная функциональная схема управляющего устройства"/>
+            <wp:cNvGraphicFramePr>
+              <a:graphicFrameLocks noChangeAspect="1"/>
+            </wp:cNvGraphicFramePr>
+            <a:graphic>
+              <a:graphicData uri="http://schemas.openxmlformats.org/drawingml/2006/picture">
+                <pic:pic>
+                  <pic:nvPicPr>
+                    <pic:cNvPr id="0" name="fig_3_1_system.png"/>
+                    <pic:cNvPicPr/>
+                  </pic:nvPicPr>
+                  <pic:blipFill>
+                    <a:blip r:embed="rId42"/>
+                    <a:stretch>
+                      <a:fillRect/>
+                    </a:stretch>
+                  </pic:blipFill>
+                  <pic:spPr>
+                    <a:xfrm>
+                      <a:off x="0" y="0"/>
+                      <a:ext cx="5508000" cy="3702600"/>
+                    </a:xfrm>
+                    <a:prstGeom prst="rect"/>
+                  </pic:spPr>
+                </pic:pic>
+              </a:graphicData>
+            </a:graphic>
+          </wp:inline>
+        </w:drawing>
+      </w:r>
+    </w:p>
+    <w:p>
+      <w:pPr>
+        <w:keepLines/>
+        <w:spacing w:before="0" w:after="160" w:line="276" w:lineRule="auto"/>
+        <w:ind w:right="283" w:firstLine="0"/>
+        <w:jc w:val="center"/>
+        <w:rPr>
+          <w:sz w:val="28"/>
+        </w:rPr>
+      </w:pPr>
+      <w:r>
+        <w:rPr>
+          <w:rFonts w:ascii="Times New Roman" w:hAnsi="Times New Roman"/>
+          <w:b w:val="0"/>
+          <w:color w:val="000000"/>
+          <w:sz w:val="28"/>
+        </w:rPr>
+        <w:t>Рисунок 3.1 – Расчётная функциональная схема управляющего устройства</w:t>
+      </w:r>
+    </w:p>
+    <w:p>
+      <w:pPr>
+        <w:spacing w:line="360" w:lineRule="auto" w:before="0" w:after="0"/>
+        <w:ind w:right="283" w:firstLine="709"/>
+        <w:jc w:val="both"/>
+      </w:pPr>
+      <w:r>
+        <w:rPr>
+          <w:rFonts w:ascii="Times New Roman" w:hAnsi="Times New Roman"/>
+          <w:b w:val="0"/>
+          <w:color w:val="000000"/>
+          <w:sz w:val="28"/>
+        </w:rPr>
+        <w:t>На схеме используются ранее полученные блоки Logic_D, D_Counter, DC1, CLK_GEN и P_RES_GEN. Линия обратной связи передаёт прямые и инверсные выходы регистра на комбинационную логику. Четыре Probe показывают значения D3…D0, четырнадцать Probe — активный управляющий выход; HEX-индикатор отображает текущее состояние.</w:t>
+      </w:r>
+    </w:p>
+    <w:p>
+      <w:pPr>
+        <w:spacing w:line="360" w:lineRule="auto" w:before="0" w:after="0"/>
+        <w:ind w:right="283" w:firstLine="709"/>
+        <w:jc w:val="both"/>
+      </w:pPr>
+      <w:r>
+        <w:rPr>
+          <w:rFonts w:ascii="Times New Roman" w:hAnsi="Times New Roman"/>
+          <w:b w:val="0"/>
+          <w:color w:val="000000"/>
+          <w:sz w:val="28"/>
+        </w:rPr>
+        <w:t>XLA1 записывает выходы Y по карте рисунка 2.11; для общей диаграммы он перенастраивается, как описано в 3.2. Старый тестовый генератор отключается: выходы двух генераторов нельзя соединять между собой.</w:t>
+      </w:r>
+    </w:p>
+    <w:p>
+      <w:pPr>
+        <w:pageBreakBefore/>
+        <w:spacing w:line="360" w:lineRule="auto" w:before="0" w:after="0"/>
+        <w:ind w:right="283" w:firstLine="709"/>
+        <w:jc w:val="both"/>
+      </w:pPr>
+      <w:r>
+        <w:rPr>
+          <w:rFonts w:ascii="Times New Roman" w:hAnsi="Times New Roman"/>
+          <w:b w:val="0"/>
+          <w:color w:val="000000"/>
+          <w:sz w:val="28"/>
+        </w:rPr>
+        <w:t>Связи между функциональными блоками приведены в таблице 3.1. Они дополняют поэлементные схемы раздела 2 и определяют объединение блоков в общую модель.</w:t>
+      </w:r>
+    </w:p>
+    <w:p>
+      <w:pPr>
+        <w:spacing w:line="360" w:lineRule="auto" w:before="0" w:after="100"/>
+        <w:ind w:right="283" w:firstLine="709"/>
+        <w:jc w:val="both"/>
+      </w:pPr>
+      <w:r>
+        <w:rPr>
+          <w:rFonts w:ascii="Times New Roman" w:hAnsi="Times New Roman"/>
+          <w:b w:val="0"/>
+          <w:color w:val="000000"/>
+          <w:sz w:val="28"/>
+        </w:rPr>
+        <w:t>Таблица 3.1 – Межблочные соединения управляющего устройства</w:t>
+      </w:r>
+    </w:p>
+    <w:tbl>
+      <w:tblPr>
+        <w:tblW w:type="auto" w:w="0"/>
+        <w:tblLayout w:type="fixed"/>
+        <w:tblLook w:firstColumn="1" w:firstRow="1" w:lastColumn="0" w:lastRow="0" w:noHBand="0" w:noVBand="1" w:val="04A0"/>
+        <w:tblBorders>
+          <w:top w:val="single" w:sz="4" w:color="000000"/>
+          <w:left w:val="single" w:sz="4" w:color="000000"/>
+          <w:bottom w:val="single" w:sz="4" w:color="000000"/>
+          <w:right w:val="single" w:sz="4" w:color="000000"/>
+          <w:insideH w:val="single" w:sz="4" w:color="000000"/>
+          <w:insideV w:val="single" w:sz="4" w:color="000000"/>
+        </w:tblBorders>
+      </w:tblPr>
+      <w:tblGrid>
+        <w:gridCol w:w="3402"/>
+        <w:gridCol w:w="3402"/>
+        <w:gridCol w:w="3402"/>
+      </w:tblGrid>
+      <w:tr>
+        <w:trPr>
+          <w:tblHeader/>
+          <w:cantSplit/>
+        </w:trPr>
+        <w:tc>
+          <w:tcPr>
+            <w:tcW w:type="dxa" w:w="1871"/>
+          </w:tcPr>
+          <w:p>
+            <w:pPr>
+              <w:spacing w:after="60" w:before="60" w:line="252" w:lineRule="auto"/>
+            </w:pPr>
+            <w:r>
+              <w:rPr>
+                <w:rFonts w:ascii="Times New Roman" w:hAnsi="Times New Roman"/>
+                <w:b/>
+                <w:color w:val="000000"/>
+                <w:sz w:val="24"/>
+              </w:rPr>
+              <w:t>Цепь</w:t>
+            </w:r>
+          </w:p>
+        </w:tc>
+        <w:tc>
+          <w:tcPr>
+            <w:tcW w:type="dxa" w:w="2721"/>
+          </w:tcPr>
+          <w:p>
+            <w:pPr>
+              <w:spacing w:after="60" w:before="60" w:line="252" w:lineRule="auto"/>
+            </w:pPr>
+            <w:r>
+              <w:rPr>
+                <w:rFonts w:ascii="Times New Roman" w:hAnsi="Times New Roman"/>
+                <w:b/>
+                <w:color w:val="000000"/>
+                <w:sz w:val="24"/>
+              </w:rPr>
+              <w:t>Источник</w:t>
+            </w:r>
+          </w:p>
+        </w:tc>
+        <w:tc>
+          <w:tcPr>
+            <w:tcW w:type="dxa" w:w="4762"/>
+          </w:tcPr>
+          <w:p>
+            <w:pPr>
+              <w:spacing w:after="60" w:before="60" w:line="252" w:lineRule="auto"/>
+            </w:pPr>
+            <w:r>
+              <w:rPr>
+                <w:rFonts w:ascii="Times New Roman" w:hAnsi="Times New Roman"/>
+                <w:b/>
+                <w:color w:val="000000"/>
+                <w:sz w:val="24"/>
+              </w:rPr>
+              <w:t>Приёмники</w:t>
+            </w:r>
+          </w:p>
+        </w:tc>
+      </w:tr>
+      <w:tr>
+        <w:trPr>
+          <w:cantSplit/>
+        </w:trPr>
+        <w:tc>
+          <w:tcPr>
+            <w:tcW w:type="dxa" w:w="1871"/>
+          </w:tcPr>
+          <w:p>
+            <w:pPr>
+              <w:spacing w:after="60" w:before="60" w:line="252" w:lineRule="auto"/>
+            </w:pPr>
+            <w:r>
+              <w:rPr>
+                <w:rFonts w:ascii="Times New Roman" w:hAnsi="Times New Roman"/>
+                <w:b w:val="0"/>
+                <w:color w:val="000000"/>
+                <w:sz w:val="24"/>
+              </w:rPr>
+              <w:t>D3…D0</w:t>
+            </w:r>
+          </w:p>
+        </w:tc>
+        <w:tc>
+          <w:tcPr>
+            <w:tcW w:type="dxa" w:w="2721"/>
+          </w:tcPr>
+          <w:p>
+            <w:pPr>
+              <w:spacing w:after="60" w:before="60" w:line="252" w:lineRule="auto"/>
+            </w:pPr>
+            <w:r>
+              <w:rPr>
+                <w:rFonts w:ascii="Times New Roman" w:hAnsi="Times New Roman"/>
+                <w:b w:val="0"/>
+                <w:color w:val="000000"/>
+                <w:sz w:val="24"/>
+              </w:rPr>
+              <w:t>Logic_D</w:t>
+            </w:r>
+          </w:p>
+        </w:tc>
+        <w:tc>
+          <w:tcPr>
+            <w:tcW w:type="dxa" w:w="4762"/>
+          </w:tcPr>
+          <w:p>
+            <w:pPr>
+              <w:spacing w:after="60" w:before="60" w:line="252" w:lineRule="auto"/>
+            </w:pPr>
+            <w:r>
+              <w:rPr>
+                <w:rFonts w:ascii="Times New Roman" w:hAnsi="Times New Roman"/>
+                <w:b w:val="0"/>
+                <w:color w:val="000000"/>
+                <w:sz w:val="24"/>
+              </w:rPr>
+              <w:t>Входы D регистра; 4 Probe</w:t>
+            </w:r>
+          </w:p>
+        </w:tc>
+      </w:tr>
+      <w:tr>
+        <w:trPr>
+          <w:cantSplit/>
+        </w:trPr>
+        <w:tc>
+          <w:tcPr>
+            <w:tcW w:type="dxa" w:w="1871"/>
+          </w:tcPr>
+          <w:p>
+            <w:pPr>
+              <w:spacing w:after="60" w:before="60" w:line="252" w:lineRule="auto"/>
+            </w:pPr>
+            <w:r>
+              <w:rPr>
+                <w:rFonts w:ascii="Times New Roman" w:hAnsi="Times New Roman"/>
+                <w:b w:val="0"/>
+                <w:color w:val="000000"/>
+                <w:sz w:val="24"/>
+              </w:rPr>
+              <w:t>Q3…Q0</w:t>
+            </w:r>
+          </w:p>
+        </w:tc>
+        <w:tc>
+          <w:tcPr>
+            <w:tcW w:type="dxa" w:w="2721"/>
+          </w:tcPr>
+          <w:p>
+            <w:pPr>
+              <w:spacing w:after="60" w:before="60" w:line="252" w:lineRule="auto"/>
+            </w:pPr>
+            <w:r>
+              <w:rPr>
+                <w:rFonts w:ascii="Times New Roman" w:hAnsi="Times New Roman"/>
+                <w:b w:val="0"/>
+                <w:color w:val="000000"/>
+                <w:sz w:val="24"/>
+              </w:rPr>
+              <w:t>D_Counter</w:t>
+            </w:r>
+          </w:p>
+        </w:tc>
+        <w:tc>
+          <w:tcPr>
+            <w:tcW w:type="dxa" w:w="4762"/>
+          </w:tcPr>
+          <w:p>
+            <w:pPr>
+              <w:spacing w:after="60" w:before="60" w:line="252" w:lineRule="auto"/>
+            </w:pPr>
+            <w:r>
+              <w:rPr>
+                <w:rFonts w:ascii="Times New Roman" w:hAnsi="Times New Roman"/>
+                <w:b w:val="0"/>
+                <w:color w:val="000000"/>
+                <w:sz w:val="24"/>
+              </w:rPr>
+              <w:t>Logic_D, DC1, HEX; выбранные разряды STOP_UNIT</w:t>
+            </w:r>
+          </w:p>
+        </w:tc>
+      </w:tr>
+      <w:tr>
+        <w:trPr>
+          <w:cantSplit/>
+        </w:trPr>
+        <w:tc>
+          <w:tcPr>
+            <w:tcW w:type="dxa" w:w="1871"/>
+          </w:tcPr>
+          <w:p>
+            <w:pPr>
+              <w:spacing w:after="60" w:before="60" w:line="252" w:lineRule="auto"/>
+            </w:pPr>
+            <w:r>
+              <w:rPr>
+                <w:rFonts w:ascii="Times New Roman" w:hAnsi="Times New Roman"/>
+                <w:b w:val="0"/>
+                <w:color w:val="000000"/>
+                <w:sz w:val="24"/>
+              </w:rPr>
+              <w:t>NOT_Q3…NOT_Q0</w:t>
+            </w:r>
+          </w:p>
+        </w:tc>
+        <w:tc>
+          <w:tcPr>
+            <w:tcW w:type="dxa" w:w="2721"/>
+          </w:tcPr>
+          <w:p>
+            <w:pPr>
+              <w:spacing w:after="60" w:before="60" w:line="252" w:lineRule="auto"/>
+            </w:pPr>
+            <w:r>
+              <w:rPr>
+                <w:rFonts w:ascii="Times New Roman" w:hAnsi="Times New Roman"/>
+                <w:b w:val="0"/>
+                <w:color w:val="000000"/>
+                <w:sz w:val="24"/>
+              </w:rPr>
+              <w:t>D_Counter</w:t>
+            </w:r>
+          </w:p>
+        </w:tc>
+        <w:tc>
+          <w:tcPr>
+            <w:tcW w:type="dxa" w:w="4762"/>
+          </w:tcPr>
+          <w:p>
+            <w:pPr>
+              <w:spacing w:after="60" w:before="60" w:line="252" w:lineRule="auto"/>
+            </w:pPr>
+            <w:r>
+              <w:rPr>
+                <w:rFonts w:ascii="Times New Roman" w:hAnsi="Times New Roman"/>
+                <w:b w:val="0"/>
+                <w:color w:val="000000"/>
+                <w:sz w:val="24"/>
+              </w:rPr>
+              <w:t>Logic_D, DC1; выбранные разряды STOP_UNIT</w:t>
+            </w:r>
+          </w:p>
+        </w:tc>
+      </w:tr>
+      <w:tr>
+        <w:trPr>
+          <w:cantSplit/>
+        </w:trPr>
+        <w:tc>
+          <w:tcPr>
+            <w:tcW w:type="dxa" w:w="1871"/>
+          </w:tcPr>
+          <w:p>
+            <w:pPr>
+              <w:spacing w:after="60" w:before="60" w:line="252" w:lineRule="auto"/>
+            </w:pPr>
+            <w:r>
+              <w:rPr>
+                <w:rFonts w:ascii="Times New Roman" w:hAnsi="Times New Roman"/>
+                <w:b w:val="0"/>
+                <w:color w:val="000000"/>
+                <w:sz w:val="24"/>
+              </w:rPr>
+              <w:t>CLK</w:t>
+            </w:r>
+          </w:p>
+        </w:tc>
+        <w:tc>
+          <w:tcPr>
+            <w:tcW w:type="dxa" w:w="2721"/>
+          </w:tcPr>
+          <w:p>
+            <w:pPr>
+              <w:spacing w:after="60" w:before="60" w:line="252" w:lineRule="auto"/>
+            </w:pPr>
+            <w:r>
+              <w:rPr>
+                <w:rFonts w:ascii="Times New Roman" w:hAnsi="Times New Roman"/>
+                <w:b w:val="0"/>
+                <w:color w:val="000000"/>
+                <w:sz w:val="24"/>
+              </w:rPr>
+              <w:t>74LS04 после LM555</w:t>
+            </w:r>
+          </w:p>
+        </w:tc>
+        <w:tc>
+          <w:tcPr>
+            <w:tcW w:type="dxa" w:w="4762"/>
+          </w:tcPr>
+          <w:p>
+            <w:pPr>
+              <w:spacing w:after="60" w:before="60" w:line="252" w:lineRule="auto"/>
+            </w:pPr>
+            <w:r>
+              <w:rPr>
+                <w:rFonts w:ascii="Times New Roman" w:hAnsi="Times New Roman"/>
+                <w:b w:val="0"/>
+                <w:color w:val="000000"/>
+                <w:sz w:val="24"/>
+              </w:rPr>
+              <w:t>4 триггера ПСУ; U_CTRL:B; XLA1:C</w:t>
+            </w:r>
+          </w:p>
+        </w:tc>
+      </w:tr>
+      <w:tr>
+        <w:trPr>
+          <w:cantSplit/>
+        </w:trPr>
+        <w:tc>
+          <w:tcPr>
+            <w:tcW w:type="dxa" w:w="1871"/>
+          </w:tcPr>
+          <w:p>
+            <w:pPr>
+              <w:spacing w:after="60" w:before="60" w:line="252" w:lineRule="auto"/>
+            </w:pPr>
+            <w:r>
+              <w:rPr>
+                <w:rFonts w:ascii="Times New Roman" w:hAnsi="Times New Roman"/>
+                <w:b w:val="0"/>
+                <w:color w:val="000000"/>
+                <w:sz w:val="24"/>
+              </w:rPr>
+              <w:t>P_RES</w:t>
+            </w:r>
+          </w:p>
+        </w:tc>
+        <w:tc>
+          <w:tcPr>
+            <w:tcW w:type="dxa" w:w="2721"/>
+          </w:tcPr>
+          <w:p>
+            <w:pPr>
+              <w:spacing w:after="60" w:before="60" w:line="252" w:lineRule="auto"/>
+            </w:pPr>
+            <w:r>
+              <w:rPr>
+                <w:rFonts w:ascii="Times New Roman" w:hAnsi="Times New Roman"/>
+                <w:b w:val="0"/>
+                <w:color w:val="000000"/>
+                <w:sz w:val="24"/>
+              </w:rPr>
+              <w:t>P_RES_GEN</w:t>
+            </w:r>
+          </w:p>
+        </w:tc>
+        <w:tc>
+          <w:tcPr>
+            <w:tcW w:type="dxa" w:w="4762"/>
+          </w:tcPr>
+          <w:p>
+            <w:pPr>
+              <w:spacing w:after="60" w:before="60" w:line="252" w:lineRule="auto"/>
+            </w:pPr>
+            <w:r>
+              <w:rPr>
+                <w:rFonts w:ascii="Times New Roman" w:hAnsi="Times New Roman"/>
+                <w:b w:val="0"/>
+                <w:color w:val="000000"/>
+                <w:sz w:val="24"/>
+              </w:rPr>
+              <w:t>Асинхронная установка ПСУ; /CLR U_CTRL:B; AND2 сброса RUN</w:t>
+            </w:r>
+          </w:p>
+        </w:tc>
+      </w:tr>
+      <w:tr>
+        <w:trPr>
+          <w:cantSplit/>
+        </w:trPr>
+        <w:tc>
+          <w:tcPr>
+            <w:tcW w:type="dxa" w:w="1871"/>
+          </w:tcPr>
+          <w:p>
+            <w:pPr>
+              <w:spacing w:after="60" w:before="60" w:line="252" w:lineRule="auto"/>
+            </w:pPr>
+            <w:r>
+              <w:rPr>
+                <w:rFonts w:ascii="Times New Roman" w:hAnsi="Times New Roman"/>
+                <w:b w:val="0"/>
+                <w:color w:val="000000"/>
+                <w:sz w:val="24"/>
+              </w:rPr>
+              <w:t>START</w:t>
+            </w:r>
+          </w:p>
+        </w:tc>
+        <w:tc>
+          <w:tcPr>
+            <w:tcW w:type="dxa" w:w="2721"/>
+          </w:tcPr>
+          <w:p>
+            <w:pPr>
+              <w:spacing w:after="60" w:before="60" w:line="252" w:lineRule="auto"/>
+            </w:pPr>
+            <w:r>
+              <w:rPr>
+                <w:rFonts w:ascii="Times New Roman" w:hAnsi="Times New Roman"/>
+                <w:b w:val="0"/>
+                <w:color w:val="000000"/>
+                <w:sz w:val="24"/>
+              </w:rPr>
+              <w:t>Цифровой источник запуска</w:t>
+            </w:r>
+          </w:p>
+        </w:tc>
+        <w:tc>
+          <w:tcPr>
+            <w:tcW w:type="dxa" w:w="4762"/>
+          </w:tcPr>
+          <w:p>
+            <w:pPr>
+              <w:spacing w:after="60" w:before="60" w:line="252" w:lineRule="auto"/>
+            </w:pPr>
+            <w:r>
+              <w:rPr>
+                <w:rFonts w:ascii="Times New Roman" w:hAnsi="Times New Roman"/>
+                <w:b w:val="0"/>
+                <w:color w:val="000000"/>
+                <w:sz w:val="24"/>
+              </w:rPr>
+              <w:t>CLK U_CTRL:A</w:t>
+            </w:r>
+          </w:p>
+        </w:tc>
+      </w:tr>
+      <w:tr>
+        <w:trPr>
+          <w:cantSplit/>
+        </w:trPr>
+        <w:tc>
+          <w:tcPr>
+            <w:tcW w:type="dxa" w:w="1871"/>
+          </w:tcPr>
+          <w:p>
+            <w:pPr>
+              <w:spacing w:after="60" w:before="60" w:line="252" w:lineRule="auto"/>
+            </w:pPr>
+            <w:r>
+              <w:rPr>
+                <w:rFonts w:ascii="Times New Roman" w:hAnsi="Times New Roman"/>
+                <w:b w:val="0"/>
+                <w:color w:val="000000"/>
+                <w:sz w:val="24"/>
+              </w:rPr>
+              <w:t>RUN</w:t>
+            </w:r>
+          </w:p>
+        </w:tc>
+        <w:tc>
+          <w:tcPr>
+            <w:tcW w:type="dxa" w:w="2721"/>
+          </w:tcPr>
+          <w:p>
+            <w:pPr>
+              <w:spacing w:after="60" w:before="60" w:line="252" w:lineRule="auto"/>
+            </w:pPr>
+            <w:r>
+              <w:rPr>
+                <w:rFonts w:ascii="Times New Roman" w:hAnsi="Times New Roman"/>
+                <w:b w:val="0"/>
+                <w:color w:val="000000"/>
+                <w:sz w:val="24"/>
+              </w:rPr>
+              <w:t>U_CTRL:A:5</w:t>
+            </w:r>
+          </w:p>
+        </w:tc>
+        <w:tc>
+          <w:tcPr>
+            <w:tcW w:type="dxa" w:w="4762"/>
+          </w:tcPr>
+          <w:p>
+            <w:pPr>
+              <w:spacing w:after="60" w:before="60" w:line="252" w:lineRule="auto"/>
+            </w:pPr>
+            <w:r>
+              <w:rPr>
+                <w:rFonts w:ascii="Times New Roman" w:hAnsi="Times New Roman"/>
+                <w:b w:val="0"/>
+                <w:color w:val="000000"/>
+                <w:sz w:val="24"/>
+              </w:rPr>
+              <w:t>LM555:4 /RESET; контроль XSC</w:t>
+            </w:r>
+          </w:p>
+        </w:tc>
+      </w:tr>
+      <w:tr>
+        <w:trPr>
+          <w:cantSplit/>
+        </w:trPr>
+        <w:tc>
+          <w:tcPr>
+            <w:tcW w:type="dxa" w:w="1871"/>
+          </w:tcPr>
+          <w:p>
+            <w:pPr>
+              <w:spacing w:after="60" w:before="60" w:line="252" w:lineRule="auto"/>
+            </w:pPr>
+            <w:r>
+              <w:rPr>
+                <w:rFonts w:ascii="Times New Roman" w:hAnsi="Times New Roman"/>
+                <w:b w:val="0"/>
+                <w:color w:val="000000"/>
+                <w:sz w:val="24"/>
+              </w:rPr>
+              <w:t>NOT_STOP</w:t>
+            </w:r>
+          </w:p>
+        </w:tc>
+        <w:tc>
+          <w:tcPr>
+            <w:tcW w:type="dxa" w:w="2721"/>
+          </w:tcPr>
+          <w:p>
+            <w:pPr>
+              <w:spacing w:after="60" w:before="60" w:line="252" w:lineRule="auto"/>
+            </w:pPr>
+            <w:r>
+              <w:rPr>
+                <w:rFonts w:ascii="Times New Roman" w:hAnsi="Times New Roman"/>
+                <w:b w:val="0"/>
+                <w:color w:val="000000"/>
+                <w:sz w:val="24"/>
+              </w:rPr>
+              <w:t>U_CTRL:B:8</w:t>
+            </w:r>
+          </w:p>
+        </w:tc>
+        <w:tc>
+          <w:tcPr>
+            <w:tcW w:type="dxa" w:w="4762"/>
+          </w:tcPr>
+          <w:p>
+            <w:pPr>
+              <w:spacing w:after="60" w:before="60" w:line="252" w:lineRule="auto"/>
+            </w:pPr>
+            <w:r>
+              <w:rPr>
+                <w:rFonts w:ascii="Times New Roman" w:hAnsi="Times New Roman"/>
+                <w:b w:val="0"/>
+                <w:color w:val="000000"/>
+                <w:sz w:val="24"/>
+              </w:rPr>
+              <w:t>AND2 совместно с P_RES</w:t>
+            </w:r>
+          </w:p>
+        </w:tc>
+      </w:tr>
+      <w:tr>
+        <w:trPr>
+          <w:cantSplit/>
+        </w:trPr>
+        <w:tc>
+          <w:tcPr>
+            <w:tcW w:type="dxa" w:w="1871"/>
+          </w:tcPr>
+          <w:p>
+            <w:pPr>
+              <w:spacing w:after="60" w:before="60" w:line="252" w:lineRule="auto"/>
+            </w:pPr>
+            <w:r>
+              <w:rPr>
+                <w:rFonts w:ascii="Times New Roman" w:hAnsi="Times New Roman"/>
+                <w:b w:val="0"/>
+                <w:color w:val="000000"/>
+                <w:sz w:val="24"/>
+              </w:rPr>
+              <w:t>Y0,Y2,…,Y14</w:t>
+            </w:r>
+          </w:p>
+        </w:tc>
+        <w:tc>
+          <w:tcPr>
+            <w:tcW w:type="dxa" w:w="2721"/>
+          </w:tcPr>
+          <w:p>
+            <w:pPr>
+              <w:spacing w:after="60" w:before="60" w:line="252" w:lineRule="auto"/>
+            </w:pPr>
+            <w:r>
+              <w:rPr>
+                <w:rFonts w:ascii="Times New Roman" w:hAnsi="Times New Roman"/>
+                <w:b w:val="0"/>
+                <w:color w:val="000000"/>
+                <w:sz w:val="24"/>
+              </w:rPr>
+              <w:t>DC1</w:t>
+            </w:r>
+          </w:p>
+        </w:tc>
+        <w:tc>
+          <w:tcPr>
+            <w:tcW w:type="dxa" w:w="4762"/>
+          </w:tcPr>
+          <w:p>
+            <w:pPr>
+              <w:spacing w:after="60" w:before="60" w:line="252" w:lineRule="auto"/>
+            </w:pPr>
+            <w:r>
+              <w:rPr>
+                <w:rFonts w:ascii="Times New Roman" w:hAnsi="Times New Roman"/>
+                <w:b w:val="0"/>
+                <w:color w:val="000000"/>
+                <w:sz w:val="24"/>
+              </w:rPr>
+              <w:t>14 Probe и 14 каналов XLA1</w:t>
+            </w:r>
+          </w:p>
+        </w:tc>
+      </w:tr>
+    </w:tbl>
+    <w:p>
+      <w:pPr>
+        <w:spacing w:line="360" w:lineRule="auto" w:before="160" w:after="0"/>
+        <w:ind w:right="283" w:firstLine="709"/>
+        <w:jc w:val="both"/>
+      </w:pPr>
+      <w:r>
+        <w:rPr>
+          <w:rFonts w:ascii="Times New Roman" w:hAnsi="Times New Roman"/>
+          <w:b w:val="0"/>
+          <w:color w:val="000000"/>
+          <w:sz w:val="28"/>
+        </w:rPr>
+        <w:t>Регистр ПСУ содержит четыре D-триггера в двух корпусах 74AS74. Ещё один корпус используется для RUN и STOP. Дешифратор реализуется восемью AND3 и шестью AND4, логика остановки — одним AND4 и одним AND2. Времязадающая часть содержит LM555, инвертор 74LS04, R1 = 4,32 кОм, R2 = 95,3 кОм и C1 = 10 мкФ.</w:t>
+      </w:r>
+    </w:p>
+    <w:p>
+      <w:pPr>
+        <w:spacing w:line="360" w:lineRule="auto" w:before="0" w:after="0"/>
+        <w:ind w:right="283" w:firstLine="709"/>
+        <w:jc w:val="both"/>
+      </w:pPr>
+      <w:r>
+        <w:rPr>
+          <w:rFonts w:ascii="Times New Roman" w:hAnsi="Times New Roman"/>
+          <w:b w:val="0"/>
+          <w:color w:val="000000"/>
+          <w:sz w:val="28"/>
+        </w:rPr>
+        <w:t>Начальная установка формируется RC-цепью R3 = 10 кОм, C4 = 10 мкФ и двумя инверторами Шмитта 74HC14. Буфер 74LS07 с подтяжкой R4 = 1 кОм обеспечивает нагрузочную способность линии P_RES [3–5]. Питание всех блоков составляет 5 В, земля общая; у каждого корпуса предусматривается развязывающий конденсатор 100 нФ.</w:t>
+      </w:r>
+    </w:p>
+    <w:p>
+      <w:pPr>
+        <w:spacing w:line="360" w:lineRule="auto" w:before="0" w:after="0"/>
+        <w:ind w:right="283" w:firstLine="709"/>
+        <w:jc w:val="both"/>
+      </w:pPr>
+      <w:r>
+        <w:rPr>
+          <w:rFonts w:ascii="Times New Roman" w:hAnsi="Times New Roman"/>
+          <w:b w:val="0"/>
+          <w:color w:val="000000"/>
+          <w:sz w:val="28"/>
+        </w:rPr>
+        <w:t>Работа ПСУ подтверждена моделями Logic_D и D_Counter. Для общей схемы остаётся проверить запуск, дешифрацию и остановку по STOP.</w:t>
+      </w:r>
+    </w:p>
+    <w:p>
+      <w:pPr>
+        <w:pStyle w:val="1"/>
+        <w:keepNext/>
+        <w:pageBreakBefore/>
+        <w:spacing w:line="276" w:lineRule="auto" w:before="200" w:after="160"/>
+        <w:ind w:right="283" w:firstLine="709"/>
+        <w:jc w:val="left"/>
+        <w:outlineLvl w:val="1"/>
+      </w:pPr>
+      <w:r>
+        <w:rPr>
+          <w:rFonts w:ascii="Times New Roman" w:hAnsi="Times New Roman"/>
+          <w:b/>
+          <w:color w:val="000000"/>
+          <w:sz w:val="28"/>
+        </w:rPr>
+        <w:t>3.2 Временные диаграммы сигналов устройства управления</w:t>
+      </w:r>
+    </w:p>
+    <w:p>
+      <w:pPr>
+        <w:spacing w:line="360" w:lineRule="auto" w:before="0" w:after="0"/>
+        <w:ind w:right="283" w:firstLine="709"/>
+        <w:jc w:val="both"/>
+      </w:pPr>
+      <w:r>
+        <w:rPr>
+          <w:rFonts w:ascii="Times New Roman" w:hAnsi="Times New Roman"/>
+          <w:b w:val="0"/>
+          <w:color w:val="000000"/>
+          <w:sz w:val="28"/>
+        </w:rPr>
+        <w:t>Рисунок 3.2 построен по функциям ПСУ и номиналам генератора. Отсчёт начинается с START ↑ после снятия P_RES. До запуска: код D (1101), RUN = STOP = 0, CLK = 1.</w:t>
+      </w:r>
+    </w:p>
+    <w:p>
+      <w:pPr>
+        <w:keepNext/>
+        <w:keepLines/>
+        <w:spacing w:before="0" w:after="80" w:line="240" w:lineRule="auto"/>
+        <w:ind w:right="283" w:firstLine="0"/>
+        <w:jc w:val="center"/>
+        <w:rPr>
+          <w:sz w:val="28"/>
+        </w:rPr>
+      </w:pPr>
+      <w:r>
+        <w:rPr>
+          <w:rFonts w:ascii="Times New Roman" w:hAnsi="Times New Roman"/>
+          <w:b w:val="0"/>
+          <w:color w:val="000000"/>
+          <w:sz w:val="28"/>
+        </w:rPr>
+      </w:r>
+      <w:r>
+        <w:drawing>
+          <wp:inline xmlns:a="http://schemas.openxmlformats.org/drawingml/2006/main" xmlns:pic="http://schemas.openxmlformats.org/drawingml/2006/picture">
+            <wp:extent cx="5760000" cy="3274105"/>
+            <wp:docPr id="918597032" name="Picture 918597032" descr="Рисунок 3.2 – Расчётная временная диаграмма сигналов управляющего устройства"/>
+            <wp:cNvGraphicFramePr>
+              <a:graphicFrameLocks noChangeAspect="1"/>
+            </wp:cNvGraphicFramePr>
+            <a:graphic>
+              <a:graphicData uri="http://schemas.openxmlformats.org/drawingml/2006/picture">
+                <pic:pic>
+                  <pic:nvPicPr>
+                    <pic:cNvPr id="0" name="fig_3_2_timing.png"/>
+                    <pic:cNvPicPr/>
+                  </pic:nvPicPr>
+                  <pic:blipFill>
+                    <a:blip r:embed="rId43"/>
+                    <a:stretch>
+                      <a:fillRect/>
+                    </a:stretch>
+                  </pic:blipFill>
+                  <pic:spPr>
+                    <a:xfrm>
+                      <a:off x="0" y="0"/>
+                      <a:ext cx="5760000" cy="3274105"/>
+                    </a:xfrm>
+                    <a:prstGeom prst="rect"/>
+                  </pic:spPr>
+                </pic:pic>
+              </a:graphicData>
+            </a:graphic>
+          </wp:inline>
+        </w:drawing>
+      </w:r>
+    </w:p>
+    <w:p>
+      <w:pPr>
+        <w:keepLines/>
+        <w:spacing w:before="0" w:after="160" w:line="276" w:lineRule="auto"/>
+        <w:ind w:right="283" w:firstLine="0"/>
+        <w:jc w:val="center"/>
+        <w:rPr>
+          <w:sz w:val="28"/>
+        </w:rPr>
+      </w:pPr>
+      <w:r>
+        <w:rPr>
+          <w:rFonts w:ascii="Times New Roman" w:hAnsi="Times New Roman"/>
+          <w:b w:val="0"/>
+          <w:color w:val="000000"/>
+          <w:sz w:val="28"/>
+        </w:rPr>
+        <w:t>Рисунок 3.2 – Расчётная временная диаграмма сигналов управляющего устройства</w:t>
+      </w:r>
+    </w:p>
+    <w:p>
+      <w:pPr>
+        <w:spacing w:line="360" w:lineRule="auto" w:before="0" w:after="0"/>
+        <w:ind w:right="283" w:firstLine="709"/>
+        <w:jc w:val="both"/>
+      </w:pPr>
+      <w:r>
+        <w:rPr>
+          <w:rFonts w:ascii="Times New Roman" w:hAnsi="Times New Roman"/>
+          <w:b w:val="0"/>
+          <w:color w:val="000000"/>
+          <w:sz w:val="28"/>
+        </w:rPr>
+        <w:t>При START ↑ устанавливается RUN = 1, а CLK сначала падает. Первый положительный фронт возникает приблизительно через 1,0944 с при исходно разряженном C1; далее фронты следуют через 1,351082 с. Состояния меняются в порядке D–2–E–B–0–C–9–5–7–8–4–3–A–6.</w:t>
+      </w:r>
+    </w:p>
+    <w:p>
+      <w:pPr>
+        <w:spacing w:line="360" w:lineRule="auto" w:before="0" w:after="0"/>
+        <w:ind w:right="283" w:firstLine="709"/>
+        <w:jc w:val="both"/>
+      </w:pPr>
+      <w:r>
+        <w:rPr>
+          <w:rFonts w:ascii="Times New Roman" w:hAnsi="Times New Roman"/>
+          <w:b w:val="0"/>
+          <w:color w:val="000000"/>
+          <w:sz w:val="28"/>
+        </w:rPr>
+        <w:t>На тринадцатом фронте происходит переход A → 6 и устанавливается STOP. Время от START равно 1,0944 + 12 · 1,351082 ≈ 17,3074 с. RUN сбрасывается; CLK = 1, HEX = 6 и Y6 = 1 сохраняются. Задержки логики на расчётной диаграмме не показаны.</w:t>
+      </w:r>
+    </w:p>
+    <w:p>
+      <w:pPr>
+        <w:spacing w:line="360" w:lineRule="auto" w:before="0" w:after="0"/>
+        <w:ind w:right="283" w:firstLine="709"/>
+        <w:jc w:val="both"/>
+      </w:pPr>
+      <w:r>
+        <w:rPr>
+          <w:rFonts w:ascii="Times New Roman" w:hAnsi="Times New Roman"/>
+          <w:b w:val="0"/>
+          <w:color w:val="000000"/>
+          <w:sz w:val="28"/>
+        </w:rPr>
+        <w:t>Для этой записи XLA1 использует внутреннюю выборку 100 Гц: каналы 1–4 → Q3…Q0, 5 → START, 6 → RUN, 7 → STOP, 8 → CLK; C отключён. Запись продолжается и после остановки CLK. Диаграмма Y снимается отдельно по рисунку 2.11 [6].</w:t>
+      </w:r>
+    </w:p>
+    <w:p>
+      <w:pPr>
+        <w:pStyle w:val="1"/>
+        <w:keepNext/>
+        <w:pageBreakBefore/>
+        <w:spacing w:line="276" w:lineRule="auto" w:before="200" w:after="160"/>
+        <w:ind w:right="283" w:firstLine="709"/>
+        <w:jc w:val="left"/>
+        <w:outlineLvl w:val="1"/>
+      </w:pPr>
+      <w:r>
+        <w:rPr>
+          <w:rFonts w:ascii="Times New Roman" w:hAnsi="Times New Roman"/>
+          <w:b/>
+          <w:color w:val="000000"/>
+          <w:sz w:val="28"/>
+        </w:rPr>
+        <w:t>3.3 Работа схемы</w:t>
+      </w:r>
+    </w:p>
+    <w:p>
+      <w:pPr>
+        <w:spacing w:line="360" w:lineRule="auto" w:before="0" w:after="0"/>
+        <w:ind w:right="283" w:firstLine="709"/>
+        <w:jc w:val="both"/>
+      </w:pPr>
+      <w:r>
+        <w:rPr>
+          <w:rFonts w:ascii="Times New Roman" w:hAnsi="Times New Roman"/>
+          <w:b w:val="0"/>
+          <w:color w:val="000000"/>
+          <w:sz w:val="28"/>
+        </w:rPr>
+        <w:t>После включения питания P_RES_GEN формирует низкий уровень начальной установки. На разрядах Q3, Q2 и Q0 активируется /PRE, на Q1 — /CLR: ПСУ принимает код 1101. Оба триггера управления сбрасываются. После заряда C4 сигнал P_RES становится высоким, и схема ожидает START.</w:t>
+      </w:r>
+    </w:p>
+    <w:p>
+      <w:pPr>
+        <w:spacing w:line="360" w:lineRule="auto" w:before="0" w:after="0"/>
+        <w:ind w:right="283" w:firstLine="709"/>
+        <w:jc w:val="both"/>
+      </w:pPr>
+      <w:r>
+        <w:rPr>
+          <w:rFonts w:ascii="Times New Roman" w:hAnsi="Times New Roman"/>
+          <w:b w:val="0"/>
+          <w:color w:val="000000"/>
+          <w:sz w:val="28"/>
+        </w:rPr>
+        <w:t>Фронт START устанавливает RUN. Таймер начинает колебания, инвертор формирует CLK. До каждого положительного фронта Logic_D вычисляет следующий код; фронт одновременно записывает D3…D0 в четыре триггера, обеспечивая синхронный пересчёт [1, 2].</w:t>
+      </w:r>
+    </w:p>
+    <w:p>
+      <w:pPr>
+        <w:spacing w:line="360" w:lineRule="auto" w:before="0" w:after="0"/>
+        <w:ind w:right="283" w:firstLine="709"/>
+        <w:jc w:val="both"/>
+      </w:pPr>
+      <w:r>
+        <w:rPr>
+          <w:rFonts w:ascii="Times New Roman" w:hAnsi="Times New Roman"/>
+          <w:b w:val="0"/>
+          <w:color w:val="000000"/>
+          <w:sz w:val="28"/>
+        </w:rPr>
+        <w:t>В каждом установившемся рабочем состоянии DC1 активирует один выход Yi, индекс которого совпадает с десятичным входным кодом. Для 1101 включён Y13, для 0010 — Y2, для конечного 0110 — Y6. HEX-индикатор показывает соответственно D, 2 и 6.</w:t>
+      </w:r>
+    </w:p>
+    <w:p>
+      <w:pPr>
+        <w:spacing w:line="360" w:lineRule="auto" w:before="0" w:after="0"/>
+        <w:ind w:right="283" w:firstLine="709"/>
+        <w:jc w:val="both"/>
+      </w:pPr>
+      <w:r>
+        <w:rPr>
+          <w:rFonts w:ascii="Times New Roman" w:hAnsi="Times New Roman"/>
+          <w:b w:val="0"/>
+          <w:color w:val="000000"/>
+          <w:sz w:val="28"/>
+        </w:rPr>
+        <w:t>В состоянии 10 активен E10. На следующем фронте ПСУ принимает 6, а триггер STOP записывает единицу. NOT_STOP через AND2 сбрасывает RUN. В этот момент OUT таймера уже низкий, поэтому его сброс сохраняет высокий CLK без дополнительного положительного фронта. Состояние 6 удерживается до общей начальной установки.</w:t>
+      </w:r>
+    </w:p>
+    <w:p>
+      <w:pPr>
+        <w:spacing w:line="360" w:lineRule="auto" w:before="0" w:after="0"/>
+        <w:ind w:right="283" w:firstLine="709"/>
+        <w:jc w:val="both"/>
+      </w:pPr>
+      <w:r>
+        <w:rPr>
+          <w:rFonts w:ascii="Times New Roman" w:hAnsi="Times New Roman"/>
+          <w:b w:val="0"/>
+          <w:color w:val="000000"/>
+          <w:sz w:val="28"/>
+        </w:rPr>
+        <w:t>Для нового прохода S_RST замыкается не менее чем на 5 с: ПСУ возвращается в 13, STOP и RUN сбрасываются, C1 разряжается. После размыкания S_RST и снятия P_RES подаётся новый фронт START. Запуск без сброса невозможен: активный STOP удерживает RUN в нуле.</w:t>
+      </w:r>
+    </w:p>
+    <w:p>
+      <w:pPr>
+        <w:spacing w:line="360" w:lineRule="auto" w:before="0" w:after="0"/>
+        <w:ind w:right="283" w:firstLine="709"/>
+        <w:jc w:val="both"/>
+      </w:pPr>
+      <w:r>
+        <w:rPr>
+          <w:rFonts w:ascii="Times New Roman" w:hAnsi="Times New Roman"/>
+          <w:b w:val="0"/>
+          <w:color w:val="000000"/>
+          <w:sz w:val="28"/>
+        </w:rPr>
+        <w:t>Проверка минимизированной логики на исключённых кодах дала переходы 1 → 13 и 15 → 2. При разрешённом тактировании возврат в рабочую последовательность занимает один такт, но до него дешифратор может выдавать несколько единиц. Поэтому штатный запуск всегда выполняется после P_RES.</w:t>
+      </w:r>
+    </w:p>
+    <w:p>
+      <w:pPr>
+        <w:pStyle w:val="1"/>
+        <w:keepNext/>
+        <w:pageBreakBefore/>
+        <w:spacing w:line="276" w:lineRule="auto" w:before="200" w:after="160"/>
+        <w:ind w:right="283" w:firstLine="709"/>
+        <w:jc w:val="left"/>
+        <w:outlineLvl w:val="0"/>
+      </w:pPr>
+      <w:r>
+        <w:rPr>
+          <w:rFonts w:ascii="Times New Roman" w:hAnsi="Times New Roman"/>
+          <w:b/>
+          <w:color w:val="000000"/>
+          <w:sz w:val="28"/>
+        </w:rPr>
+        <w:t>Заключение</w:t>
+      </w:r>
+    </w:p>
+    <w:p>
+      <w:pPr>
+        <w:spacing w:line="360" w:lineRule="auto" w:before="0" w:after="0"/>
+        <w:ind w:right="283" w:firstLine="709"/>
+        <w:jc w:val="both"/>
+      </w:pPr>
+      <w:r>
+        <w:rPr>
+          <w:rFonts w:ascii="Times New Roman" w:hAnsi="Times New Roman"/>
+          <w:b w:val="0"/>
+          <w:color w:val="000000"/>
+          <w:sz w:val="28"/>
+        </w:rPr>
+        <w:t>В курсовой работе выполнен логический синтез управляющего устройства для последовательности 13–2–14–11–0–12–9–5–7–8–4–3–10–6. Построены таблица переходов и карты Карно, получены минимизированные функции входов четырёх D-триггеров 74AS74. Правильность рабочего цикла ПСУ подтверждена ранее выполненным моделированием и приведённой диаграммой логического анализатора.</w:t>
+      </w:r>
+    </w:p>
+    <w:p>
+      <w:pPr>
+        <w:spacing w:line="360" w:lineRule="auto" w:before="0" w:after="0"/>
+        <w:ind w:right="283" w:firstLine="709"/>
+        <w:jc w:val="both"/>
+      </w:pPr>
+      <w:r>
+        <w:rPr>
+          <w:rFonts w:ascii="Times New Roman" w:hAnsi="Times New Roman"/>
+          <w:b w:val="0"/>
+          <w:color w:val="000000"/>
+          <w:sz w:val="28"/>
+        </w:rPr>
+        <w:t>Синтезирован дешифратор 4/14 с активным единичным уровнем выходов. Проверка всех четырнадцати рабочих кодов показала единственность активного управляющего сигнала. Для исключённых кодов 1 и 15 определены переходы в рабочую последовательность и отмечено отсутствие гарантированной унитарности до установления допустимого состояния.</w:t>
+      </w:r>
+    </w:p>
+    <w:p>
+      <w:pPr>
+        <w:spacing w:line="360" w:lineRule="auto" w:before="0" w:after="0"/>
+        <w:ind w:right="283" w:firstLine="709"/>
+        <w:jc w:val="both"/>
+      </w:pPr>
+      <w:r>
+        <w:rPr>
+          <w:rFonts w:ascii="Times New Roman" w:hAnsi="Times New Roman"/>
+          <w:b w:val="0"/>
+          <w:color w:val="000000"/>
+          <w:sz w:val="28"/>
+        </w:rPr>
+        <w:t>Рассчитан управляемый генератор на LM555 с выходным инвертором. При номиналах R1 = 4,32 кОм, R2 = 95,3 кОм и C1 = 10 мкФ расчётная длительность высокого уровня равна 0,660569 с, период — 1,351082 с. Отклонение, обусловленное округлением номиналов, составляет менее 0,09 %; допуски компонентов и погрешности модели учитываются отдельно.</w:t>
+      </w:r>
+    </w:p>
+    <w:p>
+      <w:pPr>
+        <w:spacing w:line="360" w:lineRule="auto" w:before="0" w:after="0"/>
+        <w:ind w:right="283" w:firstLine="709"/>
+        <w:jc w:val="both"/>
+      </w:pPr>
+      <w:r>
+        <w:rPr>
+          <w:rFonts w:ascii="Times New Roman" w:hAnsi="Times New Roman"/>
+          <w:b w:val="0"/>
+          <w:color w:val="000000"/>
+          <w:sz w:val="28"/>
+        </w:rPr>
+        <w:t>Разработаны цепи начальной установки, запуска и остановки на состоянии 6. Регистрация признака предшествующего кода обеспечивает остановку после тринадцатого переключения от начального состояния 13. Подготовлены общая функциональная схема, межблочные соединения и расчётная диаграмма работы устройства.</w:t>
+      </w:r>
+    </w:p>
+    <w:p>
+      <w:pPr>
+        <w:spacing w:line="360" w:lineRule="auto" w:before="0" w:after="0"/>
+        <w:ind w:right="283" w:firstLine="709"/>
+        <w:jc w:val="both"/>
+      </w:pPr>
+      <w:r>
+        <w:rPr>
+          <w:rFonts w:ascii="Times New Roman" w:hAnsi="Times New Roman"/>
+          <w:b w:val="0"/>
+          <w:color w:val="000000"/>
+          <w:sz w:val="28"/>
+        </w:rPr>
+        <w:t>Полученные результаты подтверждают корректность логического синтеза и расчёта временных параметров. Полная экспериментальная проверка объединённой модели, включая RC-сброс, временные параметры и отсутствие лишнего фронта при остановке, должна быть подтверждена измерениями в NI Multisim. Расчётные диаграммы не являются результатами этих измерений.</w:t>
+      </w:r>
+    </w:p>
+    <w:p>
+      <w:pPr>
+        <w:pStyle w:val="1"/>
+        <w:keepNext/>
+        <w:pageBreakBefore/>
+        <w:spacing w:line="276" w:lineRule="auto" w:before="200" w:after="160"/>
+        <w:ind w:right="283" w:firstLine="709"/>
+        <w:jc w:val="left"/>
+        <w:outlineLvl w:val="0"/>
+      </w:pPr>
+      <w:r>
+        <w:rPr>
+          <w:rFonts w:ascii="Times New Roman" w:hAnsi="Times New Roman"/>
+          <w:b/>
+          <w:color w:val="000000"/>
+          <w:sz w:val="28"/>
+        </w:rPr>
+        <w:t>Список используемых источников литературы</w:t>
+      </w:r>
+    </w:p>
+    <w:p>
+      <w:pPr>
+        <w:keepLines/>
+        <w:spacing w:line="360" w:lineRule="auto" w:before="0" w:after="240"/>
+        <w:ind w:right="283" w:firstLine="709"/>
+        <w:jc w:val="left"/>
+      </w:pPr>
+      <w:r>
+        <w:rPr>
+          <w:rFonts w:ascii="Times New Roman" w:hAnsi="Times New Roman"/>
+          <w:b w:val="0"/>
+          <w:color w:val="000000"/>
+          <w:sz w:val="28"/>
+        </w:rPr>
+        <w:t>1. Texas Instruments. LM555 Timer. SNAS548D. 2015. — Текст: электронный. — URL: https://www.ti.com/lit/ds/symlink/lm555.pdf (дата обращения: 06.09.2026).</w:t>
+      </w:r>
+    </w:p>
+    <w:p>
+      <w:pPr>
+        <w:keepLines/>
+        <w:spacing w:line="360" w:lineRule="auto" w:before="0" w:after="240"/>
+        <w:ind w:right="283" w:firstLine="709"/>
+        <w:jc w:val="left"/>
+      </w:pPr>
+      <w:r>
+        <w:rPr>
+          <w:rFonts w:ascii="Times New Roman" w:hAnsi="Times New Roman"/>
+          <w:b w:val="0"/>
+          <w:color w:val="000000"/>
+          <w:sz w:val="28"/>
+        </w:rPr>
+        <w:t>2. Texas Instruments. Dual Positive-Edge-Triggered D-Type Flip-Flops With Clear And Preset. SN74AS74A. SDAS143C. — Текст: электронный. — URL: https://www.ti.com/lit/ds/symlink/sn74as74a.pdf (дата обращения: 06.09.2026).</w:t>
+      </w:r>
+    </w:p>
+    <w:p>
+      <w:pPr>
+        <w:keepLines/>
+        <w:spacing w:line="360" w:lineRule="auto" w:before="0" w:after="240"/>
+        <w:ind w:right="283" w:firstLine="709"/>
+        <w:jc w:val="left"/>
+      </w:pPr>
+      <w:r>
+        <w:rPr>
+          <w:rFonts w:ascii="Times New Roman" w:hAnsi="Times New Roman"/>
+          <w:b w:val="0"/>
+          <w:color w:val="000000"/>
+          <w:sz w:val="28"/>
+        </w:rPr>
+        <w:t>3. Texas Instruments. Hex Inverters. SN74LS04. SDLS029C. — Текст: электронный. — URL: https://www.ti.com/lit/ds/symlink/sn74ls04.pdf (дата обращения: 06.09.2026).</w:t>
+      </w:r>
+    </w:p>
+    <w:p>
+      <w:pPr>
+        <w:keepLines/>
+        <w:spacing w:line="360" w:lineRule="auto" w:before="0" w:after="240"/>
+        <w:ind w:right="283" w:firstLine="709"/>
+        <w:jc w:val="left"/>
+      </w:pPr>
+      <w:r>
+        <w:rPr>
+          <w:rFonts w:ascii="Times New Roman" w:hAnsi="Times New Roman"/>
+          <w:b w:val="0"/>
+          <w:color w:val="000000"/>
+          <w:sz w:val="28"/>
+        </w:rPr>
+        <w:t>4. Texas Instruments. SNx4HC14 Hex Inverters with Schmitt-Trigger Inputs. SCLS085L. 2025. — Текст: электронный. — URL: https://www.ti.com/lit/ds/symlink/sn74hc14.pdf (дата обращения: 06.09.2026).</w:t>
+      </w:r>
+    </w:p>
+    <w:p>
+      <w:pPr>
+        <w:keepLines/>
+        <w:spacing w:line="360" w:lineRule="auto" w:before="0" w:after="240"/>
+        <w:ind w:right="283" w:firstLine="709"/>
+        <w:jc w:val="left"/>
+      </w:pPr>
+      <w:r>
+        <w:rPr>
+          <w:rFonts w:ascii="Times New Roman" w:hAnsi="Times New Roman"/>
+          <w:b w:val="0"/>
+          <w:color w:val="000000"/>
+          <w:sz w:val="28"/>
+        </w:rPr>
+        <w:t>5. Texas Instruments. SN74LS07 Hex Buffers and Drivers With Open-Collector High-Voltage Outputs. SDLS021D. 2016. — Текст: электронный. — URL: https://www.ti.com/lit/ds/symlink/sn74ls07.pdf (дата обращения: 06.09.2026).</w:t>
+      </w:r>
+    </w:p>
+    <w:p>
+      <w:pPr>
+        <w:keepLines/>
+        <w:spacing w:line="360" w:lineRule="auto" w:before="0" w:after="240"/>
+        <w:ind w:right="283" w:firstLine="709"/>
+        <w:jc w:val="left"/>
+      </w:pPr>
+      <w:r>
+        <w:rPr>
+          <w:rFonts w:ascii="Times New Roman" w:hAnsi="Times New Roman"/>
+          <w:b w:val="0"/>
+          <w:color w:val="000000"/>
+          <w:sz w:val="28"/>
+        </w:rPr>
+        <w:t>6. National Instruments. Multisim User Guide. 374483A. — Текст: электронный. — URL: https://download.ni.com/support/manuals/374483a.pdf (дата обращения: 06.09.2026).</w:t>
       </w:r>
     </w:p>
     <w:sectPr>

</xml_diff>

<commit_message>
report: save DC model and user Multisim screenshots
</commit_message>
<xml_diff>
--- a/deliverables/Курсовая_Блинов_текущая.docx
+++ b/deliverables/Курсовая_Блинов_текущая.docx
@@ -2069,14 +2069,7 @@
               <w:color w:val="000000"/>
               <w:sz w:val="24"/>
             </w:rPr>
-            <w:t xml:space="preserve">1.1 Цель и </w:t>
-          </w:r>
-          <w:r>
-            <w:rPr>
-              <w:color w:val="000000"/>
-              <w:sz w:val="24"/>
-            </w:rPr>
-            <w:t>содержание курсовой работы</w:t>
+            <w:t>1.1 Цель и содержание курсовой работы</w:t>
           </w:r>
           <w:r>
             <w:rPr>
@@ -2220,14 +2213,7 @@
               <w:color w:val="000000"/>
               <w:sz w:val="24"/>
             </w:rPr>
-            <w:t xml:space="preserve">2.2 Синтез </w:t>
-          </w:r>
-          <w:r>
-            <w:rPr>
-              <w:color w:val="000000"/>
-              <w:sz w:val="24"/>
-            </w:rPr>
-            <w:t>дешифратора выходных состояний ПСУ</w:t>
+            <w:t>2.2 Синтез дешифратора выходных состояний ПСУ</w:t>
           </w:r>
           <w:r>
             <w:rPr>
@@ -2371,14 +2357,7 @@
               <w:color w:val="000000"/>
               <w:sz w:val="24"/>
             </w:rPr>
-            <w:t xml:space="preserve">2.3.2 Расчёт времязадающей цепи генератора </w:t>
-          </w:r>
-          <w:r>
-            <w:rPr>
-              <w:color w:val="000000"/>
-              <w:sz w:val="24"/>
-            </w:rPr>
-            <w:t>импульсов</w:t>
+            <w:t>2.3.2 Расчёт времязадающей цепи генератора импульсов</w:t>
           </w:r>
           <w:r>
             <w:rPr>
@@ -2546,14 +2525,7 @@
               <w:color w:val="000000"/>
               <w:sz w:val="24"/>
             </w:rPr>
-            <w:t>Сп</w:t>
-          </w:r>
-          <w:r>
-            <w:rPr>
-              <w:color w:val="000000"/>
-              <w:sz w:val="24"/>
-            </w:rPr>
-            <w:t>исок используемых источников литературы</w:t>
+            <w:t>Список используемых источников литературы</w:t>
           </w:r>
           <w:r>
             <w:rPr>
@@ -10992,14 +10964,7 @@
           <w:color w:val="000000"/>
           <w:sz w:val="28"/>
         </w:rPr>
-        <w:t>3. Индикация выходных состояний — светод</w:t>
-      </w:r>
-      <w:r>
-        <w:rPr>
-          <w:color w:val="000000"/>
-          <w:sz w:val="28"/>
-        </w:rPr>
-        <w:t xml:space="preserve">иодная, с помощью </w:t>
+        <w:t xml:space="preserve">3. Индикация выходных состояний — светодиодная, с помощью </w:t>
       </w:r>
       <w:proofErr w:type="spellStart"/>
       <w:r>
@@ -11072,14 +11037,7 @@
           <w:color w:val="000000"/>
           <w:sz w:val="28"/>
         </w:rPr>
-        <w:t>Дешифратор преобразует четырёхразрядный код Q3…Q0 в один из четырнадцати управляющих сигналов. Индекс выхода Yi соответствует десятичному значению состояния ПСУ. Например, при коде 1101 активен Y13, а при коде</w:t>
-      </w:r>
-      <w:r>
-        <w:rPr>
-          <w:color w:val="000000"/>
-          <w:sz w:val="28"/>
-        </w:rPr>
-        <w:t xml:space="preserve"> 0010 — Y2. Выходы Y1 и Y15 не используются. Таблица соответствия приведена на рисунке 2.8.</w:t>
+        <w:t>Дешифратор преобразует четырёхразрядный код Q3…Q0 в один из четырнадцати управляющих сигналов. Индекс выхода Yi соответствует десятичному значению состояния ПСУ. Например, при коде 1101 активен Y13, а при коде 0010 — Y2. Выходы Y1 и Y15 не используются. Таблица соответствия приведена на рисунке 2.8.</w:t>
       </w:r>
     </w:p>
     <w:p>
@@ -11184,14 +11142,7 @@
           <w:color w:val="000000"/>
           <w:sz w:val="28"/>
         </w:rPr>
-        <w:t>В рабочих состояниях единица присутствует ровно на одном выходе. Коды 0001 и 1111 исключены из цикл</w:t>
-      </w:r>
-      <w:r>
-        <w:rPr>
-          <w:color w:val="000000"/>
-          <w:sz w:val="28"/>
-        </w:rPr>
-        <w:t xml:space="preserve">а и при минимизации приняты как факультативные наборы X. Это позволяет сократить число входов части </w:t>
+        <w:t xml:space="preserve">В рабочих состояниях единица присутствует ровно на одном выходе. Коды 0001 и 1111 исключены из цикла и при минимизации приняты как факультативные наборы X. Это позволяет сократить число входов части </w:t>
       </w:r>
       <w:r>
         <w:rPr>
@@ -11210,6 +11161,7 @@
         <w:rPr>
           <w:color w:val="000000"/>
           <w:sz w:val="28"/>
+          <w:lang w:val="en-US"/>
         </w:rPr>
       </w:pPr>
       <w:r>
@@ -11217,14 +11169,7 @@
           <w:color w:val="000000"/>
           <w:sz w:val="28"/>
         </w:rPr>
-        <w:t>Минимизация выполнена по картам Карно с порядком кодов Грея 00, 01, 11, 10. К</w:t>
-      </w:r>
-      <w:r>
-        <w:rPr>
-          <w:color w:val="000000"/>
-          <w:sz w:val="28"/>
-        </w:rPr>
-        <w:t>аждая метка Yi обозначает единственный обязательный единичный набор соответствующей функции; остальные рабочие клетки для этой функции равны нулю. Склейки с X показаны на рисунке 2.9.</w:t>
+        <w:t>Минимизация выполнена по картам Карно с порядком кодов Грея 00, 01, 11, 10. Каждая метка Yi обозначает единственный обязательный единичный набор соответствующей функции; остальные рабочие клетки для этой функции равны нулю. Склейки с X показаны на рисунке 2.9.</w:t>
       </w:r>
     </w:p>
     <w:p>
@@ -11303,15 +11248,7 @@
           <w:sz w:val="28"/>
           <w:highlight w:val="yellow"/>
         </w:rPr>
-        <w:t xml:space="preserve">Рисунок 2.9 – Минимизация функций дешифратора: а) с набором 0001; б) </w:t>
-      </w:r>
-      <w:r>
-        <w:rPr>
-          <w:color w:val="000000"/>
-          <w:sz w:val="28"/>
-          <w:highlight w:val="yellow"/>
-        </w:rPr>
-        <w:t>с набором 1111</w:t>
+        <w:t>Рисунок 2.9 – Минимизация функций дешифратора: а) с набором 0001; б) с набором 1111</w:t>
       </w:r>
     </w:p>
     <w:p>
@@ -12182,7 +12119,20 @@
           <w:rPr>
             <w:rFonts w:ascii="Cambria Math" w:hAnsi="Cambria Math"/>
           </w:rPr>
-          <m:t xml:space="preserve"> · </m:t>
+          <m:t xml:space="preserve"> </m:t>
+        </m:r>
+        <m:r>
+          <w:rPr>
+            <w:rFonts w:ascii="Cambria Math" w:hAnsi="Cambria Math"/>
+            <w:highlight w:val="yellow"/>
+          </w:rPr>
+          <m:t>·</m:t>
+        </m:r>
+        <m:r>
+          <w:rPr>
+            <w:rFonts w:ascii="Cambria Math" w:hAnsi="Cambria Math"/>
+          </w:rPr>
+          <m:t xml:space="preserve"> </m:t>
         </m:r>
         <m:bar>
           <m:barPr>
@@ -12225,7 +12175,20 @@
           <w:rPr>
             <w:rFonts w:ascii="Cambria Math" w:hAnsi="Cambria Math"/>
           </w:rPr>
-          <m:t xml:space="preserve"> · </m:t>
+          <m:t xml:space="preserve"> </m:t>
+        </m:r>
+        <m:r>
+          <w:rPr>
+            <w:rFonts w:ascii="Cambria Math" w:hAnsi="Cambria Math"/>
+            <w:highlight w:val="yellow"/>
+          </w:rPr>
+          <m:t>·</m:t>
+        </m:r>
+        <m:r>
+          <w:rPr>
+            <w:rFonts w:ascii="Cambria Math" w:hAnsi="Cambria Math"/>
+          </w:rPr>
+          <m:t xml:space="preserve"> </m:t>
         </m:r>
         <m:sSub>
           <m:sSubPr>
@@ -13800,14 +13763,7 @@
           <w:color w:val="000000"/>
           <w:sz w:val="28"/>
         </w:rPr>
-        <w:t>Функциональная схема DC1 содержит восемь трёхвходовых и шесть четырёхвходовых элементов И. Прямые и инверсные сигналы берутся с регистра D_Counter. В схеме рисунка 2.10 одинаковые названия цепей означают электрическое соединение; в</w:t>
-      </w:r>
-      <w:r>
-        <w:rPr>
-          <w:color w:val="000000"/>
-          <w:sz w:val="28"/>
-        </w:rPr>
-        <w:t>ыход каждого элемента является отдельным управляющим сигналом.</w:t>
+        <w:t>Функциональная схема DC1 содержит восемь трёхвходовых и шесть четырёхвходовых элементов И. Прямые и инверсные сигналы берутся с регистра D_Counter. В схеме рисунка 2.10 одинаковые названия цепей означают электрическое соединение; выход каждого элемента является отдельным управляющим сигналом.</w:t>
       </w:r>
     </w:p>
     <w:p>
@@ -13819,6 +13775,7 @@
         <w:jc w:val="center"/>
         <w:rPr>
           <w:sz w:val="28"/>
+          <w:lang w:val="en-US"/>
         </w:rPr>
       </w:pPr>
       <w:r>
@@ -13826,10 +13783,10 @@
           <w:noProof/>
         </w:rPr>
         <w:drawing>
-          <wp:inline distT="0" distB="0" distL="0" distR="0" wp14:anchorId="1AACFDAC" wp14:editId="798C7730">
-            <wp:extent cx="5940000" cy="4826250"/>
-            <wp:effectExtent l="0" t="0" r="0" b="0"/>
-            <wp:docPr id="918597017" name="Picture 918597017" descr="Рисунок 2.10 – Расчётная функциональная схема дешифратора DC1"/>
+          <wp:inline distT="0" distB="0" distL="0" distR="0" wp14:anchorId="6077A823" wp14:editId="55B9D533">
+            <wp:extent cx="5918624" cy="4576698"/>
+            <wp:effectExtent l="0" t="0" r="6350" b="0"/>
+            <wp:docPr id="10" name="Рисунок 10"/>
             <wp:cNvGraphicFramePr>
               <a:graphicFrameLocks xmlns:a="http://schemas.openxmlformats.org/drawingml/2006/main" noChangeAspect="1"/>
             </wp:cNvGraphicFramePr>
@@ -13837,7 +13794,7 @@
               <a:graphicData uri="http://schemas.openxmlformats.org/drawingml/2006/picture">
                 <pic:pic xmlns:pic="http://schemas.openxmlformats.org/drawingml/2006/picture">
                   <pic:nvPicPr>
-                    <pic:cNvPr id="0" name="fig_2_10_decoder_scheme.png"/>
+                    <pic:cNvPr id="1" name=""/>
                     <pic:cNvPicPr/>
                   </pic:nvPicPr>
                   <pic:blipFill>
@@ -13849,7 +13806,7 @@
                   <pic:spPr>
                     <a:xfrm>
                       <a:off x="0" y="0"/>
-                      <a:ext cx="5940000" cy="4826250"/>
+                      <a:ext cx="5924550" cy="4581281"/>
                     </a:xfrm>
                     <a:prstGeom prst="rect">
                       <a:avLst/>
@@ -13861,6 +13818,12 @@
           </wp:inline>
         </w:drawing>
       </w:r>
+      <w:r>
+        <w:rPr>
+          <w:sz w:val="28"/>
+        </w:rPr>
+        <w:t>ы</w:t>
+      </w:r>
     </w:p>
     <w:p>
       <w:pPr>
@@ -13877,7 +13840,6 @@
         <w:rPr>
           <w:color w:val="000000"/>
           <w:sz w:val="28"/>
-          <w:highlight w:val="yellow"/>
         </w:rPr>
         <w:t>Рисунок 2.10 – Расчётная функциональная схема дешифратора DC1</w:t>
       </w:r>
@@ -13904,22 +13866,7 @@
           <w:color w:val="000000"/>
           <w:sz w:val="28"/>
         </w:rPr>
-        <w:t>В NI Multisim трёхвходовые функции реализуются элементами AND3, четырёхвходовые — AND4. Для реализации на TTL допустимы три корпу</w:t>
-      </w:r>
-      <w:r>
-        <w:rPr>
-          <w:color w:val="000000"/>
-          <w:sz w:val="28"/>
-        </w:rPr>
-        <w:t xml:space="preserve">са 74LS11 и три корпуса 74LS21; один элемент 74LS11 останется свободным. Неиспользуемые входы необходимо подключить к определённому логическому </w:t>
-      </w:r>
-      <w:r>
-        <w:rPr>
-          <w:color w:val="000000"/>
-          <w:sz w:val="28"/>
-        </w:rPr>
-        <w:lastRenderedPageBreak/>
-        <w:t>уровню.</w:t>
+        <w:t>В NI Multisim трёхвходовые функции реализуются элементами AND3, четырёхвходовые — AND4. Для реализации на TTL допустимы три корпуса 74LS11 и три корпуса 74LS21; один элемент 74LS11 останется свободным. Неиспользуемые входы необходимо подключить к определённому логическому уровню.</w:t>
       </w:r>
     </w:p>
     <w:p/>
@@ -13959,21 +13906,7 @@
           <w:color w:val="000000"/>
           <w:sz w:val="28"/>
         </w:rPr>
-        <w:t xml:space="preserve">Для проверки </w:t>
-      </w:r>
-      <w:r>
-        <w:rPr>
-          <w:color w:val="000000"/>
-          <w:sz w:val="28"/>
-        </w:rPr>
-        <w:t>четырнадцати выходов DC1 достаточно одного логического анализатора XLA1. Число его информационных каналов равно 16. Сигналы Q3…Q0 контролируются отдельно по уже подключённому HEX-индикатору. Точная карта каналов приведена на рисунке 2.11; каждый горизонтал</w:t>
-      </w:r>
-      <w:r>
-        <w:rPr>
-          <w:color w:val="000000"/>
-          <w:sz w:val="28"/>
-        </w:rPr>
-        <w:t>ьный провод соответствует одному выходу.</w:t>
+        <w:t>Для проверки четырнадцати выходов DC1 достаточно одного логического анализатора XLA1. Число его информационных каналов равно 16. Сигналы Q3…Q0 контролируются отдельно по уже подключённому HEX-индикатору. Точная карта каналов приведена на рисунке 2.11; каждый горизонтальный провод соответствует одному выходу.</w:t>
       </w:r>
     </w:p>
     <w:p>
@@ -13992,10 +13925,10 @@
           <w:noProof/>
         </w:rPr>
         <w:drawing>
-          <wp:inline distT="0" distB="0" distL="0" distR="0" wp14:anchorId="1CC56620" wp14:editId="5BEB8C80">
-            <wp:extent cx="5760000" cy="4167529"/>
+          <wp:inline distT="0" distB="0" distL="0" distR="0" wp14:anchorId="75B391BA" wp14:editId="04EA7181">
+            <wp:extent cx="4752381" cy="2923809"/>
             <wp:effectExtent l="0" t="0" r="0" b="0"/>
-            <wp:docPr id="918597018" name="Picture 918597018" descr="Рисунок 2.11 – Расчётная схема подключения DC1 к одному логическому анализатору"/>
+            <wp:docPr id="15" name="Рисунок 15"/>
             <wp:cNvGraphicFramePr>
               <a:graphicFrameLocks xmlns:a="http://schemas.openxmlformats.org/drawingml/2006/main" noChangeAspect="1"/>
             </wp:cNvGraphicFramePr>
@@ -14003,7 +13936,7 @@
               <a:graphicData uri="http://schemas.openxmlformats.org/drawingml/2006/picture">
                 <pic:pic xmlns:pic="http://schemas.openxmlformats.org/drawingml/2006/picture">
                   <pic:nvPicPr>
-                    <pic:cNvPr id="0" name="fig_2_11.png"/>
+                    <pic:cNvPr id="1" name=""/>
                     <pic:cNvPicPr/>
                   </pic:nvPicPr>
                   <pic:blipFill>
@@ -14015,7 +13948,7 @@
                   <pic:spPr>
                     <a:xfrm>
                       <a:off x="0" y="0"/>
-                      <a:ext cx="5760000" cy="4167529"/>
+                      <a:ext cx="4752381" cy="2923809"/>
                     </a:xfrm>
                     <a:prstGeom prst="rect">
                       <a:avLst/>
@@ -14043,7 +13976,6 @@
         <w:rPr>
           <w:color w:val="000000"/>
           <w:sz w:val="28"/>
-          <w:highlight w:val="yellow"/>
         </w:rPr>
         <w:t>Рисунок 2.11 – Расчётная схема подключения DC1 к одному логическому анализатору</w:t>
       </w:r>
@@ -14070,22 +14002,7 @@
           <w:color w:val="000000"/>
           <w:sz w:val="28"/>
         </w:rPr>
-        <w:t>Вход C соединяется с тактовой цепью CLK; выбирается External (C). Каналы 15 и 16, входы Q и T не используются. Два прибора нужны толь</w:t>
-      </w:r>
-      <w:r>
-        <w:rPr>
-          <w:color w:val="000000"/>
-          <w:sz w:val="28"/>
-        </w:rPr>
-        <w:t xml:space="preserve">ко для </w:t>
-      </w:r>
-      <w:r>
-        <w:rPr>
-          <w:color w:val="000000"/>
-          <w:sz w:val="28"/>
-        </w:rPr>
-        <w:lastRenderedPageBreak/>
-        <w:t>одновременной записи всех 18 сигналов: четырёх Q и четырнадцати Y. В образце с десятью состояниями такая запись занимает 14 каналов, поэтому там достаточно одного XLA.</w:t>
+        <w:t>Вход C соединяется с тактовой цепью CLK; выбирается External (C). Каналы 15 и 16, входы Q и T не используются. Два прибора нужны только для одновременной записи всех 18 сигналов: четырёх Q и четырнадцати Y. В образце с десятью состояниями такая запись занимает 14 каналов, поэтому там достаточно одного XLA.</w:t>
       </w:r>
     </w:p>
     <w:p>
@@ -14103,14 +14020,15 @@
           <w:color w:val="000000"/>
           <w:sz w:val="28"/>
         </w:rPr>
-        <w:t>На рисунке 2.12 показан порядок активизации выходов в рабочих состояниях. Над д</w:t>
+        <w:t xml:space="preserve">На рисунке 2.12 показан порядок активизации выходов в рабочих состояниях. Над диаграммами указан шестнадцатеричный код HEX-индикатора; </w:t>
       </w:r>
       <w:r>
         <w:rPr>
           <w:color w:val="000000"/>
           <w:sz w:val="28"/>
         </w:rPr>
-        <w:t>иаграммами указан шестнадцатеричный код HEX-индикатора; это поясняющая строка, а не четыре дополнительных канала анализатора.</w:t>
+        <w:lastRenderedPageBreak/>
+        <w:t>это поясняющая строка, а не четыре дополнительных канала анализатора.</w:t>
       </w:r>
     </w:p>
     <w:p>
@@ -14131,15 +14049,27 @@
           <w:sz w:val="28"/>
         </w:rPr>
       </w:pPr>
-      <w:r>
-        <w:rPr>
-          <w:noProof/>
+    </w:p>
+    <w:p>
+      <w:pPr>
+        <w:keepNext/>
+        <w:keepLines/>
+        <w:spacing w:after="80"/>
+        <w:ind w:right="283"/>
+        <w:jc w:val="center"/>
+        <w:rPr>
+          <w:sz w:val="28"/>
+        </w:rPr>
+      </w:pPr>
+      <w:r>
+        <w:rPr>
+          <w:sz w:val="28"/>
         </w:rPr>
         <w:drawing>
-          <wp:inline distT="0" distB="0" distL="0" distR="0" wp14:anchorId="7679F126" wp14:editId="3F25392A">
-            <wp:extent cx="5940000" cy="3703765"/>
-            <wp:effectExtent l="0" t="0" r="0" b="0"/>
-            <wp:docPr id="918597019" name="Picture 918597019" descr="Рисунок 2.12 – Расчётные временные диаграммы четырнадцати выходов дешифратора"/>
+          <wp:inline distT="0" distB="0" distL="0" distR="0" wp14:anchorId="6B7F6608" wp14:editId="15EC0B47">
+            <wp:extent cx="4787265" cy="4165756"/>
+            <wp:effectExtent l="0" t="0" r="0" b="6350"/>
+            <wp:docPr id="16" name="Рисунок 16"/>
             <wp:cNvGraphicFramePr>
               <a:graphicFrameLocks xmlns:a="http://schemas.openxmlformats.org/drawingml/2006/main" noChangeAspect="1"/>
             </wp:cNvGraphicFramePr>
@@ -14147,7 +14077,7 @@
               <a:graphicData uri="http://schemas.openxmlformats.org/drawingml/2006/picture">
                 <pic:pic xmlns:pic="http://schemas.openxmlformats.org/drawingml/2006/picture">
                   <pic:nvPicPr>
-                    <pic:cNvPr id="0" name="fig_2_12.png"/>
+                    <pic:cNvPr id="1" name=""/>
                     <pic:cNvPicPr/>
                   </pic:nvPicPr>
                   <pic:blipFill>
@@ -14159,7 +14089,7 @@
                   <pic:spPr>
                     <a:xfrm>
                       <a:off x="0" y="0"/>
-                      <a:ext cx="5940000" cy="3703765"/>
+                      <a:ext cx="4794609" cy="4172146"/>
                     </a:xfrm>
                     <a:prstGeom prst="rect">
                       <a:avLst/>
@@ -14187,7 +14117,6 @@
         <w:rPr>
           <w:color w:val="000000"/>
           <w:sz w:val="28"/>
-          <w:highlight w:val="yellow"/>
         </w:rPr>
         <w:t>Рисунок 2.12 – Расчётные временные диаграммы четырнадцати выходов дешифратора</w:t>
       </w:r>
@@ -14214,14 +14143,7 @@
           <w:color w:val="000000"/>
           <w:sz w:val="28"/>
         </w:rPr>
-        <w:t xml:space="preserve">Последовательность выходов: Y13, Y2, Y14, Y11, </w:t>
-      </w:r>
-      <w:r>
-        <w:rPr>
-          <w:color w:val="000000"/>
-          <w:sz w:val="28"/>
-        </w:rPr>
-        <w:t>Y0, Y12, Y9, Y5, Y7, Y8, Y4, Y3, Y10, Y6. При работе с управляющим генератором раздела 2.3 счёт останавливается на 6, и Y6 сохраняет единицу. При отдельной проверке ПСУ свободным тактовым источником цикл может повторяться.</w:t>
+        <w:t>Последовательность выходов: Y13, Y2, Y14, Y11, Y0, Y12, Y9, Y5, Y7, Y8, Y4, Y3, Y10, Y6. При работе с управляющим генератором раздела 2.3 счёт останавливается на 6, и Y6 сохраняет единицу. При отдельной проверке ПСУ свободным тактовым источником цикл может повторяться.</w:t>
       </w:r>
     </w:p>
     <w:p>
@@ -14239,43 +14161,7 @@
           <w:color w:val="000000"/>
           <w:sz w:val="28"/>
         </w:rPr>
-        <w:t xml:space="preserve">На неиспользуемом коде 1 активны </w:t>
-      </w:r>
-      <w:r>
-        <w:rPr>
-          <w:color w:val="000000"/>
-          <w:sz w:val="28"/>
-        </w:rPr>
-        <w:t xml:space="preserve">Y0, Y3, Y5 и Y9; на коде 15 — Y7, Y11, Y13 и Y14. Это результат минимизации с факультативными наборами. Кратковременные выбросы при переключениях на расчётной диаграмме не </w:t>
-      </w:r>
-      <w:r>
-        <w:rPr>
-          <w:color w:val="000000"/>
-          <w:sz w:val="28"/>
-        </w:rPr>
-        <w:lastRenderedPageBreak/>
-        <w:t>изображены; унитарность проверяется после установления уровней. Фактическую запись X</w:t>
-      </w:r>
-      <w:r>
-        <w:rPr>
-          <w:color w:val="000000"/>
-          <w:sz w:val="28"/>
-        </w:rPr>
-        <w:t>LA необ</w:t>
-      </w:r>
-      <w:r>
-        <w:rPr>
-          <w:color w:val="000000"/>
-          <w:sz w:val="28"/>
-        </w:rPr>
-        <w:t>х</w:t>
-      </w:r>
-      <w:r>
-        <w:rPr>
-          <w:color w:val="000000"/>
-          <w:sz w:val="28"/>
-        </w:rPr>
-        <w:t xml:space="preserve">одимо получить в </w:t>
+        <w:t xml:space="preserve">На неиспользуемом коде 1 активны Y0, Y3, Y5 и Y9; на коде 15 — Y7, Y11, Y13 и Y14. Это результат минимизации с факультативными наборами. Кратковременные выбросы при переключениях на расчётной диаграмме не изображены; унитарность проверяется после установления уровней. Фактическую запись XLA необходимо получить в </w:t>
       </w:r>
       <w:proofErr w:type="spellStart"/>
       <w:r>
@@ -14311,6 +14197,7 @@
         <w:ind w:left="0" w:firstLine="851"/>
       </w:pPr>
       <w:r>
+        <w:lastRenderedPageBreak/>
         <w:t>2.3 Синтез управляющего генератора</w:t>
       </w:r>
     </w:p>
@@ -14381,14 +14268,7 @@
           <w:color w:val="000000"/>
           <w:sz w:val="28"/>
         </w:rPr>
-        <w:t>3. Запуск — отдельным сигналом START; авт</w:t>
-      </w:r>
-      <w:r>
-        <w:rPr>
-          <w:color w:val="000000"/>
-          <w:sz w:val="28"/>
-        </w:rPr>
-        <w:t>оматическая остановка после достижения состояния 6. Повторный запуск — после общей начальной установки 13.</w:t>
+        <w:t>3. Запуск — отдельным сигналом START; автоматическая остановка после достижения состояния 6. Повторный запуск — после общей начальной установки 13.</w:t>
       </w:r>
     </w:p>
     <w:p>
@@ -14445,14 +14325,7 @@
           <w:color w:val="000000"/>
           <w:sz w:val="28"/>
         </w:rPr>
-        <w:t>LM555 используется в астабильном режиме. Его выводы приведены на рисунке 2.13 по документации Te</w:t>
-      </w:r>
-      <w:r>
-        <w:rPr>
-          <w:color w:val="000000"/>
-          <w:sz w:val="28"/>
-        </w:rPr>
-        <w:t>xas Instruments. Низкий уровень /RESET принудительно устанавливает OUT в ноль и прекращает генерацию.</w:t>
+        <w:t>LM555 используется в астабильном режиме. Его выводы приведены на рисунке 2.13 по документации Texas Instruments. Низкий уровень /RESET принудительно устанавливает OUT в ноль и прекращает генерацию.</w:t>
       </w:r>
     </w:p>
     <w:p>
@@ -14556,22 +14429,7 @@
           <w:color w:val="000000"/>
           <w:sz w:val="28"/>
         </w:rPr>
-        <w:t xml:space="preserve">Пороговые уровни конденсатора составляют приблизительно 1/3 и 2/3 напряжения питания. Во время </w:t>
-      </w:r>
-      <w:r>
-        <w:rPr>
-          <w:color w:val="000000"/>
-          <w:sz w:val="28"/>
-        </w:rPr>
-        <w:t xml:space="preserve">заряда через R1 и R2 на OUT действует высокий </w:t>
-      </w:r>
-      <w:r>
-        <w:rPr>
-          <w:color w:val="000000"/>
-          <w:sz w:val="28"/>
-        </w:rPr>
-        <w:lastRenderedPageBreak/>
-        <w:t>уровень, а при разряде через R2 и вывод DISCH — низкий. Базовое включение показано на рисунке 2.14.</w:t>
+        <w:t>Пороговые уровни конденсатора составляют приблизительно 1/3 и 2/3 напряжения питания. Во время заряда через R1 и R2 на OUT действует высокий уровень, а при разряде через R2 и вывод DISCH — низкий. Базовое включение показано на рисунке 2.14.</w:t>
       </w:r>
     </w:p>
     <w:p>
@@ -14589,6 +14447,7 @@
         <w:rPr>
           <w:noProof/>
         </w:rPr>
+        <w:lastRenderedPageBreak/>
         <w:drawing>
           <wp:inline distT="0" distB="0" distL="0" distR="0" wp14:anchorId="1ECD00B7" wp14:editId="39A13EC1">
             <wp:extent cx="5580000" cy="2894625"/>
@@ -14686,14 +14545,7 @@
           <w:color w:val="000000"/>
           <w:sz w:val="28"/>
         </w:rPr>
-        <w:t>Выводы 2 TRIG и 6 THRESH соединены с C1. R1 вклю</w:t>
-      </w:r>
-      <w:r>
-        <w:rPr>
-          <w:color w:val="000000"/>
-          <w:sz w:val="28"/>
-        </w:rPr>
-        <w:t>чён между питанием и выводом 7; R2 — между выводом 7 и C1. Конденсатор C2 подавляет помехи по входу CTRL. Для первоначальной проверки /RESET соединяется с +5 В, а прямой выход OUT подаётся на канал A осциллографа.</w:t>
+        <w:t>Выводы 2 TRIG и 6 THRESH соединены с C1. R1 включён между питанием и выводом 7; R2 — между выводом 7 и C1. Конденсатор C2 подавляет помехи по входу CTRL. Для первоначальной проверки /RESET соединяется с +5 В, а прямой выход OUT подаётся на канал A осциллографа.</w:t>
       </w:r>
     </w:p>
     <w:p>
@@ -14765,15 +14617,7 @@
           <w:sz w:val="28"/>
           <w:highlight w:val="yellow"/>
         </w:rPr>
-        <w:t>Рисунок 2.15 – Расчётная схема первонача</w:t>
-      </w:r>
-      <w:r>
-        <w:rPr>
-          <w:color w:val="000000"/>
-          <w:sz w:val="28"/>
-          <w:highlight w:val="yellow"/>
-        </w:rPr>
-        <w:t>льной проверки прямого выхода LM555</w:t>
+        <w:t>Рисунок 2.15 – Расчётная схема первоначальной проверки прямого выхода LM555</w:t>
       </w:r>
     </w:p>
     <w:p>
@@ -14798,7 +14642,15 @@
           <w:color w:val="000000"/>
           <w:sz w:val="28"/>
         </w:rPr>
-        <w:t>Рисунок 2.15 задаёт подключения прибора, а не результат моделирования. До расчёта R1 и R2 их числовые значения не назначаются. Окончательная схема с номиналами приведена на рисунке 2.17.</w:t>
+        <w:t xml:space="preserve">Рисунок 2.15 задаёт подключения прибора, а не результат моделирования. </w:t>
+      </w:r>
+      <w:r>
+        <w:rPr>
+          <w:color w:val="000000"/>
+          <w:sz w:val="28"/>
+        </w:rPr>
+        <w:lastRenderedPageBreak/>
+        <w:t>До расчёта R1 и R2 их числовые значения не назначаются. Окончательная схема с номиналами приведена на рисунке 2.17.</w:t>
       </w:r>
     </w:p>
     <w:p>
@@ -14812,14 +14664,7 @@
           <w:color w:val="000000"/>
           <w:sz w:val="28"/>
         </w:rPr>
-        <w:t>По заданию длительность низкого</w:t>
-      </w:r>
-      <w:r>
-        <w:rPr>
-          <w:color w:val="000000"/>
-          <w:sz w:val="28"/>
-        </w:rPr>
-        <w:t xml:space="preserve"> уровня и коэффициент заполнения равны:</w:t>
+        <w:t>По заданию длительность низкого уровня и коэффициент заполнения равны:</w:t>
       </w:r>
     </w:p>
     <w:p>
@@ -14864,19 +14709,7 @@
           <w:rPr>
             <w:rFonts w:ascii="Cambria Math" w:hAnsi="Cambria Math"/>
           </w:rPr>
-          <m:t xml:space="preserve"> = </m:t>
-        </m:r>
-        <m:r>
-          <w:rPr>
-            <w:rFonts w:ascii="Cambria Math" w:hAnsi="Cambria Math"/>
-          </w:rPr>
-          <m:t>T</m:t>
-        </m:r>
-        <m:r>
-          <w:rPr>
-            <w:rFonts w:ascii="Cambria Math" w:hAnsi="Cambria Math"/>
-          </w:rPr>
-          <m:t xml:space="preserve"> - </m:t>
+          <m:t xml:space="preserve"> = T - </m:t>
         </m:r>
         <m:sSub>
           <m:sSubPr>
@@ -14936,13 +14769,7 @@
           <w:rPr>
             <w:rFonts w:ascii="Cambria Math" w:hAnsi="Cambria Math"/>
           </w:rPr>
-          <m:t>d</m:t>
-        </m:r>
-        <m:r>
-          <w:rPr>
-            <w:rFonts w:ascii="Cambria Math" w:hAnsi="Cambria Math"/>
-          </w:rPr>
-          <m:t xml:space="preserve"> = </m:t>
+          <m:t xml:space="preserve">d = </m:t>
         </m:r>
         <m:sSub>
           <m:sSubPr>
@@ -14973,19 +14800,7 @@
           <w:rPr>
             <w:rFonts w:ascii="Cambria Math" w:hAnsi="Cambria Math"/>
           </w:rPr>
-          <m:t xml:space="preserve"> / </m:t>
-        </m:r>
-        <m:r>
-          <w:rPr>
-            <w:rFonts w:ascii="Cambria Math" w:hAnsi="Cambria Math"/>
-          </w:rPr>
-          <m:t>T</m:t>
-        </m:r>
-        <m:r>
-          <w:rPr>
-            <w:rFonts w:ascii="Cambria Math" w:hAnsi="Cambria Math"/>
-          </w:rPr>
-          <m:t xml:space="preserve"> = 0,66 / 1,35 ≈ 48,89 %</m:t>
+          <m:t xml:space="preserve"> / T = 0,66 / 1,35 ≈ 48,89 %</m:t>
         </m:r>
       </m:oMath>
       <w:r>
@@ -15012,14 +14827,7 @@
           <w:color w:val="000000"/>
           <w:sz w:val="28"/>
         </w:rPr>
-        <w:t>У стандартного астабильного LM555 заполнение прямого выхода больше 50 %. Для требуемых 48,89 % необходим инвертор: в данн</w:t>
-      </w:r>
-      <w:r>
-        <w:rPr>
-          <w:color w:val="000000"/>
-          <w:sz w:val="28"/>
-        </w:rPr>
-        <w:t>ом варианте применяется 74LS04. В отличие от образца, параметры которого другие, исключать инвертор нельзя.</w:t>
+        <w:t>У стандартного астабильного LM555 заполнение прямого выхода больше 50 %. Для требуемых 48,89 % необходим инвертор: в данном варианте применяется 74LS04. В отличие от образца, параметры которого другие, исключать инвертор нельзя.</w:t>
       </w:r>
     </w:p>
     <w:p>
@@ -15123,14 +14931,7 @@
           <w:color w:val="000000"/>
           <w:sz w:val="28"/>
         </w:rPr>
-        <w:t xml:space="preserve">После инвертирования высокий уровень CLK соответствует разряду C1, </w:t>
-      </w:r>
-      <w:r>
-        <w:rPr>
-          <w:color w:val="000000"/>
-          <w:sz w:val="28"/>
-        </w:rPr>
-        <w:t>низкий — заряду. Для установившегося режима справедливы зависимости производителя (коэффициент 0,693 уточнён до ln 2):</w:t>
+        <w:t>После инвертирования высокий уровень CLK соответствует разряду C1, низкий — заряду. Для установившегося режима справедливы зависимости производителя (коэффициент 0,693 уточнён до ln 2):</w:t>
       </w:r>
     </w:p>
     <w:p>
@@ -15175,19 +14976,7 @@
           <w:rPr>
             <w:rFonts w:ascii="Cambria Math" w:hAnsi="Cambria Math"/>
           </w:rPr>
-          <m:t xml:space="preserve"> = </m:t>
-        </m:r>
-        <m:r>
-          <w:rPr>
-            <w:rFonts w:ascii="Cambria Math" w:hAnsi="Cambria Math"/>
-          </w:rPr>
-          <m:t>ln</m:t>
-        </m:r>
-        <m:r>
-          <w:rPr>
-            <w:rFonts w:ascii="Cambria Math" w:hAnsi="Cambria Math"/>
-          </w:rPr>
-          <m:t xml:space="preserve"> 2 · </m:t>
+          <m:t xml:space="preserve"> = ln 2 · </m:t>
         </m:r>
         <m:sSub>
           <m:sSubPr>
@@ -15297,19 +15086,7 @@
           <w:rPr>
             <w:rFonts w:ascii="Cambria Math" w:hAnsi="Cambria Math"/>
           </w:rPr>
-          <m:t xml:space="preserve"> = </m:t>
-        </m:r>
-        <m:r>
-          <w:rPr>
-            <w:rFonts w:ascii="Cambria Math" w:hAnsi="Cambria Math"/>
-          </w:rPr>
-          <m:t>ln</m:t>
-        </m:r>
-        <m:r>
-          <w:rPr>
-            <w:rFonts w:ascii="Cambria Math" w:hAnsi="Cambria Math"/>
-          </w:rPr>
-          <m:t xml:space="preserve"> 2 · (</m:t>
+          <m:t xml:space="preserve"> = ln 2 · (</m:t>
         </m:r>
         <m:sSub>
           <m:sSubPr>
@@ -15425,25 +15202,7 @@
           <w:rPr>
             <w:rFonts w:ascii="Cambria Math" w:hAnsi="Cambria Math"/>
           </w:rPr>
-          <m:t>T</m:t>
-        </m:r>
-        <m:r>
-          <w:rPr>
-            <w:rFonts w:ascii="Cambria Math" w:hAnsi="Cambria Math"/>
-          </w:rPr>
-          <m:t xml:space="preserve"> = </m:t>
-        </m:r>
-        <m:r>
-          <w:rPr>
-            <w:rFonts w:ascii="Cambria Math" w:hAnsi="Cambria Math"/>
-          </w:rPr>
-          <m:t>ln</m:t>
-        </m:r>
-        <m:r>
-          <w:rPr>
-            <w:rFonts w:ascii="Cambria Math" w:hAnsi="Cambria Math"/>
-          </w:rPr>
-          <m:t xml:space="preserve"> 2 · (</m:t>
+          <m:t>T = ln 2 · (</m:t>
         </m:r>
         <m:sSub>
           <m:sSubPr>
@@ -15552,7 +15311,6 @@
         <w:ind w:right="283"/>
       </w:pPr>
       <w:r>
-        <w:lastRenderedPageBreak/>
         <w:tab/>
       </w:r>
       <m:oMath>
@@ -15560,31 +15318,7 @@
           <w:rPr>
             <w:rFonts w:ascii="Cambria Math" w:hAnsi="Cambria Math"/>
           </w:rPr>
-          <m:t>f</m:t>
-        </m:r>
-        <m:r>
-          <w:rPr>
-            <w:rFonts w:ascii="Cambria Math" w:hAnsi="Cambria Math"/>
-          </w:rPr>
-          <m:t xml:space="preserve"> = 1 / </m:t>
-        </m:r>
-        <m:r>
-          <w:rPr>
-            <w:rFonts w:ascii="Cambria Math" w:hAnsi="Cambria Math"/>
-          </w:rPr>
-          <m:t>T</m:t>
-        </m:r>
-        <m:r>
-          <w:rPr>
-            <w:rFonts w:ascii="Cambria Math" w:hAnsi="Cambria Math"/>
-          </w:rPr>
-          <m:t xml:space="preserve"> = 1 / 1</m:t>
-        </m:r>
-        <m:r>
-          <w:rPr>
-            <w:rFonts w:ascii="Cambria Math" w:hAnsi="Cambria Math"/>
-          </w:rPr>
-          <m:t>,35 ≈ 0,74074 Гц</m:t>
+          <m:t>f = 1 / T = 1 / 1,35 ≈ 0,74074 Гц</m:t>
         </m:r>
       </m:oMath>
       <w:r>
@@ -15630,6 +15364,7 @@
         <w:ind w:right="283"/>
       </w:pPr>
       <w:r>
+        <w:lastRenderedPageBreak/>
         <w:tab/>
       </w:r>
       <m:oMath>
@@ -15662,19 +15397,7 @@
           <w:rPr>
             <w:rFonts w:ascii="Cambria Math" w:hAnsi="Cambria Math"/>
           </w:rPr>
-          <m:t xml:space="preserve"> = 0,66 / (</m:t>
-        </m:r>
-        <m:r>
-          <w:rPr>
-            <w:rFonts w:ascii="Cambria Math" w:hAnsi="Cambria Math"/>
-          </w:rPr>
-          <m:t>ln</m:t>
-        </m:r>
-        <m:r>
-          <w:rPr>
-            <w:rFonts w:ascii="Cambria Math" w:hAnsi="Cambria Math"/>
-          </w:rPr>
-          <m:t xml:space="preserve"> 2 · 10⁻⁵) ≈ 95 217,87 Ом</m:t>
+          <m:t xml:space="preserve"> = 0,66 / (ln 2 · 10⁻⁵) ≈ 95 217,87 Ом</m:t>
         </m:r>
       </m:oMath>
       <w:r>
@@ -15728,19 +15451,7 @@
           <w:rPr>
             <w:rFonts w:ascii="Cambria Math" w:hAnsi="Cambria Math"/>
           </w:rPr>
-          <m:t xml:space="preserve"> = (0,69 - 0,66) / (</m:t>
-        </m:r>
-        <m:r>
-          <w:rPr>
-            <w:rFonts w:ascii="Cambria Math" w:hAnsi="Cambria Math"/>
-          </w:rPr>
-          <m:t>ln</m:t>
-        </m:r>
-        <m:r>
-          <w:rPr>
-            <w:rFonts w:ascii="Cambria Math" w:hAnsi="Cambria Math"/>
-          </w:rPr>
-          <m:t xml:space="preserve"> 2 · 10⁻⁵) ≈ 4 328,09 Ом</m:t>
+          <m:t xml:space="preserve"> = (0,69 - 0,66) / (ln 2 · 10⁻⁵) ≈ 4 328,09 Ом</m:t>
         </m:r>
       </m:oMath>
       <w:r>
@@ -15767,14 +15478,7 @@
           <w:color w:val="000000"/>
           <w:sz w:val="28"/>
         </w:rPr>
-        <w:t xml:space="preserve">Выбираем ближайшие номиналы E96: R1 = 4,32 кОм; R2 = </w:t>
-      </w:r>
-      <w:r>
-        <w:rPr>
-          <w:color w:val="000000"/>
-          <w:sz w:val="28"/>
-        </w:rPr>
-        <w:t>95,3 кОм. Полная схема с защитными и развязывающими конденсаторами показана на рисунке 2.17.</w:t>
+        <w:t>Выбираем ближайшие номиналы E96: R1 = 4,32 кОм; R2 = 95,3 кОм. Полная схема с защитными и развязывающими конденсаторами показана на рисунке 2.17.</w:t>
       </w:r>
     </w:p>
     <w:p>
@@ -15878,14 +15582,7 @@
           <w:color w:val="000000"/>
           <w:sz w:val="28"/>
         </w:rPr>
-        <w:t xml:space="preserve">При проверке только времязадающей части RUN временно заменяется постоянным уровнем </w:t>
-      </w:r>
-      <w:r>
-        <w:rPr>
-          <w:color w:val="000000"/>
-          <w:sz w:val="28"/>
-        </w:rPr>
-        <w:t>+5 В. В составе устройства на вход /RESET подаётся выход триггера разрешения. Все точки GND объединяются; названия цепей на рисунках являются электрическими метками, а не отдельными источниками.</w:t>
+        <w:t>При проверке только времязадающей части RUN временно заменяется постоянным уровнем +5 В. В составе устройства на вход /RESET подаётся выход триггера разрешения. Все точки GND объединяются; названия цепей на рисунках являются электрическими метками, а не отдельными источниками.</w:t>
       </w:r>
     </w:p>
     <w:p>
@@ -16029,6 +15726,7 @@
           <w:color w:val="000000"/>
           <w:sz w:val="28"/>
         </w:rPr>
+        <w:lastRenderedPageBreak/>
         <w:t>Таблица 2.1 – Расчётные временные параметры генератора</w:t>
       </w:r>
     </w:p>
@@ -16071,15 +15769,7 @@
                 <w:color w:val="000000"/>
                 <w:sz w:val="24"/>
               </w:rPr>
-              <w:t>Пара</w:t>
-            </w:r>
-            <w:r>
-              <w:rPr>
-                <w:b/>
-                <w:color w:val="000000"/>
-                <w:sz w:val="24"/>
-              </w:rPr>
-              <w:t>метр</w:t>
+              <w:t>Параметр</w:t>
             </w:r>
           </w:p>
         </w:tc>
@@ -16446,14 +16136,7 @@
           <w:color w:val="000000"/>
           <w:sz w:val="28"/>
         </w:rPr>
-        <w:t xml:space="preserve">Погрешность округления номиналов меньше 0,09 %. Это не полная </w:t>
-      </w:r>
-      <w:r>
-        <w:rPr>
-          <w:color w:val="000000"/>
-          <w:sz w:val="28"/>
-        </w:rPr>
-        <w:t>погрешность устройства: допуски резисторов, ёмкость и утечки C1, пороги и разрядный транзистор LM555 также влияют на результат. При R ±1 % и C ±10 % только произведение RC меняется от 0,891 до 1,111 номинала.</w:t>
+        <w:t>Погрешность округления номиналов меньше 0,09 %. Это не полная погрешность устройства: допуски резисторов, ёмкость и утечки C1, пороги и разрядный транзистор LM555 также влияют на результат. При R ±1 % и C ±10 % только произведение RC меняется от 0,891 до 1,111 номинала.</w:t>
       </w:r>
     </w:p>
     <w:p>
@@ -16514,15 +16197,7 @@
                 <w:color w:val="000000"/>
                 <w:sz w:val="24"/>
               </w:rPr>
-              <w:t>Элеме</w:t>
-            </w:r>
-            <w:r>
-              <w:rPr>
-                <w:b/>
-                <w:color w:val="000000"/>
-                <w:sz w:val="24"/>
-              </w:rPr>
-              <w:t>нт или вывод</w:t>
+              <w:t>Элемент или вывод</w:t>
             </w:r>
           </w:p>
         </w:tc>
@@ -17010,14 +16685,7 @@
           <w:color w:val="000000"/>
           <w:sz w:val="28"/>
         </w:rPr>
-        <w:t xml:space="preserve">При RUN = 0 таймер удерживает OUT = 0, поэтому CLK </w:t>
-      </w:r>
-      <w:r>
-        <w:rPr>
-          <w:color w:val="000000"/>
-          <w:sz w:val="28"/>
-        </w:rPr>
-        <w:t>после инвертора равен 1. Нельзя останавливать таймер произвольным асинхронным сигналом при CLK = 0: это создаст лишний положительный фронт.</w:t>
+        <w:t>При RUN = 0 таймер удерживает OUT = 0, поэтому CLK после инвертора равен 1. Нельзя останавливать таймер произвольным асинхронным сигналом при CLK = 0: это создаст лишний положительный фронт.</w:t>
       </w:r>
     </w:p>
     <w:p>
@@ -17031,7 +16699,7 @@
           <w:color w:val="000000"/>
           <w:sz w:val="28"/>
         </w:rPr>
-        <w:t xml:space="preserve">Для остановки на последнем состоянии введён блок STOP_UNIT (рисунок </w:t>
+        <w:t xml:space="preserve">Для остановки на последнем состоянии введён блок STOP_UNIT (рисунок 2.18). Прямой комбинационный детектор кода 6 мог бы реагировать на </w:t>
       </w:r>
       <w:r>
         <w:rPr>
@@ -17039,14 +16707,7 @@
           <w:sz w:val="28"/>
         </w:rPr>
         <w:lastRenderedPageBreak/>
-        <w:t>2.18). Прямой комбинационный детектор кода 6 м</w:t>
-      </w:r>
-      <w:r>
-        <w:rPr>
-          <w:color w:val="000000"/>
-          <w:sz w:val="28"/>
-        </w:rPr>
-        <w:t>ог бы реагировать на кратковременные переходные коды. Поэтому сигнал остановки регистрируется отдельным D-триггером на фронте, переводящем ПСУ из 10 в 6.</w:t>
+        <w:t>кратковременные переходные коды. Поэтому сигнал остановки регистрируется отдельным D-триггером на фронте, переводящем ПСУ из 10 в 6.</w:t>
       </w:r>
     </w:p>
     <w:p>
@@ -17328,15 +16989,7 @@
           <w:sz w:val="28"/>
           <w:highlight w:val="yellow"/>
         </w:rPr>
-        <w:t>Рисунок 2.18 – Расчётная схема блока STOP_UNIT с регистрацией с</w:t>
-      </w:r>
-      <w:r>
-        <w:rPr>
-          <w:color w:val="000000"/>
-          <w:sz w:val="28"/>
-          <w:highlight w:val="yellow"/>
-        </w:rPr>
-        <w:t>игнала остановки</w:t>
+        <w:t>Рисунок 2.18 – Расчётная схема блока STOP_UNIT с регистрацией сигнала остановки</w:t>
       </w:r>
     </w:p>
     <w:p>
@@ -17361,14 +17014,7 @@
           <w:color w:val="000000"/>
           <w:sz w:val="28"/>
         </w:rPr>
-        <w:t xml:space="preserve">Код 10 распознаётся точно, без факультативных наборов. E10 подаётся на D секции B дополнительной микросхемы 74AS74; её CLK соединён с CLK ПСУ. До фронта код 10 уже установился, поэтому на этом фронте ПСУ принимает 6, а секция B записывает </w:t>
-      </w:r>
-      <w:r>
-        <w:rPr>
-          <w:color w:val="000000"/>
-          <w:sz w:val="28"/>
-        </w:rPr>
-        <w:t>STOP = 1. Задержки распространения элементов не меняют выборку установившегося предшествующего кода.</w:t>
+        <w:t>Код 10 распознаётся точно, без факультативных наборов. E10 подаётся на D секции B дополнительной микросхемы 74AS74; её CLK соединён с CLK ПСУ. До фронта код 10 уже установился, поэтому на этом фронте ПСУ принимает 6, а секция B записывает STOP = 1. Задержки распространения элементов не меняют выборку установившегося предшествующего кода.</w:t>
       </w:r>
     </w:p>
     <w:p>
@@ -17382,14 +17028,7 @@
           <w:color w:val="000000"/>
           <w:sz w:val="28"/>
         </w:rPr>
-        <w:t>Инверсный выход NOT_STOP снимает разрешение RUN. В этот момент CLK уже высокий, а OUT таймера низкий, поэтому сброс LM555 сохраняет текущий уровень и не со</w:t>
-      </w:r>
-      <w:r>
-        <w:rPr>
-          <w:color w:val="000000"/>
-          <w:sz w:val="28"/>
-        </w:rPr>
-        <w:t>здаёт дополнительного фронта. STOP удерживается до P_RES = 0. Переход 6 → 13 в логике ПСУ остаётся, но в режиме автоматической остановки такт для него не поступает.</w:t>
+        <w:t>Инверсный выход NOT_STOP снимает разрешение RUN. В этот момент CLK уже высокий, а OUT таймера низкий, поэтому сброс LM555 сохраняет текущий уровень и не создаёт дополнительного фронта. STOP удерживается до P_RES = 0. Переход 6 → 13 в логике ПСУ остаётся, но в режиме автоматической остановки такт для него не поступает.</w:t>
       </w:r>
     </w:p>
     <w:p>
@@ -17407,7 +17046,7 @@
           <w:color w:val="000000"/>
           <w:sz w:val="28"/>
         </w:rPr>
-        <w:t xml:space="preserve">P_RES_GEN формирует активную нулём начальную установку (рисунок </w:t>
+        <w:t xml:space="preserve">P_RES_GEN формирует активную нулём начальную установку (рисунок 2.19). RC-цепь дополнена двумя инверторами Шмитта 74HC14 и буфером 74LS07 </w:t>
       </w:r>
       <w:r>
         <w:rPr>
@@ -17415,21 +17054,7 @@
           <w:sz w:val="28"/>
         </w:rPr>
         <w:lastRenderedPageBreak/>
-        <w:t xml:space="preserve">2.19). RC-цепь дополнена </w:t>
-      </w:r>
-      <w:r>
-        <w:rPr>
-          <w:color w:val="000000"/>
-          <w:sz w:val="28"/>
-        </w:rPr>
-        <w:t>двумя инверторами Шмитта 74HC14 и буфером 74LS07 с открытым коллектором (OC). Буфер обеспечивает ток сброса нескольких 74AS74; R4 подтягивает P_RES к +5 В. При C4 = 0 В действует сброс; после заряда он снимается. R3C4 = 0,1 с, но длительность импульса зави</w:t>
-      </w:r>
-      <w:r>
-        <w:rPr>
-          <w:color w:val="000000"/>
-          <w:sz w:val="28"/>
-        </w:rPr>
-        <w:t xml:space="preserve">сит от порога </w:t>
+        <w:t xml:space="preserve">с открытым коллектором (OC). Буфер обеспечивает ток сброса нескольких 74AS74; R4 подтягивает P_RES к +5 В. При C4 = 0 В действует сброс; после заряда он снимается. R3C4 = 0,1 с, но длительность импульса зависит от порога </w:t>
       </w:r>
       <w:proofErr w:type="spellStart"/>
       <w:r>
@@ -17549,14 +17174,7 @@
           <w:color w:val="000000"/>
           <w:sz w:val="28"/>
         </w:rPr>
-        <w:t>При P_RES = 0 устанавливаются Q3Q2Q1Q0 = 1101, STOP = 0 и RUN = 0. Для единичных разрядов Q3, Q2, Q0 общий сигнал подаётся на /PRE, а /CLR удерживается в еди</w:t>
-      </w:r>
-      <w:r>
-        <w:rPr>
-          <w:color w:val="000000"/>
-          <w:sz w:val="28"/>
-        </w:rPr>
-        <w:t>нице. Для Q1 он подаётся на /CLR, а /PRE удерживается в единице. Одновременный ноль на /PRE и /CLR одного триггера недопустим.</w:t>
+        <w:t>При P_RES = 0 устанавливаются Q3Q2Q1Q0 = 1101, STOP = 0 и RUN = 0. Для единичных разрядов Q3, Q2, Q0 общий сигнал подаётся на /PRE, а /CLR удерживается в единице. Для Q1 он подаётся на /CLR, а /PRE удерживается в единице. Одновременный ноль на /PRE и /CLR одного триггера недопустим.</w:t>
       </w:r>
     </w:p>
     <w:p>
@@ -17570,14 +17188,7 @@
           <w:color w:val="000000"/>
           <w:sz w:val="28"/>
         </w:rPr>
-        <w:t>P_RES также подаётся на /CLR секции B и через AND2 с NOT_STOP — на /CLR секции A. Для запуска: START = 0; дождаться P_RES = 1; по</w:t>
-      </w:r>
-      <w:r>
-        <w:rPr>
-          <w:color w:val="000000"/>
-          <w:sz w:val="28"/>
-        </w:rPr>
-        <w:t>дать START: 0 → 1 → 0. Для повторного цикла замкнуть S_RST не менее чем на 5 с, чтобы разрядился и времязадающий C1, затем разомкнуть, дождаться P_RES = 1 и повторить START.</w:t>
+        <w:t>P_RES также подаётся на /CLR секции B и через AND2 с NOT_STOP — на /CLR секции A. Для запуска: START = 0; дождаться P_RES = 1; подать START: 0 → 1 → 0. Для повторного цикла замкнуть S_RST не менее чем на 5 с, чтобы разрядился и времязадающий C1, затем разомкнуть, дождаться P_RES = 1 и повторить START.</w:t>
       </w:r>
     </w:p>
     <w:p>
@@ -17591,22 +17202,7 @@
           <w:color w:val="000000"/>
           <w:sz w:val="28"/>
         </w:rPr>
-        <w:t>В Multisim задать C4: IC = 0 В и проверить импульс P_RES; прежний цифровой источни</w:t>
-      </w:r>
-      <w:r>
-        <w:rPr>
-          <w:color w:val="000000"/>
-          <w:sz w:val="28"/>
-        </w:rPr>
-        <w:t xml:space="preserve">к отключить. Для физического устройства отдельно проверить </w:t>
-      </w:r>
-      <w:r>
-        <w:rPr>
-          <w:color w:val="000000"/>
-          <w:sz w:val="28"/>
-        </w:rPr>
-        <w:lastRenderedPageBreak/>
-        <w:t>нарастание питания и дребезг кнопок.</w:t>
+        <w:t>В Multisim задать C4: IC = 0 В и проверить импульс P_RES; прежний цифровой источник отключить. Для физического устройства отдельно проверить нарастание питания и дребезг кнопок.</w:t>
       </w:r>
     </w:p>
     <w:p>
@@ -17624,14 +17220,8 @@
           <w:color w:val="000000"/>
           <w:sz w:val="28"/>
         </w:rPr>
-        <w:t>Секция A дополнительного 74AS74 хранит RUN: D = 1, /PRE = 1, CLK = START. Её активный нулём сброс равен P_RES AND NOT_STOP. На рисунке 2.20 объединены таймер, т</w:t>
-      </w:r>
-      <w:r>
-        <w:rPr>
-          <w:color w:val="000000"/>
-          <w:sz w:val="28"/>
-        </w:rPr>
-        <w:t>риггеры управления и ПСУ.</w:t>
+        <w:lastRenderedPageBreak/>
+        <w:t>Секция A дополнительного 74AS74 хранит RUN: D = 1, /PRE = 1, CLK = START. Её активный нулём сброс равен P_RES AND NOT_STOP. На рисунке 2.20 объединены таймер, триггеры управления и ПСУ.</w:t>
       </w:r>
     </w:p>
     <w:p>
@@ -17657,6 +17247,7 @@
       </w:pPr>
       <w:r>
         <w:rPr>
+          <w:noProof/>
           <w:sz w:val="28"/>
         </w:rPr>
         <w:drawing>
@@ -17738,14 +17329,7 @@
           <w:color w:val="000000"/>
           <w:sz w:val="28"/>
         </w:rPr>
-        <w:t xml:space="preserve">При START ↑ после снятого сброса RUN становится равным 1. Сначала OUT таймера повышается, а CLK падает; ПСУ на отрицательном фронте не </w:t>
-      </w:r>
-      <w:r>
-        <w:rPr>
-          <w:color w:val="000000"/>
-          <w:sz w:val="28"/>
-        </w:rPr>
-        <w:t>переключается. При начальном C1 = 0 В задержка первого положительного фронта составляет ln 3 · (R1 + R2) · C1 ≈ 1,0944 с. Период 1,3511 с относится к последующим фронтам.</w:t>
+        <w:t>При START ↑ после снятого сброса RUN становится равным 1. Сначала OUT таймера повышается, а CLK падает; ПСУ на отрицательном фронте не переключается. При начальном C1 = 0 В задержка первого положительного фронта составляет ln 3 · (R1 + R2) · C1 ≈ 1,0944 с. Период 1,3511 с относится к последующим фронтам.</w:t>
       </w:r>
     </w:p>
     <w:p>
@@ -17759,14 +17343,7 @@
           <w:color w:val="000000"/>
           <w:sz w:val="28"/>
         </w:rPr>
-        <w:t>На тринадцатом положительном фронте после запуска выполняется переход 10 → 6 и снимае</w:t>
-      </w:r>
-      <w:r>
-        <w:rPr>
-          <w:color w:val="000000"/>
-          <w:sz w:val="28"/>
-        </w:rPr>
-        <w:t>тся RUN. Дальнейшие фронты отсутствуют; HEX показывает 6, активен Y6. Повторный START без P_RES не запускает генератор, поскольку STOP остаётся единицей. U_CTRL:A и U_CTRL:B занимают обе секции одного дополнительного корпуса 74AS74.</w:t>
+        <w:t>На тринадцатом положительном фронте после запуска выполняется переход 10 → 6 и снимается RUN. Дальнейшие фронты отсутствуют; HEX показывает 6, активен Y6. Повторный START без P_RES не запускает генератор, поскольку STOP остаётся единицей. U_CTRL:A и U_CTRL:B занимают обе секции одного дополнительного корпуса 74AS74.</w:t>
       </w:r>
     </w:p>
     <w:p>
@@ -17782,13 +17359,7 @@
           <w:color w:val="000000"/>
         </w:rPr>
         <w:lastRenderedPageBreak/>
-        <w:t>2.3.3 Временные диаграм</w:t>
-      </w:r>
-      <w:r>
-        <w:rPr>
-          <w:color w:val="000000"/>
-        </w:rPr>
-        <w:t>мы выходного сигнала таймера и D-триггера</w:t>
+        <w:t>2.3.3 Временные диаграммы выходного сигнала таймера и D-триггера</w:t>
       </w:r>
     </w:p>
     <w:p>
@@ -17806,14 +17377,7 @@
           <w:color w:val="000000"/>
           <w:sz w:val="28"/>
         </w:rPr>
-        <w:t xml:space="preserve">Для измерений применяется один двухканальный осциллограф XSC1 (рисунок 2.21). Канал A подключается к выходу CLK после инвертора, канал B — к RUN. Для дополнительной проверки инверсии вход B+ временно переносится с </w:t>
-      </w:r>
-      <w:r>
-        <w:rPr>
-          <w:color w:val="000000"/>
-          <w:sz w:val="28"/>
-        </w:rPr>
-        <w:t>RUN на OUT таймера; выходы RUN и OUT между собой не соединяются.</w:t>
+        <w:t>Для измерений применяется один двухканальный осциллограф XSC1 (рисунок 2.21). Канал A подключается к выходу CLK после инвертора, канал B — к RUN. Для дополнительной проверки инверсии вход B+ временно переносится с RUN на OUT таймера; выходы RUN и OUT между собой не соединяются.</w:t>
       </w:r>
     </w:p>
     <w:p>
@@ -17917,14 +17481,7 @@
           <w:color w:val="000000"/>
           <w:sz w:val="28"/>
         </w:rPr>
-        <w:t>Рекомендуемая начальная временная база — 0,5 с/деление. После появления нескольких импульсов моделирова</w:t>
-      </w:r>
-      <w:r>
-        <w:rPr>
-          <w:color w:val="000000"/>
-          <w:sz w:val="28"/>
-        </w:rPr>
-        <w:t>ние приостанавливается. Первую задержку запуска не следует использовать как измерение установившегося периода. На следующих рисунках показаны расчётные ориентиры для курсоров, а не результаты моделирования в Multisim.</w:t>
+        <w:t>Рекомендуемая начальная временная база — 0,5 с/деление. После появления нескольких импульсов моделирование приостанавливается. Первую задержку запуска не следует использовать как измерение установившегося периода. На следующих рисунках показаны расчётные ориентиры для курсоров, а не результаты моделирования в Multisim.</w:t>
       </w:r>
     </w:p>
     <w:p>
@@ -17938,21 +17495,7 @@
           <w:color w:val="000000"/>
           <w:sz w:val="28"/>
         </w:rPr>
-        <w:t>Проверка остановки выполняется отдельн</w:t>
-      </w:r>
-      <w:r>
-        <w:rPr>
-          <w:color w:val="000000"/>
-          <w:sz w:val="28"/>
-        </w:rPr>
-        <w:t>о: после 13 положительных фронтов относительно начального кода 13 должны наблюдаться HEX = 6, Y6 = 1, STOP = 1, RUN = 0 и неизменный CLK = 1. Необходимо также проверить отсутствие самопроизвольной остановки при переходе 7 → 8 и невозможность повторного зап</w:t>
-      </w:r>
-      <w:r>
-        <w:rPr>
-          <w:color w:val="000000"/>
-          <w:sz w:val="28"/>
-        </w:rPr>
-        <w:t>уска без общей начальной установки.</w:t>
+        <w:t>Проверка остановки выполняется отдельно: после 13 положительных фронтов относительно начального кода 13 должны наблюдаться HEX = 6, Y6 = 1, STOP = 1, RUN = 0 и неизменный CLK = 1. Необходимо также проверить отсутствие самопроизвольной остановки при переходе 7 → 8 и невозможность повторного запуска без общей начальной установки.</w:t>
       </w:r>
     </w:p>
     <w:p>
@@ -17971,14 +17514,7 @@
           <w:sz w:val="28"/>
         </w:rPr>
         <w:lastRenderedPageBreak/>
-        <w:t>Для измерения длительности высокого уровня курсор T1 устанавливается на положительный фронт CLK, T2 — на следующий отрицательный фронт. На рисунке 2.22 начало относительного отсчёта совмещено с установившимся положител</w:t>
-      </w:r>
-      <w:r>
-        <w:rPr>
-          <w:color w:val="000000"/>
-          <w:sz w:val="28"/>
-        </w:rPr>
-        <w:t>ьным фронтом; курсоры в реальной записи будут иметь другое абсолютное время.</w:t>
+        <w:t>Для измерения длительности высокого уровня курсор T1 устанавливается на положительный фронт CLK, T2 — на следующий отрицательный фронт. На рисунке 2.22 начало относительного отсчёта совмещено с установившимся положительным фронтом; курсоры в реальной записи будут иметь другое абсолютное время.</w:t>
       </w:r>
     </w:p>
     <w:p>
@@ -18082,14 +17618,7 @@
           <w:color w:val="000000"/>
           <w:sz w:val="28"/>
         </w:rPr>
-        <w:t>Ожидаемая разность T2 − T1 ≈ 0,660569 с. Заданная длительность 0,66 с соблюдается с погрешностью округлени</w:t>
-      </w:r>
-      <w:r>
-        <w:rPr>
-          <w:color w:val="000000"/>
-          <w:sz w:val="28"/>
-        </w:rPr>
-        <w:t>я около +0,0863 %. RUN во время этих импульсов должен сохранять единицу. Амплитуды нарисованы как условные логические уровни, а не гарантированные аналоговые напряжения TTL.</w:t>
+        <w:t>Ожидаемая разность T2 − T1 ≈ 0,660569 с. Заданная длительность 0,66 с соблюдается с погрешностью округления около +0,0863 %. RUN во время этих импульсов должен сохранять единицу. Амплитуды нарисованы как условные логические уровни, а не гарантированные аналоговые напряжения TTL.</w:t>
       </w:r>
     </w:p>
     <w:p>
@@ -18103,14 +17632,7 @@
           <w:color w:val="000000"/>
           <w:sz w:val="28"/>
         </w:rPr>
-        <w:t>Для отчёта эту иллюстрацию следует заменить собственным снимком XSC1 с видимыми ку</w:t>
-      </w:r>
-      <w:r>
-        <w:rPr>
-          <w:color w:val="000000"/>
-          <w:sz w:val="28"/>
-        </w:rPr>
-        <w:t>рсорами и полем разности времени. Если измеренная длительность заметно отличается, сначала проверяется точка CLK после инвертора, затем номиналы R2 и C1. Одного визуального сходства формы сигнала недостаточно.</w:t>
+        <w:t>Для отчёта эту иллюстрацию следует заменить собственным снимком XSC1 с видимыми курсорами и полем разности времени. Если измеренная длительность заметно отличается, сначала проверяется точка CLK после инвертора, затем номиналы R2 и C1. Одного визуального сходства формы сигнала недостаточно.</w:t>
       </w:r>
     </w:p>
     <w:p>
@@ -18130,14 +17652,7 @@
           <w:color w:val="000000"/>
           <w:sz w:val="28"/>
         </w:rPr>
-        <w:t xml:space="preserve">Для измерения периода курсор T1 остаётся на </w:t>
-      </w:r>
-      <w:r>
-        <w:rPr>
-          <w:color w:val="000000"/>
-          <w:sz w:val="28"/>
-        </w:rPr>
-        <w:t>положительном фронте CLK, T2 переносится на следующий положительный фронт. Расчётное положение курсоров показано на рисунке 2.23.</w:t>
+        <w:t>Для измерения периода курсор T1 остаётся на положительном фронте CLK, T2 переносится на следующий положительный фронт. Расчётное положение курсоров показано на рисунке 2.23.</w:t>
       </w:r>
     </w:p>
     <w:p>
@@ -18235,14 +17750,7 @@
           <w:color w:val="000000"/>
           <w:sz w:val="28"/>
         </w:rPr>
-        <w:t>Ожидаемый период T2 − T1 ≈ 1,351082 с, что отличается от</w:t>
-      </w:r>
-      <w:r>
-        <w:rPr>
-          <w:color w:val="000000"/>
-          <w:sz w:val="28"/>
-        </w:rPr>
-        <w:t xml:space="preserve"> заданных 1,35 с приблизительно на +0,0802 %. Длительность низкого уровня составляет 0,690513 с. После проверки tH период уточняется подбором R1, затем оба параметра измеряются повторно.</w:t>
+        <w:t>Ожидаемый период T2 − T1 ≈ 1,351082 с, что отличается от заданных 1,35 с приблизительно на +0,0802 %. Длительность низкого уровня составляет 0,690513 с. После проверки tH период уточняется подбором R1, затем оба параметра измеряются повторно.</w:t>
       </w:r>
     </w:p>
     <w:p>
@@ -18256,14 +17764,7 @@
           <w:color w:val="000000"/>
           <w:sz w:val="28"/>
         </w:rPr>
-        <w:t>Завершение схемного этапа подтверждается тремя проверками: длительнос</w:t>
-      </w:r>
-      <w:r>
-        <w:rPr>
-          <w:color w:val="000000"/>
-          <w:sz w:val="28"/>
-        </w:rPr>
-        <w:t>ти импульса, периода и удержания конечного состояния 6. Представленные расчёты и логическая проверка не заменяют запуск схемы в Multisim; реальные осциллограммы и снимок остановленного устройства требуется получить после ручной сборки.</w:t>
+        <w:t>Завершение схемного этапа подтверждается тремя проверками: длительности импульса, периода и удержания конечного состояния 6. Представленные расчёты и логическая проверка не заменяют запуск схемы в Multisim; реальные осциллограммы и снимок остановленного устройства требуется получить после ручной сборки.</w:t>
       </w:r>
     </w:p>
     <w:p>
@@ -18311,21 +17812,7 @@
           <w:color w:val="000000"/>
           <w:sz w:val="28"/>
         </w:rPr>
-        <w:t>На основе синтезированных блоко</w:t>
-      </w:r>
-      <w:r>
-        <w:rPr>
-          <w:color w:val="000000"/>
-          <w:sz w:val="28"/>
-        </w:rPr>
-        <w:t xml:space="preserve">в разработана функциональная схема управляющего устройства (рисунок 3.1). ПСУ формирует заданную последовательность четырёхразрядных кодов, дешифратор преобразует их в четырнадцать управляющих сигналов, а генератор задаёт моменты переключения и прекращает </w:t>
-      </w:r>
-      <w:r>
-        <w:rPr>
-          <w:color w:val="000000"/>
-          <w:sz w:val="28"/>
-        </w:rPr>
-        <w:t>счёт в состоянии 6.</w:t>
+        <w:t>На основе синтезированных блоков разработана функциональная схема управляющего устройства (рисунок 3.1). ПСУ формирует заданную последовательность четырёхразрядных кодов, дешифратор преобразует их в четырнадцать управляющих сигналов, а генератор задаёт моменты переключения и прекращает счёт в состоянии 6.</w:t>
       </w:r>
     </w:p>
     <w:p>
@@ -18429,14 +17916,7 @@
           <w:color w:val="000000"/>
           <w:sz w:val="28"/>
         </w:rPr>
-        <w:t>На схеме используются ранее полученные блоки Logic_D, D_Counter, DC1, CLK_GEN и P_RES_GEN. Линия обратной связи передаёт прямые и инверсные выходы регистра на комбин</w:t>
-      </w:r>
-      <w:r>
-        <w:rPr>
-          <w:color w:val="000000"/>
-          <w:sz w:val="28"/>
-        </w:rPr>
-        <w:t>ационную логику. Четыре Probe показывают значения D3…D0, четырнадцать Probe — активный управляющий выход; HEX-индикатор отображает текущее состояние.</w:t>
+        <w:t>На схеме используются ранее полученные блоки Logic_D, D_Counter, DC1, CLK_GEN и P_RES_GEN. Линия обратной связи передаёт прямые и инверсные выходы регистра на комбинационную логику. Четыре Probe показывают значения D3…D0, четырнадцать Probe — активный управляющий выход; HEX-индикатор отображает текущее состояние.</w:t>
       </w:r>
     </w:p>
     <w:p>
@@ -18458,14 +17938,7 @@
           <w:sz w:val="28"/>
         </w:rPr>
         <w:lastRenderedPageBreak/>
-        <w:t>он перенастраивается, как описано в 3.</w:t>
-      </w:r>
-      <w:r>
-        <w:rPr>
-          <w:color w:val="000000"/>
-          <w:sz w:val="28"/>
-        </w:rPr>
-        <w:t>2. Старый тестовый генератор отключается: выходы двух генераторов нельзя соединять между собой.</w:t>
+        <w:t>он перенастраивается, как описано в 3.2. Старый тестовый генератор отключается: выходы двух генераторов нельзя соединять между собой.</w:t>
       </w:r>
     </w:p>
     <w:p>
@@ -18508,14 +17981,7 @@
           <w:color w:val="000000"/>
           <w:sz w:val="28"/>
         </w:rPr>
-        <w:t xml:space="preserve">Таблица </w:t>
-      </w:r>
-      <w:r>
-        <w:rPr>
-          <w:color w:val="000000"/>
-          <w:sz w:val="28"/>
-        </w:rPr>
-        <w:t>3.1 – Межблочные соединения управляющего устройства</w:t>
+        <w:t>Таблица 3.1 – Межблочные соединения управляющего устройства</w:t>
       </w:r>
     </w:p>
     <w:tbl>
@@ -19040,14 +18506,7 @@
                 <w:color w:val="000000"/>
                 <w:sz w:val="24"/>
               </w:rPr>
-              <w:t xml:space="preserve">AND2 </w:t>
-            </w:r>
-            <w:r>
-              <w:rPr>
-                <w:color w:val="000000"/>
-                <w:sz w:val="24"/>
-              </w:rPr>
-              <w:t>совместно с P_RES</w:t>
+              <w:t>AND2 совместно с P_RES</w:t>
             </w:r>
           </w:p>
         </w:tc>
@@ -19120,14 +18579,7 @@
           <w:color w:val="000000"/>
           <w:sz w:val="28"/>
         </w:rPr>
-        <w:t>Регистр ПСУ содержит четыре D-триггера в двух корпусах 74AS74. Ещё один корпус используется для RUN и STOP. Дешифратор реализуется восемью AND3 и шестью AND4, логика остановки — одним AND4 и од</w:t>
-      </w:r>
-      <w:r>
-        <w:rPr>
-          <w:color w:val="000000"/>
-          <w:sz w:val="28"/>
-        </w:rPr>
-        <w:t>ним AND2. Времязадающая часть содержит LM555, инвертор 74LS04, R1 = 4,32 кОм, R2 = 95,3 кОм и C1 = 10 мкФ.</w:t>
+        <w:t>Регистр ПСУ содержит четыре D-триггера в двух корпусах 74AS74. Ещё один корпус используется для RUN и STOP. Дешифратор реализуется восемью AND3 и шестью AND4, логика остановки — одним AND4 и одним AND2. Времязадающая часть содержит LM555, инвертор 74LS04, R1 = 4,32 кОм, R2 = 95,3 кОм и C1 = 10 мкФ.</w:t>
       </w:r>
     </w:p>
     <w:p>
@@ -19141,14 +18593,7 @@
           <w:color w:val="000000"/>
           <w:sz w:val="28"/>
         </w:rPr>
-        <w:t>Начальная установка формируется RC-цепью R3 = 10 кОм, C4 = 10 мкФ и двумя инверторами Шмитта 74HC14. Буфер 74LS07 с подтяжкой R4 = 1 кОм обеспечивает</w:t>
-      </w:r>
-      <w:r>
-        <w:rPr>
-          <w:color w:val="000000"/>
-          <w:sz w:val="28"/>
-        </w:rPr>
-        <w:t xml:space="preserve"> нагрузочную способность линии P_RES [3–5]. Питание всех блоков составляет 5 В, земля общая; у каждого корпуса предусматривается развязывающий конденсатор 100 нФ.</w:t>
+        <w:t>Начальная установка формируется RC-цепью R3 = 10 кОм, C4 = 10 мкФ и двумя инверторами Шмитта 74HC14. Буфер 74LS07 с подтяжкой R4 = 1 кОм обеспечивает нагрузочную способность линии P_RES [3–5]. Питание всех блоков составляет 5 В, земля общая; у каждого корпуса предусматривается развязывающий конденсатор 100 нФ.</w:t>
       </w:r>
     </w:p>
     <w:p>
@@ -19167,14 +18612,7 @@
           <w:sz w:val="28"/>
         </w:rPr>
         <w:lastRenderedPageBreak/>
-        <w:t>Работа ПСУ подтверждена моделями Logic_D и D_Counter. Для общей схемы остаётся проверить запу</w:t>
-      </w:r>
-      <w:r>
-        <w:rPr>
-          <w:color w:val="000000"/>
-          <w:sz w:val="28"/>
-        </w:rPr>
-        <w:t>ск, дешифрацию и остановку по STOP.</w:t>
+        <w:t>Работа ПСУ подтверждена моделями Logic_D и D_Counter. Для общей схемы остаётся проверить запуск, дешифрацию и остановку по STOP.</w:t>
       </w:r>
     </w:p>
     <w:p>
@@ -19331,14 +18769,7 @@
           <w:color w:val="000000"/>
           <w:sz w:val="28"/>
         </w:rPr>
-        <w:t>При START ↑ устанавливается RUN = 1, а CLK сначала падает. Первый положительный фронт возникает приблизительно через 1,0944 с при исходно разряженном C1; далее фронты следуют чере</w:t>
-      </w:r>
-      <w:r>
-        <w:rPr>
-          <w:color w:val="000000"/>
-          <w:sz w:val="28"/>
-        </w:rPr>
-        <w:t>з 1,351082 с. Состояния меняются в порядке D–2–E–B–0–C–9–5–7–8–4–3–A–6.</w:t>
+        <w:t>При START ↑ устанавливается RUN = 1, а CLK сначала падает. Первый положительный фронт возникает приблизительно через 1,0944 с при исходно разряженном C1; далее фронты следуют через 1,351082 с. Состояния меняются в порядке D–2–E–B–0–C–9–5–7–8–4–3–A–6.</w:t>
       </w:r>
     </w:p>
     <w:p>
@@ -19352,14 +18783,7 @@
           <w:color w:val="000000"/>
           <w:sz w:val="28"/>
         </w:rPr>
-        <w:t>На тринадцатом фронте происходит переход A → 6 и устанавливается STOP. Время от START равно 1,0944 + 12 · 1,351082 ≈ 17,3074 с. RUN сбрасывается; CLK = 1, HEX = 6 и Y6 = 1 сохраняются.</w:t>
-      </w:r>
-      <w:r>
-        <w:rPr>
-          <w:color w:val="000000"/>
-          <w:sz w:val="28"/>
-        </w:rPr>
-        <w:t xml:space="preserve"> Задержки логики на </w:t>
+        <w:t xml:space="preserve">На тринадцатом фронте происходит переход A → 6 и устанавливается STOP. Время от START равно 1,0944 + 12 · 1,351082 ≈ 17,3074 с. RUN сбрасывается; CLK = 1, HEX = 6 и Y6 = 1 сохраняются. Задержки логики на </w:t>
       </w:r>
       <w:r>
         <w:rPr>
@@ -19385,14 +18809,7 @@
           <w:color w:val="000000"/>
           <w:sz w:val="28"/>
         </w:rPr>
-        <w:t>Для этой записи XLA1 использует внутреннюю выборку 100 Гц: каналы 1–4 → Q3…Q0, 5 → START, 6 → RUN, 7 → STOP, 8 → CLK; C отключён. Запись продолжается и после остановки CLK. Диаграмма Y снимается отдельно</w:t>
-      </w:r>
-      <w:r>
-        <w:rPr>
-          <w:color w:val="000000"/>
-          <w:sz w:val="28"/>
-        </w:rPr>
-        <w:t xml:space="preserve"> по рисунку 2.11 [6].</w:t>
+        <w:t>Для этой записи XLA1 использует внутреннюю выборку 100 Гц: каналы 1–4 → Q3…Q0, 5 → START, 6 → RUN, 7 → STOP, 8 → CLK; C отключён. Запись продолжается и после остановки CLK. Диаграмма Y снимается отдельно по рисунку 2.11 [6].</w:t>
       </w:r>
     </w:p>
     <w:p>
@@ -19437,14 +18854,7 @@
           <w:color w:val="000000"/>
           <w:sz w:val="28"/>
         </w:rPr>
-        <w:t>После включения питания P_RES_GEN формирует низкий уровень начальной установки. На разрядах Q3, Q2 и Q0 активируется /PRE, на Q1 — /CLR: ПСУ принимает код 1101. Оба триггера управления сбрасываются. После заряда C4 си</w:t>
-      </w:r>
-      <w:r>
-        <w:rPr>
-          <w:color w:val="000000"/>
-          <w:sz w:val="28"/>
-        </w:rPr>
-        <w:t>гнал P_RES становится высоким, и схема ожидает START.</w:t>
+        <w:t>После включения питания P_RES_GEN формирует низкий уровень начальной установки. На разрядах Q3, Q2 и Q0 активируется /PRE, на Q1 — /CLR: ПСУ принимает код 1101. Оба триггера управления сбрасываются. После заряда C4 сигнал P_RES становится высоким, и схема ожидает START.</w:t>
       </w:r>
     </w:p>
     <w:p>
@@ -19458,14 +18868,7 @@
           <w:color w:val="000000"/>
           <w:sz w:val="28"/>
         </w:rPr>
-        <w:t>Фронт START устанавливает RUN. Таймер начинает колебания, инвертор формирует CLK. До каждого положительного фронта Logic_D вычисляет следующий код; фронт одновременно записывает D3…D0 в четыре триггера,</w:t>
-      </w:r>
-      <w:r>
-        <w:rPr>
-          <w:color w:val="000000"/>
-          <w:sz w:val="28"/>
-        </w:rPr>
-        <w:t xml:space="preserve"> обеспечивая синхронный пересчёт [1, 2].</w:t>
+        <w:t>Фронт START устанавливает RUN. Таймер начинает колебания, инвертор формирует CLK. До каждого положительного фронта Logic_D вычисляет следующий код; фронт одновременно записывает D3…D0 в четыре триггера, обеспечивая синхронный пересчёт [1, 2].</w:t>
       </w:r>
     </w:p>
     <w:p>
@@ -19479,14 +18882,7 @@
           <w:color w:val="000000"/>
           <w:sz w:val="28"/>
         </w:rPr>
-        <w:t>В каждом установившемся рабочем состоянии DC1 активирует один выход Yi, индекс которого совпадает с десятичным входным кодом. Для 1101 включён Y13, для 0010 — Y2, для конечного 0110 — Y6. HEX-индикатор показывает со</w:t>
-      </w:r>
-      <w:r>
-        <w:rPr>
-          <w:color w:val="000000"/>
-          <w:sz w:val="28"/>
-        </w:rPr>
-        <w:t>ответственно D, 2 и 6.</w:t>
+        <w:t>В каждом установившемся рабочем состоянии DC1 активирует один выход Yi, индекс которого совпадает с десятичным входным кодом. Для 1101 включён Y13, для 0010 — Y2, для конечного 0110 — Y6. HEX-индикатор показывает соответственно D, 2 и 6.</w:t>
       </w:r>
     </w:p>
     <w:p>
@@ -19500,14 +18896,7 @@
           <w:color w:val="000000"/>
           <w:sz w:val="28"/>
         </w:rPr>
-        <w:t xml:space="preserve">В состоянии 10 активен E10. На следующем фронте ПСУ принимает 6, а триггер STOP записывает единицу. NOT_STOP через AND2 сбрасывает RUN. В этот момент OUT таймера уже низкий, поэтому его сброс сохраняет высокий CLK без </w:t>
-      </w:r>
-      <w:r>
-        <w:rPr>
-          <w:color w:val="000000"/>
-          <w:sz w:val="28"/>
-        </w:rPr>
-        <w:t>дополнительного положительного фронта. Состояние 6 удерживается до общей начальной установки.</w:t>
+        <w:t>В состоянии 10 активен E10. На следующем фронте ПСУ принимает 6, а триггер STOP записывает единицу. NOT_STOP через AND2 сбрасывает RUN. В этот момент OUT таймера уже низкий, поэтому его сброс сохраняет высокий CLK без дополнительного положительного фронта. Состояние 6 удерживается до общей начальной установки.</w:t>
       </w:r>
     </w:p>
     <w:p>
@@ -19521,14 +18910,7 @@
           <w:color w:val="000000"/>
           <w:sz w:val="28"/>
         </w:rPr>
-        <w:t>Для нового прохода S_RST замыкается не менее чем на 5 с: ПСУ возвращается в 13, STOP и RUN сбрасываются, C1 разряжается. После размыкания S_RST и снятия P_RES под</w:t>
-      </w:r>
-      <w:r>
-        <w:rPr>
-          <w:color w:val="000000"/>
-          <w:sz w:val="28"/>
-        </w:rPr>
-        <w:t>аётся новый фронт START. Запуск без сброса невозможен: активный STOP удерживает RUN в нуле.</w:t>
+        <w:t>Для нового прохода S_RST замыкается не менее чем на 5 с: ПСУ возвращается в 13, STOP и RUN сбрасываются, C1 разряжается. После размыкания S_RST и снятия P_RES подаётся новый фронт START. Запуск без сброса невозможен: активный STOP удерживает RUN в нуле.</w:t>
       </w:r>
     </w:p>
     <w:p>
@@ -19543,14 +18925,7 @@
           <w:sz w:val="28"/>
         </w:rPr>
         <w:lastRenderedPageBreak/>
-        <w:t>Проверка минимизированной логики на исключённых кодах дала переходы 1 → 13 и 15 → 2. При разрешённом тактировании возврат в рабочую последовательность занимает один</w:t>
-      </w:r>
-      <w:r>
-        <w:rPr>
-          <w:color w:val="000000"/>
-          <w:sz w:val="28"/>
-        </w:rPr>
-        <w:t xml:space="preserve"> такт, но до него дешифратор может выдавать несколько единиц. Поэтому штатный запуск всегда выполняется после P_RES.</w:t>
+        <w:t>Проверка минимизированной логики на исключённых кодах дала переходы 1 → 13 и 15 → 2. При разрешённом тактировании возврат в рабочую последовательность занимает один такт, но до него дешифратор может выдавать несколько единиц. Поэтому штатный запуск всегда выполняется после P_RES.</w:t>
       </w:r>
     </w:p>
     <w:p>
@@ -19580,14 +18955,7 @@
           <w:color w:val="000000"/>
           <w:sz w:val="28"/>
         </w:rPr>
-        <w:t>В курсовой работе выполнен логический синтез управляющего устройства для последовательности 13–2–14–11–0–12–9–5–7–8–4–3–10–6. По</w:t>
-      </w:r>
-      <w:r>
-        <w:rPr>
-          <w:color w:val="000000"/>
-          <w:sz w:val="28"/>
-        </w:rPr>
-        <w:t>строены таблица переходов и карты Карно, получены минимизированные функции входов четырёх D-триггеров 74AS74. Правильность рабочего цикла ПСУ подтверждена ранее выполненным моделированием и приведённой диаграммой логического анализатора.</w:t>
+        <w:t>В курсовой работе выполнен логический синтез управляющего устройства для последовательности 13–2–14–11–0–12–9–5–7–8–4–3–10–6. Построены таблица переходов и карты Карно, получены минимизированные функции входов четырёх D-триггеров 74AS74. Правильность рабочего цикла ПСУ подтверждена ранее выполненным моделированием и приведённой диаграммой логического анализатора.</w:t>
       </w:r>
     </w:p>
     <w:p>
@@ -19601,21 +18969,7 @@
           <w:color w:val="000000"/>
           <w:sz w:val="28"/>
         </w:rPr>
-        <w:t>Синтезирован дешиф</w:t>
-      </w:r>
-      <w:r>
-        <w:rPr>
-          <w:color w:val="000000"/>
-          <w:sz w:val="28"/>
-        </w:rPr>
-        <w:t>ратор 4/14 с активным единичным уровнем выходов. Проверка всех четырнадцати рабочих кодов показала единственность активного управляющего сигнала. Для исключённых кодов 1 и 15 определены переходы в рабочую последовательность и отмечено отсутствие гарантиров</w:t>
-      </w:r>
-      <w:r>
-        <w:rPr>
-          <w:color w:val="000000"/>
-          <w:sz w:val="28"/>
-        </w:rPr>
-        <w:t>анной унитарности до установления допустимого состояния.</w:t>
+        <w:t>Синтезирован дешифратор 4/14 с активным единичным уровнем выходов. Проверка всех четырнадцати рабочих кодов показала единственность активного управляющего сигнала. Для исключённых кодов 1 и 15 определены переходы в рабочую последовательность и отмечено отсутствие гарантированной унитарности до установления допустимого состояния.</w:t>
       </w:r>
     </w:p>
     <w:p>
@@ -19629,14 +18983,7 @@
           <w:color w:val="000000"/>
           <w:sz w:val="28"/>
         </w:rPr>
-        <w:t xml:space="preserve">Рассчитан управляемый генератор на LM555 с выходным инвертором. При номиналах R1 = 4,32 кОм, R2 = 95,3 кОм и C1 = 10 мкФ расчётная длительность высокого уровня равна 0,660569 с, период — 1,351082 с. </w:t>
-      </w:r>
-      <w:r>
-        <w:rPr>
-          <w:color w:val="000000"/>
-          <w:sz w:val="28"/>
-        </w:rPr>
-        <w:t>Отклонение, обусловленное округлением номиналов, составляет менее 0,09 %; допуски компонентов и погрешности модели учитываются отдельно.</w:t>
+        <w:t>Рассчитан управляемый генератор на LM555 с выходным инвертором. При номиналах R1 = 4,32 кОм, R2 = 95,3 кОм и C1 = 10 мкФ расчётная длительность высокого уровня равна 0,660569 с, период — 1,351082 с. Отклонение, обусловленное округлением номиналов, составляет менее 0,09 %; допуски компонентов и погрешности модели учитываются отдельно.</w:t>
       </w:r>
     </w:p>
     <w:p>
@@ -19650,14 +18997,7 @@
           <w:color w:val="000000"/>
           <w:sz w:val="28"/>
         </w:rPr>
-        <w:t>Разработаны цепи начальной установки, запуска и остановки на состоянии 6. Регистрация признака предшествующего кода обе</w:t>
-      </w:r>
-      <w:r>
-        <w:rPr>
-          <w:color w:val="000000"/>
-          <w:sz w:val="28"/>
-        </w:rPr>
-        <w:t>спечивает остановку после тринадцатого переключения от начального состояния 13. Подготовлены общая функциональная схема, межблочные соединения и расчётная диаграмма работы устройства.</w:t>
+        <w:t>Разработаны цепи начальной установки, запуска и остановки на состоянии 6. Регистрация признака предшествующего кода обеспечивает остановку после тринадцатого переключения от начального состояния 13. Подготовлены общая функциональная схема, межблочные соединения и расчётная диаграмма работы устройства.</w:t>
       </w:r>
     </w:p>
     <w:p>
@@ -19671,21 +19011,7 @@
           <w:color w:val="000000"/>
           <w:sz w:val="28"/>
         </w:rPr>
-        <w:t>Полученные результаты подтверждают корректность логического синтеза и ра</w:t>
-      </w:r>
-      <w:r>
-        <w:rPr>
-          <w:color w:val="000000"/>
-          <w:sz w:val="28"/>
-        </w:rPr>
-        <w:t>счёта временных параметров. Полная экспериментальная проверка объединённой модели, включая RC-сброс, временные параметры и отсутствие лишнего фронта при остановке, должна быть подтверждена измерениями в NI Multisim. Расчётные диаграммы не являются результа</w:t>
-      </w:r>
-      <w:r>
-        <w:rPr>
-          <w:color w:val="000000"/>
-          <w:sz w:val="28"/>
-        </w:rPr>
-        <w:t>тами этих измерений.</w:t>
+        <w:t>Полученные результаты подтверждают корректность логического синтеза и расчёта временных параметров. Полная экспериментальная проверка объединённой модели, включая RC-сброс, временные параметры и отсутствие лишнего фронта при остановке, должна быть подтверждена измерениями в NI Multisim. Расчётные диаграммы не являются результатами этих измерений.</w:t>
       </w:r>
     </w:p>
     <w:p>
@@ -19738,15 +19064,7 @@
           <w:sz w:val="28"/>
           <w:lang w:val="en-US"/>
         </w:rPr>
-        <w:t xml:space="preserve">2. Texas Instruments. Dual </w:t>
-      </w:r>
-      <w:r>
-        <w:rPr>
-          <w:color w:val="000000"/>
-          <w:sz w:val="28"/>
-          <w:lang w:val="en-US"/>
-        </w:rPr>
-        <w:t xml:space="preserve">Positive-Edge-Triggered D-Type Flip-Flops </w:t>
+        <w:t xml:space="preserve">2. Texas Instruments. Dual Positive-Edge-Triggered D-Type Flip-Flops </w:t>
       </w:r>
       <w:proofErr w:type="gramStart"/>
       <w:r>
@@ -19793,14 +19111,7 @@
           <w:color w:val="000000"/>
           <w:sz w:val="28"/>
         </w:rPr>
-        <w:t>SDLS029C. — Текс</w:t>
-      </w:r>
-      <w:r>
-        <w:rPr>
-          <w:color w:val="000000"/>
-          <w:sz w:val="28"/>
-        </w:rPr>
-        <w:t>т: электронный. — URL: https://www.ti.com/lit/ds/symlink/sn74ls04.pdf (дата обращения: 06.09.2026).</w:t>
+        <w:t>SDLS029C. — Текст: электронный. — URL: https://www.ti.com/lit/ds/symlink/sn74ls04.pdf (дата обращения: 06.09.2026).</w:t>
       </w:r>
     </w:p>
     <w:p>
@@ -19822,14 +19133,7 @@
           <w:color w:val="000000"/>
           <w:sz w:val="28"/>
         </w:rPr>
-        <w:t>SCLS085L. 2025. — Текст: электронный. — URL: https://www.ti.com/lit/ds/symlink/sn7</w:t>
-      </w:r>
-      <w:r>
-        <w:rPr>
-          <w:color w:val="000000"/>
-          <w:sz w:val="28"/>
-        </w:rPr>
-        <w:t>4hc14.pdf (дата обращения: 06.09.2026).</w:t>
+        <w:t>SCLS085L. 2025. — Текст: электронный. — URL: https://www.ti.com/lit/ds/symlink/sn74hc14.pdf (дата обращения: 06.09.2026).</w:t>
       </w:r>
     </w:p>
     <w:p>
@@ -19869,14 +19173,7 @@
           <w:color w:val="000000"/>
           <w:sz w:val="28"/>
         </w:rPr>
-        <w:t>SDLS021D. 2016. — Текст: электронный. — URL: https://www.ti.com/lit/ds/symlink/sn74ls07.pdf (дата обращения: 06.09.2026</w:t>
-      </w:r>
-      <w:r>
-        <w:rPr>
-          <w:color w:val="000000"/>
-          <w:sz w:val="28"/>
-        </w:rPr>
-        <w:t>).</w:t>
+        <w:t>SDLS021D. 2016. — Текст: электронный. — URL: https://www.ti.com/lit/ds/symlink/sn74ls07.pdf (дата обращения: 06.09.2026).</w:t>
       </w:r>
     </w:p>
     <w:p>

</xml_diff>

<commit_message>
project: save coursework and generator models progress
</commit_message>
<xml_diff>
--- a/deliverables/Курсовая_Блинов_текущая.docx
+++ b/deliverables/Курсовая_Блинов_текущая.docx
@@ -13775,7 +13775,6 @@
         <w:jc w:val="center"/>
         <w:rPr>
           <w:sz w:val="28"/>
-          <w:lang w:val="en-US"/>
         </w:rPr>
       </w:pPr>
       <w:r>
@@ -14063,6 +14062,7 @@
       </w:pPr>
       <w:r>
         <w:rPr>
+          <w:noProof/>
           <w:sz w:val="28"/>
         </w:rPr>
         <w:drawing>
@@ -14564,10 +14564,10 @@
           <w:noProof/>
         </w:rPr>
         <w:drawing>
-          <wp:inline distT="0" distB="0" distL="0" distR="0" wp14:anchorId="79F13685" wp14:editId="35C5864D">
-            <wp:extent cx="5580000" cy="2894625"/>
+          <wp:inline distT="0" distB="0" distL="0" distR="0" wp14:anchorId="23FD7E68" wp14:editId="25691A7C">
+            <wp:extent cx="4152900" cy="3358432"/>
             <wp:effectExtent l="0" t="0" r="0" b="0"/>
-            <wp:docPr id="918597022" name="Picture 918597022" descr="Рисунок 2.15 – Расчётная схема первоначальной проверки прямого выхода LM555"/>
+            <wp:docPr id="11" name="Рисунок 11"/>
             <wp:cNvGraphicFramePr>
               <a:graphicFrameLocks xmlns:a="http://schemas.openxmlformats.org/drawingml/2006/main" noChangeAspect="1"/>
             </wp:cNvGraphicFramePr>
@@ -14575,7 +14575,7 @@
               <a:graphicData uri="http://schemas.openxmlformats.org/drawingml/2006/picture">
                 <pic:pic xmlns:pic="http://schemas.openxmlformats.org/drawingml/2006/picture">
                   <pic:nvPicPr>
-                    <pic:cNvPr id="0" name="fig_2_15.png"/>
+                    <pic:cNvPr id="1" name=""/>
                     <pic:cNvPicPr/>
                   </pic:nvPicPr>
                   <pic:blipFill>
@@ -14587,7 +14587,7 @@
                   <pic:spPr>
                     <a:xfrm>
                       <a:off x="0" y="0"/>
-                      <a:ext cx="5580000" cy="2894625"/>
+                      <a:ext cx="4155915" cy="3360870"/>
                     </a:xfrm>
                     <a:prstGeom prst="rect">
                       <a:avLst/>
@@ -14615,7 +14615,6 @@
         <w:rPr>
           <w:color w:val="000000"/>
           <w:sz w:val="28"/>
-          <w:highlight w:val="yellow"/>
         </w:rPr>
         <w:t>Рисунок 2.15 – Расчётная схема первоначальной проверки прямого выхода LM555</w:t>
       </w:r>
@@ -14642,15 +14641,8 @@
           <w:color w:val="000000"/>
           <w:sz w:val="28"/>
         </w:rPr>
-        <w:t xml:space="preserve">Рисунок 2.15 задаёт подключения прибора, а не результат моделирования. </w:t>
-      </w:r>
-      <w:r>
-        <w:rPr>
-          <w:color w:val="000000"/>
-          <w:sz w:val="28"/>
-        </w:rPr>
         <w:lastRenderedPageBreak/>
-        <w:t>До расчёта R1 и R2 их числовые значения не назначаются. Окончательная схема с номиналами приведена на рисунке 2.17.</w:t>
+        <w:t>Рисунок 2.15 задаёт подключения прибора, а не результат моделирования. До расчёта R1 и R2 их числовые значения не назначаются. Окончательная схема с номиналами приведена на рисунке 2.17.</w:t>
       </w:r>
     </w:p>
     <w:p>
@@ -14853,10 +14845,10 @@
           <w:noProof/>
         </w:rPr>
         <w:drawing>
-          <wp:inline distT="0" distB="0" distL="0" distR="0" wp14:anchorId="75BE06B8" wp14:editId="1614BD61">
-            <wp:extent cx="5940000" cy="2301750"/>
-            <wp:effectExtent l="0" t="0" r="0" b="0"/>
-            <wp:docPr id="918597023" name="Picture 918597023" descr="Рисунок 2.16 – Выбор инвертирующего каскада для заданной длительности импульса"/>
+          <wp:inline distT="0" distB="0" distL="0" distR="0" wp14:anchorId="5F3B568C" wp14:editId="02742BA7">
+            <wp:extent cx="4762500" cy="3933825"/>
+            <wp:effectExtent l="0" t="0" r="0" b="9525"/>
+            <wp:docPr id="14" name="Рисунок 14"/>
             <wp:cNvGraphicFramePr>
               <a:graphicFrameLocks xmlns:a="http://schemas.openxmlformats.org/drawingml/2006/main" noChangeAspect="1"/>
             </wp:cNvGraphicFramePr>
@@ -14864,7 +14856,7 @@
               <a:graphicData uri="http://schemas.openxmlformats.org/drawingml/2006/picture">
                 <pic:pic xmlns:pic="http://schemas.openxmlformats.org/drawingml/2006/picture">
                   <pic:nvPicPr>
-                    <pic:cNvPr id="0" name="fig_2_16.png"/>
+                    <pic:cNvPr id="1" name=""/>
                     <pic:cNvPicPr/>
                   </pic:nvPicPr>
                   <pic:blipFill>
@@ -14876,7 +14868,7 @@
                   <pic:spPr>
                     <a:xfrm>
                       <a:off x="0" y="0"/>
-                      <a:ext cx="5940000" cy="2301750"/>
+                      <a:ext cx="4762500" cy="3933825"/>
                     </a:xfrm>
                     <a:prstGeom prst="rect">
                       <a:avLst/>
@@ -14904,7 +14896,6 @@
         <w:rPr>
           <w:color w:val="000000"/>
           <w:sz w:val="28"/>
-          <w:highlight w:val="yellow"/>
         </w:rPr>
         <w:t>Рисунок 2.16 – Выбор инвертирующего каскада для заданной длительности импульса</w:t>
       </w:r>
@@ -14931,7 +14922,15 @@
           <w:color w:val="000000"/>
           <w:sz w:val="28"/>
         </w:rPr>
-        <w:t>После инвертирования высокий уровень CLK соответствует разряду C1, низкий — заряду. Для установившегося режима справедливы зависимости производителя (коэффициент 0,693 уточнён до ln 2):</w:t>
+        <w:t xml:space="preserve">После инвертирования высокий уровень CLK соответствует разряду C1, </w:t>
+      </w:r>
+      <w:r>
+        <w:rPr>
+          <w:color w:val="000000"/>
+          <w:sz w:val="28"/>
+        </w:rPr>
+        <w:lastRenderedPageBreak/>
+        <w:t>низкий — заряду. Для установившегося режима справедливы зависимости производителя (коэффициент 0,693 уточнён до ln 2):</w:t>
       </w:r>
     </w:p>
     <w:p>
@@ -15364,7 +15363,6 @@
         <w:ind w:right="283"/>
       </w:pPr>
       <w:r>
-        <w:lastRenderedPageBreak/>
         <w:tab/>
       </w:r>
       <m:oMath>
@@ -15504,10 +15502,10 @@
           <w:noProof/>
         </w:rPr>
         <w:drawing>
-          <wp:inline distT="0" distB="0" distL="0" distR="0" wp14:anchorId="34B1E185" wp14:editId="27257665">
-            <wp:extent cx="5940000" cy="3757229"/>
+          <wp:inline distT="0" distB="0" distL="0" distR="0" wp14:anchorId="32D56926" wp14:editId="5D4A2A49">
+            <wp:extent cx="6480810" cy="3910965"/>
             <wp:effectExtent l="0" t="0" r="0" b="0"/>
-            <wp:docPr id="918597024" name="Picture 918597024" descr="Рисунок 2.17 – Расчётная схема генератора с выбранными номиналами R1, R2 и C1"/>
+            <wp:docPr id="12" name="Рисунок 12"/>
             <wp:cNvGraphicFramePr>
               <a:graphicFrameLocks xmlns:a="http://schemas.openxmlformats.org/drawingml/2006/main" noChangeAspect="1"/>
             </wp:cNvGraphicFramePr>
@@ -15515,7 +15513,7 @@
               <a:graphicData uri="http://schemas.openxmlformats.org/drawingml/2006/picture">
                 <pic:pic xmlns:pic="http://schemas.openxmlformats.org/drawingml/2006/picture">
                   <pic:nvPicPr>
-                    <pic:cNvPr id="0" name="image.png"/>
+                    <pic:cNvPr id="1" name=""/>
                     <pic:cNvPicPr/>
                   </pic:nvPicPr>
                   <pic:blipFill>
@@ -15527,7 +15525,7 @@
                   <pic:spPr>
                     <a:xfrm>
                       <a:off x="0" y="0"/>
-                      <a:ext cx="5940000" cy="3757229"/>
+                      <a:ext cx="6480810" cy="3910965"/>
                     </a:xfrm>
                     <a:prstGeom prst="rect">
                       <a:avLst/>
@@ -15555,7 +15553,6 @@
         <w:rPr>
           <w:color w:val="000000"/>
           <w:sz w:val="28"/>
-          <w:highlight w:val="yellow"/>
         </w:rPr>
         <w:t>Рисунок 2.17 – Расчётная схема генератора с выбранными номиналами R1, R2 и C1</w:t>
       </w:r>
@@ -15573,17 +15570,40 @@
     </w:p>
     <w:p>
       <w:pPr>
+        <w:keepLines/>
+        <w:spacing w:after="160" w:line="276" w:lineRule="auto"/>
+        <w:ind w:right="283"/>
+        <w:jc w:val="center"/>
+        <w:rPr>
+          <w:sz w:val="28"/>
+        </w:rPr>
+      </w:pPr>
+    </w:p>
+    <w:p>
+      <w:pPr>
         <w:spacing w:line="360" w:lineRule="auto"/>
         <w:ind w:right="283" w:firstLine="709"/>
         <w:jc w:val="both"/>
-      </w:pPr>
-      <w:r>
         <w:rPr>
           <w:color w:val="000000"/>
           <w:sz w:val="28"/>
         </w:rPr>
+      </w:pPr>
+      <w:r>
+        <w:rPr>
+          <w:color w:val="000000"/>
+          <w:sz w:val="28"/>
+        </w:rPr>
+        <w:lastRenderedPageBreak/>
         <w:t>При проверке только времязадающей части RUN временно заменяется постоянным уровнем +5 В. В составе устройства на вход /RESET подаётся выход триггера разрешения. Все точки GND объединяются; названия цепей на рисунках являются электрическими метками, а не отдельными источниками.</w:t>
       </w:r>
+    </w:p>
+    <w:p>
+      <w:pPr>
+        <w:spacing w:line="360" w:lineRule="auto"/>
+        <w:ind w:right="283" w:firstLine="709"/>
+        <w:jc w:val="both"/>
+      </w:pPr>
     </w:p>
     <w:p>
       <w:pPr>
@@ -15600,133 +15620,13 @@
         <w:spacing w:after="100" w:line="360" w:lineRule="auto"/>
         <w:ind w:right="283" w:firstLine="709"/>
         <w:jc w:val="both"/>
-        <w:rPr>
-          <w:sz w:val="2"/>
-        </w:rPr>
-      </w:pPr>
-    </w:p>
-    <w:p>
-      <w:pPr>
-        <w:spacing w:after="100" w:line="360" w:lineRule="auto"/>
-        <w:ind w:right="283" w:firstLine="709"/>
-        <w:jc w:val="both"/>
-        <w:rPr>
-          <w:sz w:val="2"/>
-        </w:rPr>
-      </w:pPr>
-    </w:p>
-    <w:p>
-      <w:pPr>
-        <w:spacing w:after="100" w:line="360" w:lineRule="auto"/>
-        <w:ind w:right="283" w:firstLine="709"/>
-        <w:jc w:val="both"/>
-        <w:rPr>
-          <w:sz w:val="2"/>
-        </w:rPr>
-      </w:pPr>
-    </w:p>
-    <w:p>
-      <w:pPr>
-        <w:spacing w:after="100" w:line="360" w:lineRule="auto"/>
-        <w:ind w:right="283" w:firstLine="709"/>
-        <w:jc w:val="both"/>
-        <w:rPr>
-          <w:sz w:val="2"/>
-        </w:rPr>
-      </w:pPr>
-    </w:p>
-    <w:p>
-      <w:pPr>
-        <w:spacing w:after="100" w:line="360" w:lineRule="auto"/>
-        <w:ind w:right="283" w:firstLine="709"/>
-        <w:jc w:val="both"/>
-        <w:rPr>
-          <w:sz w:val="2"/>
-        </w:rPr>
-      </w:pPr>
-    </w:p>
-    <w:p>
-      <w:pPr>
-        <w:spacing w:after="100" w:line="360" w:lineRule="auto"/>
-        <w:ind w:right="283" w:firstLine="709"/>
-        <w:jc w:val="both"/>
-        <w:rPr>
-          <w:sz w:val="2"/>
-        </w:rPr>
-      </w:pPr>
-    </w:p>
-    <w:p>
-      <w:pPr>
-        <w:spacing w:after="100" w:line="360" w:lineRule="auto"/>
-        <w:ind w:right="283" w:firstLine="709"/>
-        <w:jc w:val="both"/>
-        <w:rPr>
-          <w:sz w:val="2"/>
-        </w:rPr>
-      </w:pPr>
-    </w:p>
-    <w:p>
-      <w:pPr>
-        <w:spacing w:after="100" w:line="360" w:lineRule="auto"/>
-        <w:ind w:right="283" w:firstLine="709"/>
-        <w:jc w:val="both"/>
-        <w:rPr>
-          <w:sz w:val="2"/>
-        </w:rPr>
-      </w:pPr>
-    </w:p>
-    <w:p>
-      <w:pPr>
-        <w:spacing w:after="100" w:line="360" w:lineRule="auto"/>
-        <w:ind w:right="283" w:firstLine="709"/>
-        <w:jc w:val="both"/>
-        <w:rPr>
-          <w:sz w:val="2"/>
-        </w:rPr>
-      </w:pPr>
-    </w:p>
-    <w:p>
-      <w:pPr>
-        <w:spacing w:after="100" w:line="360" w:lineRule="auto"/>
-        <w:ind w:right="283" w:firstLine="709"/>
-        <w:jc w:val="both"/>
-        <w:rPr>
-          <w:sz w:val="2"/>
-        </w:rPr>
-      </w:pPr>
-    </w:p>
-    <w:p>
-      <w:pPr>
-        <w:spacing w:after="100" w:line="360" w:lineRule="auto"/>
-        <w:ind w:right="283" w:firstLine="709"/>
-        <w:jc w:val="both"/>
-        <w:rPr>
-          <w:sz w:val="2"/>
-        </w:rPr>
-      </w:pPr>
-    </w:p>
-    <w:p>
-      <w:pPr>
-        <w:spacing w:after="100" w:line="360" w:lineRule="auto"/>
-        <w:ind w:right="283" w:firstLine="709"/>
-        <w:jc w:val="both"/>
-        <w:rPr>
-          <w:sz w:val="2"/>
-        </w:rPr>
-      </w:pPr>
-    </w:p>
-    <w:p>
-      <w:pPr>
-        <w:spacing w:after="100" w:line="360" w:lineRule="auto"/>
-        <w:ind w:right="283" w:firstLine="709"/>
-        <w:jc w:val="both"/>
       </w:pPr>
       <w:r>
         <w:rPr>
           <w:color w:val="000000"/>
           <w:sz w:val="28"/>
-        </w:rPr>
-        <w:lastRenderedPageBreak/>
+          <w:highlight w:val="yellow"/>
+        </w:rPr>
         <w:t>Таблица 2.1 – Расчётные временные параметры генератора</w:t>
       </w:r>
     </w:p>
@@ -16151,11 +16051,15 @@
         <w:spacing w:after="100" w:line="360" w:lineRule="auto"/>
         <w:ind w:right="283" w:firstLine="709"/>
         <w:jc w:val="both"/>
+        <w:rPr>
+          <w:highlight w:val="yellow"/>
+        </w:rPr>
       </w:pPr>
       <w:r>
         <w:rPr>
           <w:color w:val="000000"/>
           <w:sz w:val="28"/>
+          <w:highlight w:val="yellow"/>
         </w:rPr>
         <w:t>Таблица 2.2 – Карта соединений генератора</w:t>
       </w:r>
@@ -16190,12 +16094,16 @@
           <w:p>
             <w:pPr>
               <w:spacing w:before="60" w:after="60" w:line="252" w:lineRule="auto"/>
+              <w:rPr>
+                <w:highlight w:val="yellow"/>
+              </w:rPr>
             </w:pPr>
             <w:r>
               <w:rPr>
                 <w:b/>
                 <w:color w:val="000000"/>
                 <w:sz w:val="24"/>
+                <w:highlight w:val="yellow"/>
               </w:rPr>
               <w:t>Элемент или вывод</w:t>
             </w:r>
@@ -16208,12 +16116,16 @@
           <w:p>
             <w:pPr>
               <w:spacing w:before="60" w:after="60" w:line="252" w:lineRule="auto"/>
+              <w:rPr>
+                <w:highlight w:val="yellow"/>
+              </w:rPr>
             </w:pPr>
             <w:r>
               <w:rPr>
                 <w:b/>
                 <w:color w:val="000000"/>
                 <w:sz w:val="24"/>
+                <w:highlight w:val="yellow"/>
               </w:rPr>
               <w:t>Соединение</w:t>
             </w:r>
@@ -16231,11 +16143,15 @@
           <w:p>
             <w:pPr>
               <w:spacing w:before="60" w:after="60" w:line="252" w:lineRule="auto"/>
+              <w:rPr>
+                <w:highlight w:val="yellow"/>
+              </w:rPr>
             </w:pPr>
             <w:r>
               <w:rPr>
                 <w:color w:val="000000"/>
                 <w:sz w:val="24"/>
+                <w:highlight w:val="yellow"/>
               </w:rPr>
               <w:t>LM555: 8; 1</w:t>
             </w:r>
@@ -16248,11 +16164,15 @@
           <w:p>
             <w:pPr>
               <w:spacing w:before="60" w:after="60" w:line="252" w:lineRule="auto"/>
+              <w:rPr>
+                <w:highlight w:val="yellow"/>
+              </w:rPr>
             </w:pPr>
             <w:r>
               <w:rPr>
                 <w:color w:val="000000"/>
                 <w:sz w:val="24"/>
+                <w:highlight w:val="yellow"/>
               </w:rPr>
               <w:t>8 → +5 В; 1 → GND</w:t>
             </w:r>
@@ -16270,11 +16190,15 @@
           <w:p>
             <w:pPr>
               <w:spacing w:before="60" w:after="60" w:line="252" w:lineRule="auto"/>
+              <w:rPr>
+                <w:highlight w:val="yellow"/>
+              </w:rPr>
             </w:pPr>
             <w:r>
               <w:rPr>
                 <w:color w:val="000000"/>
                 <w:sz w:val="24"/>
+                <w:highlight w:val="yellow"/>
               </w:rPr>
               <w:t>R1 = 4,32 кОм</w:t>
             </w:r>
@@ -16287,11 +16211,15 @@
           <w:p>
             <w:pPr>
               <w:spacing w:before="60" w:after="60" w:line="252" w:lineRule="auto"/>
+              <w:rPr>
+                <w:highlight w:val="yellow"/>
+              </w:rPr>
             </w:pPr>
             <w:r>
               <w:rPr>
                 <w:color w:val="000000"/>
                 <w:sz w:val="24"/>
+                <w:highlight w:val="yellow"/>
               </w:rPr>
               <w:t>+5 В ↔ LM555: 7</w:t>
             </w:r>
@@ -16309,11 +16237,15 @@
           <w:p>
             <w:pPr>
               <w:spacing w:before="60" w:after="60" w:line="252" w:lineRule="auto"/>
+              <w:rPr>
+                <w:highlight w:val="yellow"/>
+              </w:rPr>
             </w:pPr>
             <w:r>
               <w:rPr>
                 <w:color w:val="000000"/>
                 <w:sz w:val="24"/>
+                <w:highlight w:val="yellow"/>
               </w:rPr>
               <w:t>R2 = 95,3 кОм</w:t>
             </w:r>
@@ -16326,11 +16258,15 @@
           <w:p>
             <w:pPr>
               <w:spacing w:before="60" w:after="60" w:line="252" w:lineRule="auto"/>
+              <w:rPr>
+                <w:highlight w:val="yellow"/>
+              </w:rPr>
             </w:pPr>
             <w:r>
               <w:rPr>
                 <w:color w:val="000000"/>
                 <w:sz w:val="24"/>
+                <w:highlight w:val="yellow"/>
               </w:rPr>
               <w:t>LM555: 7 ↔ узел 2, 6</w:t>
             </w:r>
@@ -16348,11 +16284,15 @@
           <w:p>
             <w:pPr>
               <w:spacing w:before="60" w:after="60" w:line="252" w:lineRule="auto"/>
+              <w:rPr>
+                <w:highlight w:val="yellow"/>
+              </w:rPr>
             </w:pPr>
             <w:r>
               <w:rPr>
                 <w:color w:val="000000"/>
                 <w:sz w:val="24"/>
+                <w:highlight w:val="yellow"/>
               </w:rPr>
               <w:t>C1 = 10 мкФ</w:t>
             </w:r>
@@ -16365,11 +16305,15 @@
           <w:p>
             <w:pPr>
               <w:spacing w:before="60" w:after="60" w:line="252" w:lineRule="auto"/>
+              <w:rPr>
+                <w:highlight w:val="yellow"/>
+              </w:rPr>
             </w:pPr>
             <w:r>
               <w:rPr>
                 <w:color w:val="000000"/>
                 <w:sz w:val="24"/>
+                <w:highlight w:val="yellow"/>
               </w:rPr>
               <w:t>Плюс → узел 2, 6; минус → GND</w:t>
             </w:r>
@@ -16387,11 +16331,15 @@
           <w:p>
             <w:pPr>
               <w:spacing w:before="60" w:after="60" w:line="252" w:lineRule="auto"/>
+              <w:rPr>
+                <w:highlight w:val="yellow"/>
+              </w:rPr>
             </w:pPr>
             <w:r>
               <w:rPr>
                 <w:color w:val="000000"/>
                 <w:sz w:val="24"/>
+                <w:highlight w:val="yellow"/>
               </w:rPr>
               <w:t>C2 = 10 нФ; C3 = 100 нФ</w:t>
             </w:r>
@@ -16404,11 +16352,15 @@
           <w:p>
             <w:pPr>
               <w:spacing w:before="60" w:after="60" w:line="252" w:lineRule="auto"/>
+              <w:rPr>
+                <w:highlight w:val="yellow"/>
+              </w:rPr>
             </w:pPr>
             <w:r>
               <w:rPr>
                 <w:color w:val="000000"/>
                 <w:sz w:val="24"/>
+                <w:highlight w:val="yellow"/>
               </w:rPr>
               <w:t>C2: 5 ↔ GND; C3: 8 ↔ 1</w:t>
             </w:r>
@@ -16426,11 +16378,15 @@
           <w:p>
             <w:pPr>
               <w:spacing w:before="60" w:after="60" w:line="252" w:lineRule="auto"/>
+              <w:rPr>
+                <w:highlight w:val="yellow"/>
+              </w:rPr>
             </w:pPr>
             <w:r>
               <w:rPr>
                 <w:color w:val="000000"/>
                 <w:sz w:val="24"/>
+                <w:highlight w:val="yellow"/>
               </w:rPr>
               <w:t>LM555: 4 /RESET</w:t>
             </w:r>
@@ -16444,6 +16400,7 @@
             <w:pPr>
               <w:spacing w:before="60" w:after="60" w:line="252" w:lineRule="auto"/>
               <w:rPr>
+                <w:highlight w:val="yellow"/>
                 <w:lang w:val="en-US"/>
               </w:rPr>
             </w:pPr>
@@ -16451,6 +16408,7 @@
               <w:rPr>
                 <w:color w:val="000000"/>
                 <w:sz w:val="24"/>
+                <w:highlight w:val="yellow"/>
                 <w:lang w:val="en-US"/>
               </w:rPr>
               <w:t xml:space="preserve">RUN </w:t>
@@ -16459,6 +16417,7 @@
               <w:rPr>
                 <w:color w:val="000000"/>
                 <w:sz w:val="24"/>
+                <w:highlight w:val="yellow"/>
               </w:rPr>
               <w:t>от</w:t>
             </w:r>
@@ -16466,6 +16425,7 @@
               <w:rPr>
                 <w:color w:val="000000"/>
                 <w:sz w:val="24"/>
+                <w:highlight w:val="yellow"/>
                 <w:lang w:val="en-US"/>
               </w:rPr>
               <w:t xml:space="preserve"> U_</w:t>
@@ -16475,6 +16435,7 @@
               <w:rPr>
                 <w:color w:val="000000"/>
                 <w:sz w:val="24"/>
+                <w:highlight w:val="yellow"/>
                 <w:lang w:val="en-US"/>
               </w:rPr>
               <w:t>CTRL:A</w:t>
@@ -16484,6 +16445,7 @@
               <w:rPr>
                 <w:color w:val="000000"/>
                 <w:sz w:val="24"/>
+                <w:highlight w:val="yellow"/>
                 <w:lang w:val="en-US"/>
               </w:rPr>
               <w:t xml:space="preserve">, </w:t>
@@ -16492,6 +16454,7 @@
               <w:rPr>
                 <w:color w:val="000000"/>
                 <w:sz w:val="24"/>
+                <w:highlight w:val="yellow"/>
               </w:rPr>
               <w:t>вывод</w:t>
             </w:r>
@@ -16499,6 +16462,7 @@
               <w:rPr>
                 <w:color w:val="000000"/>
                 <w:sz w:val="24"/>
+                <w:highlight w:val="yellow"/>
                 <w:lang w:val="en-US"/>
               </w:rPr>
               <w:t xml:space="preserve"> 5</w:t>
@@ -16517,11 +16481,15 @@
           <w:p>
             <w:pPr>
               <w:spacing w:before="60" w:after="60" w:line="252" w:lineRule="auto"/>
+              <w:rPr>
+                <w:highlight w:val="yellow"/>
+              </w:rPr>
             </w:pPr>
             <w:r>
               <w:rPr>
                 <w:color w:val="000000"/>
                 <w:sz w:val="24"/>
+                <w:highlight w:val="yellow"/>
               </w:rPr>
               <w:t>LM555: 3 OUT</w:t>
             </w:r>
@@ -16534,11 +16502,15 @@
           <w:p>
             <w:pPr>
               <w:spacing w:before="60" w:after="60" w:line="252" w:lineRule="auto"/>
+              <w:rPr>
+                <w:highlight w:val="yellow"/>
+              </w:rPr>
             </w:pPr>
             <w:r>
               <w:rPr>
                 <w:color w:val="000000"/>
                 <w:sz w:val="24"/>
+                <w:highlight w:val="yellow"/>
               </w:rPr>
               <w:t>74LS04: вход 1</w:t>
             </w:r>
@@ -16556,11 +16528,15 @@
           <w:p>
             <w:pPr>
               <w:spacing w:before="60" w:after="60" w:line="252" w:lineRule="auto"/>
+              <w:rPr>
+                <w:highlight w:val="yellow"/>
+              </w:rPr>
             </w:pPr>
             <w:r>
               <w:rPr>
                 <w:color w:val="000000"/>
                 <w:sz w:val="24"/>
+                <w:highlight w:val="yellow"/>
               </w:rPr>
               <w:t>74LS04: выход 2</w:t>
             </w:r>
@@ -16573,11 +16549,15 @@
           <w:p>
             <w:pPr>
               <w:spacing w:before="60" w:after="60" w:line="252" w:lineRule="auto"/>
+              <w:rPr>
+                <w:highlight w:val="yellow"/>
+              </w:rPr>
             </w:pPr>
             <w:r>
               <w:rPr>
                 <w:color w:val="000000"/>
                 <w:sz w:val="24"/>
+                <w:highlight w:val="yellow"/>
               </w:rPr>
               <w:t>CLK → ПСУ и U_CTRL:B, вывод 11</w:t>
             </w:r>
@@ -16595,11 +16575,15 @@
           <w:p>
             <w:pPr>
               <w:spacing w:before="60" w:after="60" w:line="252" w:lineRule="auto"/>
+              <w:rPr>
+                <w:highlight w:val="yellow"/>
+              </w:rPr>
             </w:pPr>
             <w:r>
               <w:rPr>
                 <w:color w:val="000000"/>
                 <w:sz w:val="24"/>
+                <w:highlight w:val="yellow"/>
               </w:rPr>
               <w:t>74LS04: 14; 7</w:t>
             </w:r>
@@ -16612,11 +16596,15 @@
           <w:p>
             <w:pPr>
               <w:spacing w:before="60" w:after="60" w:line="252" w:lineRule="auto"/>
+              <w:rPr>
+                <w:highlight w:val="yellow"/>
+              </w:rPr>
             </w:pPr>
             <w:r>
               <w:rPr>
                 <w:color w:val="000000"/>
                 <w:sz w:val="24"/>
+                <w:highlight w:val="yellow"/>
               </w:rPr>
               <w:t>14 → +5 В; 7 → GND; развязка 100 нФ</w:t>
             </w:r>
@@ -16634,11 +16622,15 @@
           <w:p>
             <w:pPr>
               <w:spacing w:before="60" w:after="60" w:line="252" w:lineRule="auto"/>
+              <w:rPr>
+                <w:highlight w:val="yellow"/>
+              </w:rPr>
             </w:pPr>
             <w:r>
               <w:rPr>
                 <w:color w:val="000000"/>
                 <w:sz w:val="24"/>
+                <w:highlight w:val="yellow"/>
               </w:rPr>
               <w:t>Свободные входы 74LS04</w:t>
             </w:r>
@@ -16656,6 +16648,7 @@
               <w:rPr>
                 <w:color w:val="000000"/>
                 <w:sz w:val="24"/>
+                <w:highlight w:val="yellow"/>
               </w:rPr>
               <w:t>GND; соответствующие выходы свободны</w:t>
             </w:r>
@@ -16685,6 +16678,7 @@
           <w:color w:val="000000"/>
           <w:sz w:val="28"/>
         </w:rPr>
+        <w:lastRenderedPageBreak/>
         <w:t>При RUN = 0 таймер удерживает OUT = 0, поэтому CLK после инвертора равен 1. Нельзя останавливать таймер произвольным асинхронным сигналом при CLK = 0: это создаст лишний положительный фронт.</w:t>
       </w:r>
     </w:p>
@@ -16699,15 +16693,7 @@
           <w:color w:val="000000"/>
           <w:sz w:val="28"/>
         </w:rPr>
-        <w:t xml:space="preserve">Для остановки на последнем состоянии введён блок STOP_UNIT (рисунок 2.18). Прямой комбинационный детектор кода 6 мог бы реагировать на </w:t>
-      </w:r>
-      <w:r>
-        <w:rPr>
-          <w:color w:val="000000"/>
-          <w:sz w:val="28"/>
-        </w:rPr>
-        <w:lastRenderedPageBreak/>
-        <w:t>кратковременные переходные коды. Поэтому сигнал остановки регистрируется отдельным D-триггером на фронте, переводящем ПСУ из 10 в 6.</w:t>
+        <w:t>Для остановки на последнем состоянии введён блок STOP_UNIT (рисунок 2.18). Прямой комбинационный детектор кода 6 мог бы реагировать на кратковременные переходные коды. Поэтому сигнал остановки регистрируется отдельным D-триггером на фронте, переводящем ПСУ из 10 в 6.</w:t>
       </w:r>
     </w:p>
     <w:p>
@@ -16936,10 +16922,10 @@
           <w:noProof/>
         </w:rPr>
         <w:drawing>
-          <wp:inline distT="0" distB="0" distL="0" distR="0" wp14:anchorId="633BDAAE" wp14:editId="0A4124D3">
-            <wp:extent cx="5940000" cy="3074824"/>
-            <wp:effectExtent l="0" t="0" r="0" b="0"/>
-            <wp:docPr id="918597025" name="Picture 918597025" descr="Рисунок 2.18 – Расчётная схема блока STOP_UNIT с регистрацией сигнала остановки"/>
+          <wp:inline distT="0" distB="0" distL="0" distR="0" wp14:anchorId="71B15E87" wp14:editId="3C8449DE">
+            <wp:extent cx="5362575" cy="3333750"/>
+            <wp:effectExtent l="0" t="0" r="9525" b="0"/>
+            <wp:docPr id="18" name="Рисунок 18"/>
             <wp:cNvGraphicFramePr>
               <a:graphicFrameLocks xmlns:a="http://schemas.openxmlformats.org/drawingml/2006/main" noChangeAspect="1"/>
             </wp:cNvGraphicFramePr>
@@ -16947,7 +16933,7 @@
               <a:graphicData uri="http://schemas.openxmlformats.org/drawingml/2006/picture">
                 <pic:pic xmlns:pic="http://schemas.openxmlformats.org/drawingml/2006/picture">
                   <pic:nvPicPr>
-                    <pic:cNvPr id="0" name="fig_2_18.png"/>
+                    <pic:cNvPr id="1" name=""/>
                     <pic:cNvPicPr/>
                   </pic:nvPicPr>
                   <pic:blipFill>
@@ -16959,7 +16945,7 @@
                   <pic:spPr>
                     <a:xfrm>
                       <a:off x="0" y="0"/>
-                      <a:ext cx="5940000" cy="3074824"/>
+                      <a:ext cx="5362575" cy="3333750"/>
                     </a:xfrm>
                     <a:prstGeom prst="rect">
                       <a:avLst/>
@@ -16987,7 +16973,6 @@
         <w:rPr>
           <w:color w:val="000000"/>
           <w:sz w:val="28"/>
-          <w:highlight w:val="yellow"/>
         </w:rPr>
         <w:t>Рисунок 2.18 – Расчётная схема блока STOP_UNIT с регистрацией сигнала остановки</w:t>
       </w:r>
@@ -17028,7 +17013,15 @@
           <w:color w:val="000000"/>
           <w:sz w:val="28"/>
         </w:rPr>
-        <w:t>Инверсный выход NOT_STOP снимает разрешение RUN. В этот момент CLK уже высокий, а OUT таймера низкий, поэтому сброс LM555 сохраняет текущий уровень и не создаёт дополнительного фронта. STOP удерживается до P_RES = 0. Переход 6 → 13 в логике ПСУ остаётся, но в режиме автоматической остановки такт для него не поступает.</w:t>
+        <w:t xml:space="preserve">Инверсный выход NOT_STOP снимает разрешение RUN. В этот момент </w:t>
+      </w:r>
+      <w:r>
+        <w:rPr>
+          <w:color w:val="000000"/>
+          <w:sz w:val="28"/>
+        </w:rPr>
+        <w:lastRenderedPageBreak/>
+        <w:t>CLK уже высокий, а OUT таймера низкий, поэтому сброс LM555 сохраняет текущий уровень и не создаёт дополнительного фронта. STOP удерживается до P_RES = 0. Переход 6 → 13 в логике ПСУ остаётся, но в режиме автоматической остановки такт для него не поступает.</w:t>
       </w:r>
     </w:p>
     <w:p>
@@ -17046,15 +17039,7 @@
           <w:color w:val="000000"/>
           <w:sz w:val="28"/>
         </w:rPr>
-        <w:t xml:space="preserve">P_RES_GEN формирует активную нулём начальную установку (рисунок 2.19). RC-цепь дополнена двумя инверторами Шмитта 74HC14 и буфером 74LS07 </w:t>
-      </w:r>
-      <w:r>
-        <w:rPr>
-          <w:color w:val="000000"/>
-          <w:sz w:val="28"/>
-        </w:rPr>
-        <w:lastRenderedPageBreak/>
-        <w:t xml:space="preserve">с открытым коллектором (OC). Буфер обеспечивает ток сброса нескольких 74AS74; R4 подтягивает P_RES к +5 В. При C4 = 0 В действует сброс; после заряда он снимается. R3C4 = 0,1 с, но длительность импульса зависит от порога </w:t>
+        <w:t xml:space="preserve">P_RES_GEN формирует активную нулём начальную установку (рисунок 2.19). RC-цепь дополнена двумя инверторами Шмитта 74HC14 и буфером 74LS07 с открытым коллектором (OC). Буфер обеспечивает ток сброса нескольких 74AS74; R4 подтягивает P_RES к +5 В. При C4 = 0 В действует сброс; после заряда он снимается. R3C4 = 0,1 с, но длительность импульса зависит от порога </w:t>
       </w:r>
       <w:proofErr w:type="spellStart"/>
       <w:r>
@@ -17096,10 +17081,10 @@
           <w:noProof/>
         </w:rPr>
         <w:drawing>
-          <wp:inline distT="0" distB="0" distL="0" distR="0" wp14:anchorId="002E5D71" wp14:editId="0DC360AA">
-            <wp:extent cx="5580000" cy="2637818"/>
+          <wp:inline distT="0" distB="0" distL="0" distR="0" wp14:anchorId="5FEA5A07" wp14:editId="7F739929">
+            <wp:extent cx="6480810" cy="2883535"/>
             <wp:effectExtent l="0" t="0" r="0" b="0"/>
-            <wp:docPr id="918597026" name="Picture 918597026" descr="Рисунок 2.19 – Расчётная схема блока P_RES_GEN с RC-цепью и формирователем"/>
+            <wp:docPr id="17" name="Рисунок 17"/>
             <wp:cNvGraphicFramePr>
               <a:graphicFrameLocks xmlns:a="http://schemas.openxmlformats.org/drawingml/2006/main" noChangeAspect="1"/>
             </wp:cNvGraphicFramePr>
@@ -17107,7 +17092,7 @@
               <a:graphicData uri="http://schemas.openxmlformats.org/drawingml/2006/picture">
                 <pic:pic xmlns:pic="http://schemas.openxmlformats.org/drawingml/2006/picture">
                   <pic:nvPicPr>
-                    <pic:cNvPr id="0" name="fig_2_19.png"/>
+                    <pic:cNvPr id="1" name=""/>
                     <pic:cNvPicPr/>
                   </pic:nvPicPr>
                   <pic:blipFill>
@@ -17119,7 +17104,7 @@
                   <pic:spPr>
                     <a:xfrm>
                       <a:off x="0" y="0"/>
-                      <a:ext cx="5580000" cy="2637818"/>
+                      <a:ext cx="6480810" cy="2883535"/>
                     </a:xfrm>
                     <a:prstGeom prst="rect">
                       <a:avLst/>
@@ -17147,7 +17132,6 @@
         <w:rPr>
           <w:color w:val="000000"/>
           <w:sz w:val="28"/>
-          <w:highlight w:val="yellow"/>
         </w:rPr>
         <w:t>Рисунок 2.19 – Расчётная схема блока P_RES_GEN с RC-цепью и формирователем</w:t>
       </w:r>
@@ -17188,7 +17172,15 @@
           <w:color w:val="000000"/>
           <w:sz w:val="28"/>
         </w:rPr>
-        <w:t>P_RES также подаётся на /CLR секции B и через AND2 с NOT_STOP — на /CLR секции A. Для запуска: START = 0; дождаться P_RES = 1; подать START: 0 → 1 → 0. Для повторного цикла замкнуть S_RST не менее чем на 5 с, чтобы разрядился и времязадающий C1, затем разомкнуть, дождаться P_RES = 1 и повторить START.</w:t>
+        <w:t xml:space="preserve">P_RES также подаётся на /CLR секции B и через AND2 с NOT_STOP — на </w:t>
+      </w:r>
+      <w:r>
+        <w:rPr>
+          <w:color w:val="000000"/>
+          <w:sz w:val="28"/>
+        </w:rPr>
+        <w:lastRenderedPageBreak/>
+        <w:t>/CLR секции A. Для запуска: START = 0; дождаться P_RES = 1; подать START: 0 → 1 → 0. Для повторного цикла замкнуть S_RST не менее чем на 5 с, чтобы разрядился и времязадающий C1, затем разомкнуть, дождаться P_RES = 1 и повторить START.</w:t>
       </w:r>
     </w:p>
     <w:p>
@@ -17213,6 +17205,7 @@
         <w:rPr>
           <w:color w:val="000000"/>
           <w:sz w:val="28"/>
+          <w:lang w:val="en-US"/>
         </w:rPr>
       </w:pPr>
       <w:r>
@@ -17220,7 +17213,6 @@
           <w:color w:val="000000"/>
           <w:sz w:val="28"/>
         </w:rPr>
-        <w:lastRenderedPageBreak/>
         <w:t>Секция A дополнительного 74AS74 хранит RUN: D = 1, /PRE = 1, CLK = START. Её активный нулём сброс равен P_RES AND NOT_STOP. На рисунке 2.20 объединены таймер, триггеры управления и ПСУ.</w:t>
       </w:r>
     </w:p>
@@ -17248,13 +17240,12 @@
       <w:r>
         <w:rPr>
           <w:noProof/>
-          <w:sz w:val="28"/>
         </w:rPr>
         <w:drawing>
-          <wp:inline distT="0" distB="0" distL="0" distR="0" wp14:anchorId="1B601E79" wp14:editId="622FF1E0">
-            <wp:extent cx="5546475" cy="3454661"/>
-            <wp:effectExtent l="0" t="0" r="0" b="0"/>
-            <wp:docPr id="918597027" name="Picture 918597027" descr="Рисунок 2.20 – Расчётная схема блока CLK_GEN с запуском и остановкой на 6"/>
+          <wp:inline distT="0" distB="0" distL="0" distR="0" wp14:anchorId="5943C0DA" wp14:editId="1BB0B422">
+            <wp:extent cx="6480810" cy="2525395"/>
+            <wp:effectExtent l="0" t="0" r="0" b="8255"/>
+            <wp:docPr id="19" name="Рисунок 19"/>
             <wp:cNvGraphicFramePr>
               <a:graphicFrameLocks xmlns:a="http://schemas.openxmlformats.org/drawingml/2006/main" noChangeAspect="1"/>
             </wp:cNvGraphicFramePr>
@@ -17262,7 +17253,7 @@
               <a:graphicData uri="http://schemas.openxmlformats.org/drawingml/2006/picture">
                 <pic:pic xmlns:pic="http://schemas.openxmlformats.org/drawingml/2006/picture">
                   <pic:nvPicPr>
-                    <pic:cNvPr id="0" name="fig_2_20.png"/>
+                    <pic:cNvPr id="1" name=""/>
                     <pic:cNvPicPr/>
                   </pic:nvPicPr>
                   <pic:blipFill>
@@ -17274,7 +17265,7 @@
                   <pic:spPr>
                     <a:xfrm>
                       <a:off x="0" y="0"/>
-                      <a:ext cx="5551046" cy="3457508"/>
+                      <a:ext cx="6480810" cy="2525395"/>
                     </a:xfrm>
                     <a:prstGeom prst="rect">
                       <a:avLst/>
@@ -17337,30 +17328,77 @@
         <w:spacing w:line="360" w:lineRule="auto"/>
         <w:ind w:right="283" w:firstLine="709"/>
         <w:jc w:val="both"/>
-      </w:pPr>
-      <w:r>
         <w:rPr>
           <w:color w:val="000000"/>
           <w:sz w:val="28"/>
         </w:rPr>
-        <w:t>На тринадцатом положительном фронте после запуска выполняется переход 10 → 6 и снимается RUN. Дальнейшие фронты отсутствуют; HEX показывает 6, активен Y6. Повторный START без P_RES не запускает генератор, поскольку STOP остаётся единицей. U_CTRL:A и U_CTRL:B занимают обе секции одного дополнительного корпуса 74AS74.</w:t>
-      </w:r>
+      </w:pPr>
+      <w:r>
+        <w:rPr>
+          <w:color w:val="000000"/>
+          <w:sz w:val="28"/>
+        </w:rPr>
+        <w:t xml:space="preserve">На тринадцатом положительном фронте после запуска выполняется переход 10 → 6 и снимается RUN. Дальнейшие фронты отсутствуют; HEX показывает 6, </w:t>
+      </w:r>
+      <w:r>
+        <w:rPr>
+          <w:color w:val="000000"/>
+          <w:sz w:val="28"/>
+        </w:rPr>
+        <w:lastRenderedPageBreak/>
+        <w:t>активен Y6. Повторный START без P_RES не запускает генератор, поскольку STOP остаётся единицей. U_</w:t>
+      </w:r>
+      <w:proofErr w:type="gramStart"/>
+      <w:r>
+        <w:rPr>
+          <w:color w:val="000000"/>
+          <w:sz w:val="28"/>
+        </w:rPr>
+        <w:t>CTRL:A</w:t>
+      </w:r>
+      <w:proofErr w:type="gramEnd"/>
+      <w:r>
+        <w:rPr>
+          <w:color w:val="000000"/>
+          <w:sz w:val="28"/>
+        </w:rPr>
+        <w:t xml:space="preserve"> и U_CTRL:B занимают обе секции одного дополнительного корпуса 74AS74.</w:t>
+      </w:r>
+    </w:p>
+    <w:p>
+      <w:pPr>
+        <w:spacing w:line="360" w:lineRule="auto"/>
+        <w:ind w:right="283" w:firstLine="709"/>
+        <w:jc w:val="both"/>
+      </w:pPr>
     </w:p>
     <w:p>
       <w:pPr>
         <w:pStyle w:val="1"/>
         <w:keepNext/>
-        <w:pageBreakBefore/>
         <w:spacing w:before="200" w:after="160" w:line="276" w:lineRule="auto"/>
         <w:ind w:right="283" w:firstLine="709"/>
-      </w:pPr>
-      <w:r>
         <w:rPr>
           <w:color w:val="000000"/>
         </w:rPr>
-        <w:lastRenderedPageBreak/>
+      </w:pPr>
+      <w:r>
+        <w:rPr>
+          <w:color w:val="000000"/>
+        </w:rPr>
         <w:t>2.3.3 Временные диаграммы выходного сигнала таймера и D-триггера</w:t>
       </w:r>
+    </w:p>
+    <w:p>
+      <w:pPr>
+        <w:spacing w:line="360" w:lineRule="auto"/>
+        <w:ind w:right="283" w:firstLine="709"/>
+        <w:jc w:val="both"/>
+        <w:rPr>
+          <w:color w:val="000000"/>
+          <w:sz w:val="28"/>
+        </w:rPr>
+      </w:pPr>
     </w:p>
     <w:p>
       <w:pPr>
@@ -17495,6 +17533,7 @@
           <w:color w:val="000000"/>
           <w:sz w:val="28"/>
         </w:rPr>
+        <w:lastRenderedPageBreak/>
         <w:t>Проверка остановки выполняется отдельно: после 13 положительных фронтов относительно начального кода 13 должны наблюдаться HEX = 6, Y6 = 1, STOP = 1, RUN = 0 и неизменный CLK = 1. Необходимо также проверить отсутствие самопроизвольной остановки при переходе 7 → 8 и невозможность повторного запуска без общей начальной установки.</w:t>
       </w:r>
     </w:p>
@@ -17513,7 +17552,6 @@
           <w:color w:val="000000"/>
           <w:sz w:val="28"/>
         </w:rPr>
-        <w:lastRenderedPageBreak/>
         <w:t>Для измерения длительности высокого уровня курсор T1 устанавливается на положительный фронт CLK, T2 — на следующий отрицательный фронт. На рисунке 2.22 начало относительного отсчёта совмещено с установившимся положительным фронтом; курсоры в реальной записи будут иметь другое абсолютное время.</w:t>
       </w:r>
     </w:p>
@@ -17632,7 +17670,15 @@
           <w:color w:val="000000"/>
           <w:sz w:val="28"/>
         </w:rPr>
-        <w:t>Для отчёта эту иллюстрацию следует заменить собственным снимком XSC1 с видимыми курсорами и полем разности времени. Если измеренная длительность заметно отличается, сначала проверяется точка CLK после инвертора, затем номиналы R2 и C1. Одного визуального сходства формы сигнала недостаточно.</w:t>
+        <w:t xml:space="preserve">Для отчёта эту иллюстрацию следует заменить собственным снимком XSC1 с видимыми курсорами и полем разности времени. Если измеренная длительность </w:t>
+      </w:r>
+      <w:r>
+        <w:rPr>
+          <w:color w:val="000000"/>
+          <w:sz w:val="28"/>
+        </w:rPr>
+        <w:lastRenderedPageBreak/>
+        <w:t>заметно отличается, сначала проверяется точка CLK после инвертора, затем номиналы R2 и C1. Одного визуального сходства формы сигнала недостаточно.</w:t>
       </w:r>
     </w:p>
     <w:p>
@@ -17670,7 +17716,6 @@
         <w:rPr>
           <w:noProof/>
         </w:rPr>
-        <w:lastRenderedPageBreak/>
         <w:drawing>
           <wp:inline distT="0" distB="0" distL="0" distR="0" wp14:anchorId="640689DB" wp14:editId="69E381DB">
             <wp:extent cx="5940000" cy="3041566"/>

</xml_diff>

<commit_message>
project: save revised CLK_GEN with active-low start
</commit_message>
<xml_diff>
--- a/deliverables/Курсовая_Блинов_текущая.docx
+++ b/deliverables/Курсовая_Блинов_текущая.docx
@@ -145,7 +145,6 @@
           <w:sz w:val="24"/>
         </w:rPr>
       </w:pPr>
-      <w:proofErr w:type="gramStart"/>
       <w:r>
         <w:rPr>
           <w:b/>
@@ -168,7 +167,6 @@
         </w:rPr>
         <w:t>Н</w:t>
       </w:r>
-      <w:proofErr w:type="gramEnd"/>
       <w:r>
         <w:rPr>
           <w:b/>
@@ -390,7 +388,6 @@
         <w:ind w:right="285"/>
         <w:jc w:val="center"/>
       </w:pPr>
-      <w:proofErr w:type="gramStart"/>
       <w:r>
         <w:rPr>
           <w:b/>
@@ -417,7 +414,6 @@
         </w:rPr>
         <w:t>информационных</w:t>
       </w:r>
-      <w:proofErr w:type="gramEnd"/>
       <w:r>
         <w:rPr>
           <w:spacing w:val="-5"/>
@@ -1549,21 +1545,12 @@
         </w:rPr>
         <w:t xml:space="preserve"> </w:t>
       </w:r>
-      <w:proofErr w:type="spellStart"/>
       <w:r>
         <w:rPr>
           <w:spacing w:val="-2"/>
           <w:sz w:val="28"/>
         </w:rPr>
-        <w:t>Multisim</w:t>
-      </w:r>
-      <w:proofErr w:type="spellEnd"/>
-      <w:r>
-        <w:rPr>
-          <w:spacing w:val="-2"/>
-          <w:sz w:val="28"/>
-        </w:rPr>
-        <w:t>.</w:t>
+        <w:t>Multisim.</w:t>
       </w:r>
     </w:p>
     <w:p>
@@ -1736,21 +1723,12 @@
         </w:rPr>
         <w:t xml:space="preserve"> </w:t>
       </w:r>
-      <w:proofErr w:type="spellStart"/>
       <w:r>
         <w:rPr>
           <w:spacing w:val="-2"/>
           <w:sz w:val="28"/>
         </w:rPr>
-        <w:t>Multisim</w:t>
-      </w:r>
-      <w:proofErr w:type="spellEnd"/>
-      <w:r>
-        <w:rPr>
-          <w:spacing w:val="-2"/>
-          <w:sz w:val="28"/>
-        </w:rPr>
-        <w:t>.</w:t>
+        <w:t>Multisim.</w:t>
       </w:r>
     </w:p>
     <w:p>
@@ -2832,14 +2810,7 @@
             <w:rPr>
               <w:sz w:val="28"/>
             </w:rPr>
-            <w:t xml:space="preserve">выполнить синтез дешифратора (DC) выходных состояний, формирующего управляющие сигналы </w:t>
-          </w:r>
-          <w:proofErr w:type="spellStart"/>
-          <w:r>
-            <w:rPr>
-              <w:sz w:val="28"/>
-            </w:rPr>
-            <w:t>Y</w:t>
+            <w:t>выполнить синтез дешифратора (DC) выходных состояний, формирующего управляющие сигналы Y</w:t>
           </w:r>
           <w:r>
             <w:rPr>
@@ -2848,7 +2819,6 @@
             </w:rPr>
             <w:t>i</w:t>
           </w:r>
-          <w:proofErr w:type="spellEnd"/>
           <w:r>
             <w:rPr>
               <w:sz w:val="28"/>
@@ -4370,23 +4340,7 @@
                 <w:rFonts w:ascii="Times New Roman" w:hAnsi="Times New Roman"/>
                 <w:sz w:val="24"/>
               </w:rPr>
-              <w:t>цифровая (шестнадцатеричный код) светодиодная (</w:t>
-            </w:r>
-            <w:proofErr w:type="spellStart"/>
-            <w:r>
-              <w:rPr>
-                <w:rFonts w:ascii="Times New Roman" w:hAnsi="Times New Roman"/>
-                <w:sz w:val="24"/>
-              </w:rPr>
-              <w:t>probes</w:t>
-            </w:r>
-            <w:proofErr w:type="spellEnd"/>
-            <w:r>
-              <w:rPr>
-                <w:rFonts w:ascii="Times New Roman" w:hAnsi="Times New Roman"/>
-                <w:sz w:val="24"/>
-              </w:rPr>
-              <w:t>)</w:t>
+              <w:t>цифровая (шестнадцатеричный код) светодиодная (probes)</w:t>
             </w:r>
           </w:p>
         </w:tc>
@@ -4830,15 +4784,7 @@
       </w:pPr>
       <w:r>
         <w:lastRenderedPageBreak/>
-        <w:t xml:space="preserve">Количество триггеров, необходимых для работы устройства, определяется разрядностью кодов состояний. Для модуля счета M = 14 необходимое число триггеров вычисляется по формуле N = </w:t>
-      </w:r>
-      <w:proofErr w:type="spellStart"/>
-      <w:r>
-        <w:t>log₂M</w:t>
-      </w:r>
-      <w:proofErr w:type="spellEnd"/>
-      <w:r>
-        <w:t>. Подставив в формулу (1.1) значение M и округлив результат вверх, рассчитаем N:</w:t>
+        <w:t>Количество триггеров, необходимых для работы устройства, определяется разрядностью кодов состояний. Для модуля счета M = 14 необходимое число триггеров вычисляется по формуле N = log₂M. Подставив в формулу (1.1) значение M и округлив результат вверх, рассчитаем N:</w:t>
       </w:r>
     </w:p>
     <w:tbl>
@@ -4920,15 +4866,7 @@
         <w:jc w:val="both"/>
       </w:pPr>
       <w:r>
-        <w:t xml:space="preserve">Микросхема 74AS74 (SN74AS74A) представляет собой два D-триггера с переключением по положительному фронту тактового сигнала. Каждый триггер имеет отдельные входы D и CLK, асинхронные входы установки PRE и сброса CLR, прямой выход Q и инверсный выход Q̅. </w:t>
-      </w:r>
-      <w:proofErr w:type="spellStart"/>
-      <w:r>
-        <w:t>Распиновка</w:t>
-      </w:r>
-      <w:proofErr w:type="spellEnd"/>
-      <w:r>
-        <w:t xml:space="preserve"> микросхемы 74AS74 представлена на рисунке 1.2.</w:t>
+        <w:t>Микросхема 74AS74 (SN74AS74A) представляет собой два D-триггера с переключением по положительному фронту тактового сигнала. Каждый триггер имеет отдельные входы D и CLK, асинхронные входы установки PRE и сброса CLR, прямой выход Q и инверсный выход Q̅. Распиновка микросхемы 74AS74 представлена на рисунке 1.2.</w:t>
       </w:r>
     </w:p>
     <w:p>
@@ -4996,21 +4934,7 @@
         <w:rPr>
           <w:highlight w:val="yellow"/>
         </w:rPr>
-        <w:t xml:space="preserve">Рисунок 1.2 – </w:t>
-      </w:r>
-      <w:proofErr w:type="spellStart"/>
-      <w:r>
-        <w:rPr>
-          <w:highlight w:val="yellow"/>
-        </w:rPr>
-        <w:t>Распиновка</w:t>
-      </w:r>
-      <w:proofErr w:type="spellEnd"/>
-      <w:r>
-        <w:rPr>
-          <w:highlight w:val="yellow"/>
-        </w:rPr>
-        <w:t xml:space="preserve"> микросхемы 74AS74</w:t>
+        <w:t>Рисунок 1.2 – Распиновка микросхемы 74AS74</w:t>
       </w:r>
     </w:p>
     <w:p>
@@ -10430,21 +10354,7 @@
         <w:rPr>
           <w:sz w:val="28"/>
         </w:rPr>
-        <w:t xml:space="preserve">На рисунке 2.3 представлена функциональная схема блока </w:t>
-      </w:r>
-      <w:proofErr w:type="spellStart"/>
-      <w:r>
-        <w:rPr>
-          <w:sz w:val="28"/>
-        </w:rPr>
-        <w:t>Logic_D</w:t>
-      </w:r>
-      <w:proofErr w:type="spellEnd"/>
-      <w:r>
-        <w:rPr>
-          <w:sz w:val="28"/>
-        </w:rPr>
-        <w:t>, реализованная по выражениям (1.2)–(1.5). Элементы И формируют конъюнктивные члены МДНФ, а элементы ИЛИ объединяют их и формируют сигналы D3…D0 для входов регистра состояния.</w:t>
+        <w:t>На рисунке 2.3 представлена функциональная схема блока Logic_D, реализованная по выражениям (1.2)–(1.5). Элементы И формируют конъюнктивные члены МДНФ, а элементы ИЛИ объединяют их и формируют сигналы D3…D0 для входов регистра состояния.</w:t>
       </w:r>
     </w:p>
     <w:p>
@@ -10612,16 +10522,8 @@
         <w:rPr>
           <w:sz w:val="28"/>
         </w:rPr>
-        <w:t xml:space="preserve">Рисунок 2.4 – Функциональная схема блока </w:t>
-      </w:r>
-      <w:proofErr w:type="spellStart"/>
-      <w:r>
-        <w:rPr>
-          <w:sz w:val="28"/>
-        </w:rPr>
-        <w:t>D_Counter</w:t>
-      </w:r>
-      <w:proofErr w:type="spellEnd"/>
+        <w:t>Рисунок 2.4 – Функциональная схема блока D_Counter</w:t>
+      </w:r>
     </w:p>
     <w:p>
       <w:pPr>
@@ -10643,21 +10545,7 @@
         <w:rPr>
           <w:sz w:val="28"/>
         </w:rPr>
-        <w:t xml:space="preserve">Обратные связи с выходов Q3…Q0 и /Q3…/Q0 возвращаются на вход блока </w:t>
-      </w:r>
-      <w:proofErr w:type="spellStart"/>
-      <w:r>
-        <w:rPr>
-          <w:sz w:val="28"/>
-        </w:rPr>
-        <w:t>Logic_D</w:t>
-      </w:r>
-      <w:proofErr w:type="spellEnd"/>
-      <w:r>
-        <w:rPr>
-          <w:sz w:val="28"/>
-        </w:rPr>
-        <w:t>. В результате перед каждым активным фронтом вычисляется код следующего состояния, который затем одновременно записывается во все четыре D-триггера.</w:t>
+        <w:t>Обратные связи с выходов Q3…Q0 и /Q3…/Q0 возвращаются на вход блока Logic_D. В результате перед каждым активным фронтом вычисляется код следующего состояния, который затем одновременно записывается во все четыре D-триггера.</w:t>
       </w:r>
     </w:p>
     <w:p>
@@ -10964,23 +10852,7 @@
           <w:color w:val="000000"/>
           <w:sz w:val="28"/>
         </w:rPr>
-        <w:t xml:space="preserve">3. Индикация выходных состояний — светодиодная, с помощью </w:t>
-      </w:r>
-      <w:proofErr w:type="spellStart"/>
-      <w:r>
-        <w:rPr>
-          <w:color w:val="000000"/>
-          <w:sz w:val="28"/>
-        </w:rPr>
-        <w:t>Probe</w:t>
-      </w:r>
-      <w:proofErr w:type="spellEnd"/>
-      <w:r>
-        <w:rPr>
-          <w:color w:val="000000"/>
-          <w:sz w:val="28"/>
-        </w:rPr>
-        <w:t>.</w:t>
+        <w:t>3. Индикация выходных состояний — светодиодная, с помощью Probe.</w:t>
       </w:r>
     </w:p>
     <w:p>
@@ -14161,23 +14033,7 @@
           <w:color w:val="000000"/>
           <w:sz w:val="28"/>
         </w:rPr>
-        <w:t xml:space="preserve">На неиспользуемом коде 1 активны Y0, Y3, Y5 и Y9; на коде 15 — Y7, Y11, Y13 и Y14. Это результат минимизации с факультативными наборами. Кратковременные выбросы при переключениях на расчётной диаграмме не изображены; унитарность проверяется после установления уровней. Фактическую запись XLA необходимо получить в </w:t>
-      </w:r>
-      <w:proofErr w:type="spellStart"/>
-      <w:r>
-        <w:rPr>
-          <w:color w:val="000000"/>
-          <w:sz w:val="28"/>
-        </w:rPr>
-        <w:t>Multisim</w:t>
-      </w:r>
-      <w:proofErr w:type="spellEnd"/>
-      <w:r>
-        <w:rPr>
-          <w:color w:val="000000"/>
-          <w:sz w:val="28"/>
-        </w:rPr>
-        <w:t>.</w:t>
+        <w:t>На неиспользуемом коде 1 активны Y0, Y3, Y5 и Y9; на коде 15 — Y7, Y11, Y13 и Y14. Это результат минимизации с факультативными наборами. Кратковременные выбросы при переключениях на расчётной диаграмме не изображены; унитарность проверяется после установления уровней. Фактическую запись XLA необходимо получить в Multisim.</w:t>
       </w:r>
     </w:p>
     <w:p>
@@ -14502,25 +14358,7 @@
           <w:sz w:val="28"/>
           <w:highlight w:val="yellow"/>
         </w:rPr>
-        <w:t xml:space="preserve">Рисунок 2.14 – Базовая схема </w:t>
-      </w:r>
-      <w:proofErr w:type="spellStart"/>
-      <w:r>
-        <w:rPr>
-          <w:color w:val="000000"/>
-          <w:sz w:val="28"/>
-          <w:highlight w:val="yellow"/>
-        </w:rPr>
-        <w:t>астабильного</w:t>
-      </w:r>
-      <w:proofErr w:type="spellEnd"/>
-      <w:r>
-        <w:rPr>
-          <w:color w:val="000000"/>
-          <w:sz w:val="28"/>
-          <w:highlight w:val="yellow"/>
-        </w:rPr>
-        <w:t xml:space="preserve"> включения LM555</w:t>
+        <w:t>Рисунок 2.14 – Базовая схема астабильного включения LM555</w:t>
       </w:r>
     </w:p>
     <w:p>
@@ -14564,8 +14402,8 @@
           <w:noProof/>
         </w:rPr>
         <w:drawing>
-          <wp:inline distT="0" distB="0" distL="0" distR="0" wp14:anchorId="23FD7E68" wp14:editId="25691A7C">
-            <wp:extent cx="4152900" cy="3358432"/>
+          <wp:inline distT="0" distB="0" distL="0" distR="0" wp14:anchorId="23FD7E68" wp14:editId="197D1648">
+            <wp:extent cx="2900855" cy="3357880"/>
             <wp:effectExtent l="0" t="0" r="0" b="0"/>
             <wp:docPr id="11" name="Рисунок 11"/>
             <wp:cNvGraphicFramePr>
@@ -14578,20 +14416,27 @@
                     <pic:cNvPr id="1" name=""/>
                     <pic:cNvPicPr/>
                   </pic:nvPicPr>
-                  <pic:blipFill>
+                  <pic:blipFill rotWithShape="1">
                     <a:blip r:embed="rId27"/>
-                    <a:stretch>
-                      <a:fillRect/>
-                    </a:stretch>
+                    <a:srcRect r="30137"/>
+                    <a:stretch/>
                   </pic:blipFill>
-                  <pic:spPr>
+                  <pic:spPr bwMode="auto">
                     <a:xfrm>
                       <a:off x="0" y="0"/>
-                      <a:ext cx="4155915" cy="3360870"/>
+                      <a:ext cx="2901332" cy="3358432"/>
                     </a:xfrm>
                     <a:prstGeom prst="rect">
                       <a:avLst/>
                     </a:prstGeom>
+                    <a:ln>
+                      <a:noFill/>
+                    </a:ln>
+                    <a:extLst>
+                      <a:ext uri="{53640926-AAD7-44D8-BBD7-CCE9431645EC}">
+                        <a14:shadowObscured xmlns:a14="http://schemas.microsoft.com/office/drawing/2010/main"/>
+                      </a:ext>
+                    </a:extLst>
                   </pic:spPr>
                 </pic:pic>
               </a:graphicData>
@@ -16428,27 +16273,7 @@
                 <w:highlight w:val="yellow"/>
                 <w:lang w:val="en-US"/>
               </w:rPr>
-              <w:t xml:space="preserve"> U_</w:t>
-            </w:r>
-            <w:proofErr w:type="gramStart"/>
-            <w:r>
-              <w:rPr>
-                <w:color w:val="000000"/>
-                <w:sz w:val="24"/>
-                <w:highlight w:val="yellow"/>
-                <w:lang w:val="en-US"/>
-              </w:rPr>
-              <w:t>CTRL:A</w:t>
-            </w:r>
-            <w:proofErr w:type="gramEnd"/>
-            <w:r>
-              <w:rPr>
-                <w:color w:val="000000"/>
-                <w:sz w:val="24"/>
-                <w:highlight w:val="yellow"/>
-                <w:lang w:val="en-US"/>
-              </w:rPr>
-              <w:t xml:space="preserve">, </w:t>
+              <w:t xml:space="preserve"> U_CTRL:A, </w:t>
             </w:r>
             <w:r>
               <w:rPr>
@@ -17039,23 +16864,7 @@
           <w:color w:val="000000"/>
           <w:sz w:val="28"/>
         </w:rPr>
-        <w:t xml:space="preserve">P_RES_GEN формирует активную нулём начальную установку (рисунок 2.19). RC-цепь дополнена двумя инверторами Шмитта 74HC14 и буфером 74LS07 с открытым коллектором (OC). Буфер обеспечивает ток сброса нескольких 74AS74; R4 подтягивает P_RES к +5 В. При C4 = 0 В действует сброс; после заряда он снимается. R3C4 = 0,1 с, но длительность импульса зависит от порога </w:t>
-      </w:r>
-      <w:proofErr w:type="spellStart"/>
-      <w:r>
-        <w:rPr>
-          <w:color w:val="000000"/>
-          <w:sz w:val="28"/>
-        </w:rPr>
-        <w:t>Шмитта</w:t>
-      </w:r>
-      <w:proofErr w:type="spellEnd"/>
-      <w:r>
-        <w:rPr>
-          <w:color w:val="000000"/>
-          <w:sz w:val="28"/>
-        </w:rPr>
-        <w:t>.</w:t>
+        <w:t>P_RES_GEN формирует активную нулём начальную установку (рисунок 2.19). RC-цепь дополнена двумя инверторами Шмитта 74HC14 и буфером 74LS07 с открытым коллектором (OC). Буфер обеспечивает ток сброса нескольких 74AS74; R4 подтягивает P_RES к +5 В. При C4 = 0 В действует сброс; после заряда он снимается. R3C4 = 0,1 с, но длительность импульса зависит от порога Шмитта.</w:t>
       </w:r>
     </w:p>
     <w:p>
@@ -17080,6 +16889,7 @@
         <w:rPr>
           <w:noProof/>
         </w:rPr>
+        <w:lastRenderedPageBreak/>
         <w:drawing>
           <wp:inline distT="0" distB="0" distL="0" distR="0" wp14:anchorId="5FEA5A07" wp14:editId="7F739929">
             <wp:extent cx="6480810" cy="2883535"/>
@@ -17119,121 +16929,12 @@
     </w:p>
     <w:p>
       <w:pPr>
+        <w:keepNext/>
         <w:keepLines/>
-        <w:spacing w:after="160" w:line="276" w:lineRule="auto"/>
+        <w:spacing w:after="80"/>
         <w:ind w:right="283"/>
         <w:jc w:val="center"/>
         <w:rPr>
-          <w:color w:val="000000"/>
-          <w:sz w:val="28"/>
-        </w:rPr>
-      </w:pPr>
-      <w:r>
-        <w:rPr>
-          <w:color w:val="000000"/>
-          <w:sz w:val="28"/>
-        </w:rPr>
-        <w:t>Рисунок 2.19 – Расчётная схема блока P_RES_GEN с RC-цепью и формирователем</w:t>
-      </w:r>
-    </w:p>
-    <w:p>
-      <w:pPr>
-        <w:keepLines/>
-        <w:spacing w:after="160" w:line="276" w:lineRule="auto"/>
-        <w:ind w:right="283"/>
-        <w:jc w:val="center"/>
-        <w:rPr>
-          <w:sz w:val="28"/>
-        </w:rPr>
-      </w:pPr>
-    </w:p>
-    <w:p>
-      <w:pPr>
-        <w:spacing w:line="360" w:lineRule="auto"/>
-        <w:ind w:right="283" w:firstLine="709"/>
-        <w:jc w:val="both"/>
-      </w:pPr>
-      <w:r>
-        <w:rPr>
-          <w:color w:val="000000"/>
-          <w:sz w:val="28"/>
-        </w:rPr>
-        <w:t>При P_RES = 0 устанавливаются Q3Q2Q1Q0 = 1101, STOP = 0 и RUN = 0. Для единичных разрядов Q3, Q2, Q0 общий сигнал подаётся на /PRE, а /CLR удерживается в единице. Для Q1 он подаётся на /CLR, а /PRE удерживается в единице. Одновременный ноль на /PRE и /CLR одного триггера недопустим.</w:t>
-      </w:r>
-    </w:p>
-    <w:p>
-      <w:pPr>
-        <w:spacing w:line="360" w:lineRule="auto"/>
-        <w:ind w:right="283" w:firstLine="709"/>
-        <w:jc w:val="both"/>
-      </w:pPr>
-      <w:r>
-        <w:rPr>
-          <w:color w:val="000000"/>
-          <w:sz w:val="28"/>
-        </w:rPr>
-        <w:t xml:space="preserve">P_RES также подаётся на /CLR секции B и через AND2 с NOT_STOP — на </w:t>
-      </w:r>
-      <w:r>
-        <w:rPr>
-          <w:color w:val="000000"/>
-          <w:sz w:val="28"/>
-        </w:rPr>
-        <w:lastRenderedPageBreak/>
-        <w:t>/CLR секции A. Для запуска: START = 0; дождаться P_RES = 1; подать START: 0 → 1 → 0. Для повторного цикла замкнуть S_RST не менее чем на 5 с, чтобы разрядился и времязадающий C1, затем разомкнуть, дождаться P_RES = 1 и повторить START.</w:t>
-      </w:r>
-    </w:p>
-    <w:p>
-      <w:pPr>
-        <w:spacing w:line="360" w:lineRule="auto"/>
-        <w:ind w:right="283" w:firstLine="709"/>
-        <w:jc w:val="both"/>
-      </w:pPr>
-      <w:r>
-        <w:rPr>
-          <w:color w:val="000000"/>
-          <w:sz w:val="28"/>
-        </w:rPr>
-        <w:t>В Multisim задать C4: IC = 0 В и проверить импульс P_RES; прежний цифровой источник отключить. Для физического устройства отдельно проверить нарастание питания и дребезг кнопок.</w:t>
-      </w:r>
-    </w:p>
-    <w:p>
-      <w:pPr>
-        <w:spacing w:line="360" w:lineRule="auto"/>
-        <w:ind w:right="283" w:firstLine="709"/>
-        <w:jc w:val="both"/>
-        <w:rPr>
-          <w:color w:val="000000"/>
-          <w:sz w:val="28"/>
-          <w:lang w:val="en-US"/>
-        </w:rPr>
-      </w:pPr>
-      <w:r>
-        <w:rPr>
-          <w:color w:val="000000"/>
-          <w:sz w:val="28"/>
-        </w:rPr>
-        <w:t>Секция A дополнительного 74AS74 хранит RUN: D = 1, /PRE = 1, CLK = START. Её активный нулём сброс равен P_RES AND NOT_STOP. На рисунке 2.20 объединены таймер, триггеры управления и ПСУ.</w:t>
-      </w:r>
-    </w:p>
-    <w:p>
-      <w:pPr>
-        <w:spacing w:line="360" w:lineRule="auto"/>
-        <w:ind w:right="283" w:firstLine="709"/>
-        <w:jc w:val="both"/>
-        <w:rPr>
-          <w:color w:val="000000"/>
-          <w:sz w:val="28"/>
-        </w:rPr>
-      </w:pPr>
-    </w:p>
-    <w:p>
-      <w:pPr>
-        <w:keepLines/>
-        <w:spacing w:after="160" w:line="276" w:lineRule="auto"/>
-        <w:ind w:right="283"/>
-        <w:jc w:val="center"/>
-        <w:rPr>
           <w:sz w:val="28"/>
         </w:rPr>
       </w:pPr>
@@ -17242,10 +16943,10 @@
           <w:noProof/>
         </w:rPr>
         <w:drawing>
-          <wp:inline distT="0" distB="0" distL="0" distR="0" wp14:anchorId="5943C0DA" wp14:editId="1BB0B422">
-            <wp:extent cx="6480810" cy="2525395"/>
-            <wp:effectExtent l="0" t="0" r="0" b="8255"/>
-            <wp:docPr id="19" name="Рисунок 19"/>
+          <wp:inline distT="0" distB="0" distL="0" distR="0" wp14:anchorId="73910802" wp14:editId="302F38F3">
+            <wp:extent cx="3113361" cy="3094643"/>
+            <wp:effectExtent l="0" t="0" r="0" b="0"/>
+            <wp:docPr id="4" name="Рисунок 4"/>
             <wp:cNvGraphicFramePr>
               <a:graphicFrameLocks xmlns:a="http://schemas.openxmlformats.org/drawingml/2006/main" noChangeAspect="1"/>
             </wp:cNvGraphicFramePr>
@@ -17265,6 +16966,167 @@
                   <pic:spPr>
                     <a:xfrm>
                       <a:off x="0" y="0"/>
+                      <a:ext cx="3122418" cy="3103645"/>
+                    </a:xfrm>
+                    <a:prstGeom prst="rect">
+                      <a:avLst/>
+                    </a:prstGeom>
+                  </pic:spPr>
+                </pic:pic>
+              </a:graphicData>
+            </a:graphic>
+          </wp:inline>
+        </w:drawing>
+      </w:r>
+    </w:p>
+    <w:p>
+      <w:pPr>
+        <w:keepLines/>
+        <w:spacing w:after="160" w:line="276" w:lineRule="auto"/>
+        <w:ind w:right="283"/>
+        <w:jc w:val="center"/>
+        <w:rPr>
+          <w:color w:val="000000"/>
+          <w:sz w:val="28"/>
+        </w:rPr>
+      </w:pPr>
+      <w:r>
+        <w:rPr>
+          <w:color w:val="000000"/>
+          <w:sz w:val="28"/>
+          <w:highlight w:val="yellow"/>
+        </w:rPr>
+        <w:t>Рисунок 2.19 – Расчётная схема блока P_RES_GEN с RC-цепью и формирователем</w:t>
+      </w:r>
+    </w:p>
+    <w:p>
+      <w:pPr>
+        <w:keepLines/>
+        <w:spacing w:after="160" w:line="276" w:lineRule="auto"/>
+        <w:ind w:right="283"/>
+        <w:jc w:val="center"/>
+        <w:rPr>
+          <w:sz w:val="28"/>
+        </w:rPr>
+      </w:pPr>
+    </w:p>
+    <w:p>
+      <w:pPr>
+        <w:spacing w:line="360" w:lineRule="auto"/>
+        <w:ind w:right="283" w:firstLine="709"/>
+        <w:jc w:val="both"/>
+      </w:pPr>
+      <w:r>
+        <w:rPr>
+          <w:color w:val="000000"/>
+          <w:sz w:val="28"/>
+        </w:rPr>
+        <w:t>При P_RES = 0 устанавливаются Q3Q2Q1Q0 = 1101, STOP = 0 и RUN = 0. Для единичных разрядов Q3, Q2, Q0 общий сигнал подаётся на /PRE, а /CLR удерживается в единице. Для Q1 он подаётся на /CLR, а /PRE удерживается в единице. Одновременный ноль на /PRE и /CLR одного триггера недопустим.</w:t>
+      </w:r>
+    </w:p>
+    <w:p>
+      <w:pPr>
+        <w:spacing w:line="360" w:lineRule="auto"/>
+        <w:ind w:right="283" w:firstLine="709"/>
+        <w:jc w:val="both"/>
+      </w:pPr>
+      <w:r>
+        <w:rPr>
+          <w:color w:val="000000"/>
+          <w:sz w:val="28"/>
+        </w:rPr>
+        <w:t xml:space="preserve">P_RES также подаётся на /CLR секции B и через AND2 с NOT_STOP — на /CLR секции A. Для запуска: START = 0; дождаться P_RES = 1; подать START: 0 </w:t>
+      </w:r>
+      <w:r>
+        <w:rPr>
+          <w:color w:val="000000"/>
+          <w:sz w:val="28"/>
+        </w:rPr>
+        <w:lastRenderedPageBreak/>
+        <w:t>→ 1 → 0. Для повторного цикла замкнуть S_RST не менее чем на 5 с, чтобы разрядился и времязадающий C1, затем разомкнуть, дождаться P_RES = 1 и повторить START.</w:t>
+      </w:r>
+    </w:p>
+    <w:p>
+      <w:pPr>
+        <w:spacing w:line="360" w:lineRule="auto"/>
+        <w:ind w:right="283" w:firstLine="709"/>
+        <w:jc w:val="both"/>
+      </w:pPr>
+      <w:r>
+        <w:rPr>
+          <w:color w:val="000000"/>
+          <w:sz w:val="28"/>
+        </w:rPr>
+        <w:t>В Multisim задать C4: IC = 0 В и проверить импульс P_RES; прежний цифровой источник отключить. Для физического устройства отдельно проверить нарастание питания и дребезг кнопок.</w:t>
+      </w:r>
+    </w:p>
+    <w:p>
+      <w:pPr>
+        <w:spacing w:line="360" w:lineRule="auto"/>
+        <w:ind w:right="283" w:firstLine="709"/>
+        <w:jc w:val="both"/>
+        <w:rPr>
+          <w:color w:val="000000"/>
+          <w:sz w:val="28"/>
+        </w:rPr>
+      </w:pPr>
+      <w:r>
+        <w:rPr>
+          <w:color w:val="000000"/>
+          <w:sz w:val="28"/>
+        </w:rPr>
+        <w:t>Секция A дополнительного 74AS74 хранит RUN: D = 1, /PRE = 1, CLK = START. Её активный нулём сброс равен P_RES AND NOT_STOP. На рисунке 2.20 объединены таймер, триггеры управления и ПСУ.</w:t>
+      </w:r>
+    </w:p>
+    <w:p>
+      <w:pPr>
+        <w:spacing w:line="360" w:lineRule="auto"/>
+        <w:ind w:right="283" w:firstLine="709"/>
+        <w:jc w:val="both"/>
+        <w:rPr>
+          <w:color w:val="000000"/>
+          <w:sz w:val="28"/>
+        </w:rPr>
+      </w:pPr>
+    </w:p>
+    <w:p>
+      <w:pPr>
+        <w:keepLines/>
+        <w:spacing w:after="160" w:line="276" w:lineRule="auto"/>
+        <w:ind w:right="283"/>
+        <w:jc w:val="center"/>
+        <w:rPr>
+          <w:sz w:val="28"/>
+        </w:rPr>
+      </w:pPr>
+      <w:r>
+        <w:rPr>
+          <w:noProof/>
+        </w:rPr>
+        <w:drawing>
+          <wp:inline distT="0" distB="0" distL="0" distR="0" wp14:anchorId="5943C0DA" wp14:editId="1BB0B422">
+            <wp:extent cx="6480810" cy="2525395"/>
+            <wp:effectExtent l="0" t="0" r="0" b="8255"/>
+            <wp:docPr id="19" name="Рисунок 19"/>
+            <wp:cNvGraphicFramePr>
+              <a:graphicFrameLocks xmlns:a="http://schemas.openxmlformats.org/drawingml/2006/main" noChangeAspect="1"/>
+            </wp:cNvGraphicFramePr>
+            <a:graphic xmlns:a="http://schemas.openxmlformats.org/drawingml/2006/main">
+              <a:graphicData uri="http://schemas.openxmlformats.org/drawingml/2006/picture">
+                <pic:pic xmlns:pic="http://schemas.openxmlformats.org/drawingml/2006/picture">
+                  <pic:nvPicPr>
+                    <pic:cNvPr id="1" name=""/>
+                    <pic:cNvPicPr/>
+                  </pic:nvPicPr>
+                  <pic:blipFill>
+                    <a:blip r:embed="rId33"/>
+                    <a:stretch>
+                      <a:fillRect/>
+                    </a:stretch>
+                  </pic:blipFill>
+                  <pic:spPr>
+                    <a:xfrm>
+                      <a:off x="0" y="0"/>
                       <a:ext cx="6480810" cy="2525395"/>
                     </a:xfrm>
                     <a:prstGeom prst="rect">
@@ -17338,7 +17200,7 @@
           <w:color w:val="000000"/>
           <w:sz w:val="28"/>
         </w:rPr>
-        <w:t xml:space="preserve">На тринадцатом положительном фронте после запуска выполняется переход 10 → 6 и снимается RUN. Дальнейшие фронты отсутствуют; HEX показывает 6, </w:t>
+        <w:t xml:space="preserve">На тринадцатом положительном фронте после запуска выполняется переход 10 → 6 и снимается RUN. Дальнейшие фронты отсутствуют; HEX показывает 6, активен Y6. Повторный START без P_RES не запускает генератор, поскольку </w:t>
       </w:r>
       <w:r>
         <w:rPr>
@@ -17346,23 +17208,7 @@
           <w:sz w:val="28"/>
         </w:rPr>
         <w:lastRenderedPageBreak/>
-        <w:t>активен Y6. Повторный START без P_RES не запускает генератор, поскольку STOP остаётся единицей. U_</w:t>
-      </w:r>
-      <w:proofErr w:type="gramStart"/>
-      <w:r>
-        <w:rPr>
-          <w:color w:val="000000"/>
-          <w:sz w:val="28"/>
-        </w:rPr>
-        <w:t>CTRL:A</w:t>
-      </w:r>
-      <w:proofErr w:type="gramEnd"/>
-      <w:r>
-        <w:rPr>
-          <w:color w:val="000000"/>
-          <w:sz w:val="28"/>
-        </w:rPr>
-        <w:t xml:space="preserve"> и U_CTRL:B занимают обе секции одного дополнительного корпуса 74AS74.</w:t>
+        <w:t>STOP остаётся единицей. U_CTRL:A и U_CTRL:B занимают обе секции одного дополнительного корпуса 74AS74.</w:t>
       </w:r>
     </w:p>
     <w:p>
@@ -17456,7 +17302,7 @@
                     <pic:cNvPicPr/>
                   </pic:nvPicPr>
                   <pic:blipFill>
-                    <a:blip r:embed="rId33"/>
+                    <a:blip r:embed="rId34"/>
                     <a:stretch>
                       <a:fillRect/>
                     </a:stretch>
@@ -17533,8 +17379,15 @@
           <w:color w:val="000000"/>
           <w:sz w:val="28"/>
         </w:rPr>
+        <w:t xml:space="preserve">Проверка остановки выполняется отдельно: после 13 положительных </w:t>
+      </w:r>
+      <w:r>
+        <w:rPr>
+          <w:color w:val="000000"/>
+          <w:sz w:val="28"/>
+        </w:rPr>
         <w:lastRenderedPageBreak/>
-        <w:t>Проверка остановки выполняется отдельно: после 13 положительных фронтов относительно начального кода 13 должны наблюдаться HEX = 6, Y6 = 1, STOP = 1, RUN = 0 и неизменный CLK = 1. Необходимо также проверить отсутствие самопроизвольной остановки при переходе 7 → 8 и невозможность повторного запуска без общей начальной установки.</w:t>
+        <w:t>фронтов относительно начального кода 13 должны наблюдаться HEX = 6, Y6 = 1, STOP = 1, RUN = 0 и неизменный CLK = 1. Необходимо также проверить отсутствие самопроизвольной остановки при переходе 7 → 8 и невозможность повторного запуска без общей начальной установки.</w:t>
       </w:r>
     </w:p>
     <w:p>
@@ -17590,145 +17443,6 @@
                 <pic:pic xmlns:pic="http://schemas.openxmlformats.org/drawingml/2006/picture">
                   <pic:nvPicPr>
                     <pic:cNvPr id="0" name="fig_2_22.png"/>
-                    <pic:cNvPicPr/>
-                  </pic:nvPicPr>
-                  <pic:blipFill>
-                    <a:blip r:embed="rId34"/>
-                    <a:stretch>
-                      <a:fillRect/>
-                    </a:stretch>
-                  </pic:blipFill>
-                  <pic:spPr>
-                    <a:xfrm>
-                      <a:off x="0" y="0"/>
-                      <a:ext cx="5940000" cy="3041566"/>
-                    </a:xfrm>
-                    <a:prstGeom prst="rect">
-                      <a:avLst/>
-                    </a:prstGeom>
-                  </pic:spPr>
-                </pic:pic>
-              </a:graphicData>
-            </a:graphic>
-          </wp:inline>
-        </w:drawing>
-      </w:r>
-    </w:p>
-    <w:p>
-      <w:pPr>
-        <w:keepLines/>
-        <w:spacing w:after="160" w:line="276" w:lineRule="auto"/>
-        <w:ind w:right="283"/>
-        <w:jc w:val="center"/>
-        <w:rPr>
-          <w:color w:val="000000"/>
-          <w:sz w:val="28"/>
-        </w:rPr>
-      </w:pPr>
-      <w:r>
-        <w:rPr>
-          <w:color w:val="000000"/>
-          <w:sz w:val="28"/>
-          <w:highlight w:val="yellow"/>
-        </w:rPr>
-        <w:t>Рисунок 2.22 – Расчётная диаграмма измерения длительности импульса CLK</w:t>
-      </w:r>
-    </w:p>
-    <w:p>
-      <w:pPr>
-        <w:keepLines/>
-        <w:spacing w:after="160" w:line="276" w:lineRule="auto"/>
-        <w:ind w:right="283"/>
-        <w:jc w:val="center"/>
-        <w:rPr>
-          <w:sz w:val="28"/>
-        </w:rPr>
-      </w:pPr>
-    </w:p>
-    <w:p>
-      <w:pPr>
-        <w:spacing w:line="360" w:lineRule="auto"/>
-        <w:ind w:right="283" w:firstLine="709"/>
-        <w:jc w:val="both"/>
-      </w:pPr>
-      <w:r>
-        <w:rPr>
-          <w:color w:val="000000"/>
-          <w:sz w:val="28"/>
-        </w:rPr>
-        <w:t>Ожидаемая разность T2 − T1 ≈ 0,660569 с. Заданная длительность 0,66 с соблюдается с погрешностью округления около +0,0863 %. RUN во время этих импульсов должен сохранять единицу. Амплитуды нарисованы как условные логические уровни, а не гарантированные аналоговые напряжения TTL.</w:t>
-      </w:r>
-    </w:p>
-    <w:p>
-      <w:pPr>
-        <w:spacing w:line="360" w:lineRule="auto"/>
-        <w:ind w:right="283" w:firstLine="709"/>
-        <w:jc w:val="both"/>
-      </w:pPr>
-      <w:r>
-        <w:rPr>
-          <w:color w:val="000000"/>
-          <w:sz w:val="28"/>
-        </w:rPr>
-        <w:t xml:space="preserve">Для отчёта эту иллюстрацию следует заменить собственным снимком XSC1 с видимыми курсорами и полем разности времени. Если измеренная длительность </w:t>
-      </w:r>
-      <w:r>
-        <w:rPr>
-          <w:color w:val="000000"/>
-          <w:sz w:val="28"/>
-        </w:rPr>
-        <w:lastRenderedPageBreak/>
-        <w:t>заметно отличается, сначала проверяется точка CLK после инвертора, затем номиналы R2 и C1. Одного визуального сходства формы сигнала недостаточно.</w:t>
-      </w:r>
-    </w:p>
-    <w:p>
-      <w:pPr>
-        <w:spacing w:line="360" w:lineRule="auto"/>
-        <w:ind w:right="283" w:firstLine="709"/>
-        <w:jc w:val="both"/>
-      </w:pPr>
-      <w:r>
-        <w:rPr>
-          <w:sz w:val="2"/>
-        </w:rPr>
-        <w:t>=</w:t>
-      </w:r>
-      <w:r>
-        <w:rPr>
-          <w:color w:val="000000"/>
-          <w:sz w:val="28"/>
-        </w:rPr>
-        <w:t>Для измерения периода курсор T1 остаётся на положительном фронте CLK, T2 переносится на следующий положительный фронт. Расчётное положение курсоров показано на рисунке 2.23.</w:t>
-      </w:r>
-    </w:p>
-    <w:p>
-      <w:pPr>
-        <w:keepNext/>
-        <w:keepLines/>
-        <w:spacing w:after="80"/>
-        <w:ind w:right="283"/>
-        <w:jc w:val="center"/>
-        <w:rPr>
-          <w:sz w:val="28"/>
-        </w:rPr>
-      </w:pPr>
-      <w:r>
-        <w:rPr>
-          <w:noProof/>
-        </w:rPr>
-        <w:drawing>
-          <wp:inline distT="0" distB="0" distL="0" distR="0" wp14:anchorId="640689DB" wp14:editId="69E381DB">
-            <wp:extent cx="5940000" cy="3041566"/>
-            <wp:effectExtent l="0" t="0" r="0" b="0"/>
-            <wp:docPr id="918597030" name="Picture 918597030" descr="Рисунок 2.23 – Расчётная диаграмма измерения периода повторения CLK"/>
-            <wp:cNvGraphicFramePr>
-              <a:graphicFrameLocks xmlns:a="http://schemas.openxmlformats.org/drawingml/2006/main" noChangeAspect="1"/>
-            </wp:cNvGraphicFramePr>
-            <a:graphic xmlns:a="http://schemas.openxmlformats.org/drawingml/2006/main">
-              <a:graphicData uri="http://schemas.openxmlformats.org/drawingml/2006/picture">
-                <pic:pic xmlns:pic="http://schemas.openxmlformats.org/drawingml/2006/picture">
-                  <pic:nvPicPr>
-                    <pic:cNvPr id="0" name="fig_2_23.png"/>
                     <pic:cNvPicPr/>
                   </pic:nvPicPr>
                   <pic:blipFill>
@@ -17770,6 +17484,145 @@
           <w:sz w:val="28"/>
           <w:highlight w:val="yellow"/>
         </w:rPr>
+        <w:t>Рисунок 2.22 – Расчётная диаграмма измерения длительности импульса CLK</w:t>
+      </w:r>
+    </w:p>
+    <w:p>
+      <w:pPr>
+        <w:keepLines/>
+        <w:spacing w:after="160" w:line="276" w:lineRule="auto"/>
+        <w:ind w:right="283"/>
+        <w:jc w:val="center"/>
+        <w:rPr>
+          <w:sz w:val="28"/>
+        </w:rPr>
+      </w:pPr>
+    </w:p>
+    <w:p>
+      <w:pPr>
+        <w:spacing w:line="360" w:lineRule="auto"/>
+        <w:ind w:right="283" w:firstLine="709"/>
+        <w:jc w:val="both"/>
+      </w:pPr>
+      <w:r>
+        <w:rPr>
+          <w:color w:val="000000"/>
+          <w:sz w:val="28"/>
+        </w:rPr>
+        <w:t>Ожидаемая разность T2 − T1 ≈ 0,660569 с. Заданная длительность 0,66 с соблюдается с погрешностью округления около +0,0863 %. RUN во время этих импульсов должен сохранять единицу. Амплитуды нарисованы как условные логические уровни, а не гарантированные аналоговые напряжения TTL.</w:t>
+      </w:r>
+    </w:p>
+    <w:p>
+      <w:pPr>
+        <w:spacing w:line="360" w:lineRule="auto"/>
+        <w:ind w:right="283" w:firstLine="709"/>
+        <w:jc w:val="both"/>
+      </w:pPr>
+      <w:r>
+        <w:rPr>
+          <w:color w:val="000000"/>
+          <w:sz w:val="28"/>
+        </w:rPr>
+        <w:t xml:space="preserve">Для отчёта эту иллюстрацию следует заменить собственным снимком XSC1 с видимыми курсорами и полем разности времени. Если измеренная длительность заметно отличается, сначала проверяется точка CLK после инвертора, затем </w:t>
+      </w:r>
+      <w:r>
+        <w:rPr>
+          <w:color w:val="000000"/>
+          <w:sz w:val="28"/>
+        </w:rPr>
+        <w:lastRenderedPageBreak/>
+        <w:t>номиналы R2 и C1. Одного визуального сходства формы сигнала недостаточно.</w:t>
+      </w:r>
+    </w:p>
+    <w:p>
+      <w:pPr>
+        <w:spacing w:line="360" w:lineRule="auto"/>
+        <w:ind w:right="283" w:firstLine="709"/>
+        <w:jc w:val="both"/>
+      </w:pPr>
+      <w:r>
+        <w:rPr>
+          <w:sz w:val="2"/>
+        </w:rPr>
+        <w:t>=</w:t>
+      </w:r>
+      <w:r>
+        <w:rPr>
+          <w:color w:val="000000"/>
+          <w:sz w:val="28"/>
+        </w:rPr>
+        <w:t>Для измерения периода курсор T1 остаётся на положительном фронте CLK, T2 переносится на следующий положительный фронт. Расчётное положение курсоров показано на рисунке 2.23.</w:t>
+      </w:r>
+    </w:p>
+    <w:p>
+      <w:pPr>
+        <w:keepNext/>
+        <w:keepLines/>
+        <w:spacing w:after="80"/>
+        <w:ind w:right="283"/>
+        <w:jc w:val="center"/>
+        <w:rPr>
+          <w:sz w:val="28"/>
+        </w:rPr>
+      </w:pPr>
+      <w:r>
+        <w:rPr>
+          <w:noProof/>
+        </w:rPr>
+        <w:drawing>
+          <wp:inline distT="0" distB="0" distL="0" distR="0" wp14:anchorId="640689DB" wp14:editId="69E381DB">
+            <wp:extent cx="5940000" cy="3041566"/>
+            <wp:effectExtent l="0" t="0" r="0" b="0"/>
+            <wp:docPr id="918597030" name="Picture 918597030" descr="Рисунок 2.23 – Расчётная диаграмма измерения периода повторения CLK"/>
+            <wp:cNvGraphicFramePr>
+              <a:graphicFrameLocks xmlns:a="http://schemas.openxmlformats.org/drawingml/2006/main" noChangeAspect="1"/>
+            </wp:cNvGraphicFramePr>
+            <a:graphic xmlns:a="http://schemas.openxmlformats.org/drawingml/2006/main">
+              <a:graphicData uri="http://schemas.openxmlformats.org/drawingml/2006/picture">
+                <pic:pic xmlns:pic="http://schemas.openxmlformats.org/drawingml/2006/picture">
+                  <pic:nvPicPr>
+                    <pic:cNvPr id="0" name="fig_2_23.png"/>
+                    <pic:cNvPicPr/>
+                  </pic:nvPicPr>
+                  <pic:blipFill>
+                    <a:blip r:embed="rId36"/>
+                    <a:stretch>
+                      <a:fillRect/>
+                    </a:stretch>
+                  </pic:blipFill>
+                  <pic:spPr>
+                    <a:xfrm>
+                      <a:off x="0" y="0"/>
+                      <a:ext cx="5940000" cy="3041566"/>
+                    </a:xfrm>
+                    <a:prstGeom prst="rect">
+                      <a:avLst/>
+                    </a:prstGeom>
+                  </pic:spPr>
+                </pic:pic>
+              </a:graphicData>
+            </a:graphic>
+          </wp:inline>
+        </w:drawing>
+      </w:r>
+    </w:p>
+    <w:p>
+      <w:pPr>
+        <w:keepLines/>
+        <w:spacing w:after="160" w:line="276" w:lineRule="auto"/>
+        <w:ind w:right="283"/>
+        <w:jc w:val="center"/>
+        <w:rPr>
+          <w:color w:val="000000"/>
+          <w:sz w:val="28"/>
+        </w:rPr>
+      </w:pPr>
+      <w:r>
+        <w:rPr>
+          <w:color w:val="000000"/>
+          <w:sz w:val="28"/>
+          <w:highlight w:val="yellow"/>
+        </w:rPr>
         <w:t>Рисунок 2.23 – Расчётная диаграмма измерения периода повторения CLK</w:t>
       </w:r>
     </w:p>
@@ -17898,7 +17751,7 @@
                     <pic:cNvPicPr/>
                   </pic:nvPicPr>
                   <pic:blipFill>
-                    <a:blip r:embed="rId36"/>
+                    <a:blip r:embed="rId37"/>
                     <a:stretch>
                       <a:fillRect/>
                     </a:stretch>
@@ -18751,7 +18604,7 @@
                     <pic:cNvPicPr/>
                   </pic:nvPicPr>
                   <pic:blipFill>
-                    <a:blip r:embed="rId37"/>
+                    <a:blip r:embed="rId38"/>
                     <a:stretch>
                       <a:fillRect/>
                     </a:stretch>
@@ -19109,25 +18962,7 @@
           <w:sz w:val="28"/>
           <w:lang w:val="en-US"/>
         </w:rPr>
-        <w:t xml:space="preserve">2. Texas Instruments. Dual Positive-Edge-Triggered D-Type Flip-Flops </w:t>
-      </w:r>
-      <w:proofErr w:type="gramStart"/>
-      <w:r>
-        <w:rPr>
-          <w:color w:val="000000"/>
-          <w:sz w:val="28"/>
-          <w:lang w:val="en-US"/>
-        </w:rPr>
-        <w:t>With</w:t>
-      </w:r>
-      <w:proofErr w:type="gramEnd"/>
-      <w:r>
-        <w:rPr>
-          <w:color w:val="000000"/>
-          <w:sz w:val="28"/>
-          <w:lang w:val="en-US"/>
-        </w:rPr>
-        <w:t xml:space="preserve"> Clear And Preset. </w:t>
+        <w:t xml:space="preserve">2. Texas Instruments. Dual Positive-Edge-Triggered D-Type Flip-Flops With Clear And Preset. </w:t>
       </w:r>
       <w:r>
         <w:rPr>
@@ -19193,25 +19028,7 @@
           <w:sz w:val="28"/>
           <w:lang w:val="en-US"/>
         </w:rPr>
-        <w:t xml:space="preserve">5. Texas Instruments. SN74LS07 Hex Buffers and Drivers </w:t>
-      </w:r>
-      <w:proofErr w:type="gramStart"/>
-      <w:r>
-        <w:rPr>
-          <w:color w:val="000000"/>
-          <w:sz w:val="28"/>
-          <w:lang w:val="en-US"/>
-        </w:rPr>
-        <w:t>With</w:t>
-      </w:r>
-      <w:proofErr w:type="gramEnd"/>
-      <w:r>
-        <w:rPr>
-          <w:color w:val="000000"/>
-          <w:sz w:val="28"/>
-          <w:lang w:val="en-US"/>
-        </w:rPr>
-        <w:t xml:space="preserve"> Open-Collector High-Voltage Outputs. </w:t>
+        <w:t xml:space="preserve">5. Texas Instruments. SN74LS07 Hex Buffers and Drivers With Open-Collector High-Voltage Outputs. </w:t>
       </w:r>
       <w:r>
         <w:rPr>

</xml_diff>

<commit_message>
project: save coursework progress; next refine formatting using two samples
</commit_message>
<xml_diff>
--- a/deliverables/Курсовая_Блинов_текущая.docx
+++ b/deliverables/Курсовая_Блинов_текущая.docx
@@ -11033,7 +11033,6 @@
         <w:rPr>
           <w:color w:val="000000"/>
           <w:sz w:val="28"/>
-          <w:lang w:val="en-US"/>
         </w:rPr>
       </w:pPr>
       <w:r>
@@ -17287,10 +17286,10 @@
           <w:noProof/>
         </w:rPr>
         <w:drawing>
-          <wp:inline distT="0" distB="0" distL="0" distR="0" wp14:anchorId="5F328F0E" wp14:editId="31A6F4E9">
-            <wp:extent cx="5940000" cy="2808000"/>
-            <wp:effectExtent l="0" t="0" r="0" b="0"/>
-            <wp:docPr id="918597028" name="Picture 918597028" descr="Рисунок 2.21 – Расчётная схема проверки временных характеристик генератора и триггера"/>
+          <wp:inline distT="0" distB="0" distL="0" distR="0" wp14:anchorId="6A38BA43" wp14:editId="346D58DC">
+            <wp:extent cx="6480810" cy="3027045"/>
+            <wp:effectExtent l="0" t="0" r="0" b="1905"/>
+            <wp:docPr id="20" name="Рисунок 20"/>
             <wp:cNvGraphicFramePr>
               <a:graphicFrameLocks xmlns:a="http://schemas.openxmlformats.org/drawingml/2006/main" noChangeAspect="1"/>
             </wp:cNvGraphicFramePr>
@@ -17298,7 +17297,7 @@
               <a:graphicData uri="http://schemas.openxmlformats.org/drawingml/2006/picture">
                 <pic:pic xmlns:pic="http://schemas.openxmlformats.org/drawingml/2006/picture">
                   <pic:nvPicPr>
-                    <pic:cNvPr id="0" name="fig_2_21.png"/>
+                    <pic:cNvPr id="1" name=""/>
                     <pic:cNvPicPr/>
                   </pic:nvPicPr>
                   <pic:blipFill>
@@ -17310,7 +17309,7 @@
                   <pic:spPr>
                     <a:xfrm>
                       <a:off x="0" y="0"/>
-                      <a:ext cx="5940000" cy="2808000"/>
+                      <a:ext cx="6480810" cy="3027045"/>
                     </a:xfrm>
                     <a:prstGeom prst="rect">
                       <a:avLst/>
@@ -17431,10 +17430,10 @@
           <w:noProof/>
         </w:rPr>
         <w:drawing>
-          <wp:inline distT="0" distB="0" distL="0" distR="0" wp14:anchorId="6D0E6CE7" wp14:editId="5D74C716">
-            <wp:extent cx="5940000" cy="3041566"/>
-            <wp:effectExtent l="0" t="0" r="0" b="0"/>
-            <wp:docPr id="918597029" name="Picture 918597029" descr="Рисунок 2.22 – Расчётная диаграмма измерения длительности импульса CLK"/>
+          <wp:inline distT="0" distB="0" distL="0" distR="0" wp14:anchorId="76ED0452" wp14:editId="7DCBC422">
+            <wp:extent cx="5305425" cy="4343400"/>
+            <wp:effectExtent l="0" t="0" r="9525" b="0"/>
+            <wp:docPr id="21" name="Рисунок 21"/>
             <wp:cNvGraphicFramePr>
               <a:graphicFrameLocks xmlns:a="http://schemas.openxmlformats.org/drawingml/2006/main" noChangeAspect="1"/>
             </wp:cNvGraphicFramePr>
@@ -17442,7 +17441,7 @@
               <a:graphicData uri="http://schemas.openxmlformats.org/drawingml/2006/picture">
                 <pic:pic xmlns:pic="http://schemas.openxmlformats.org/drawingml/2006/picture">
                   <pic:nvPicPr>
-                    <pic:cNvPr id="0" name="fig_2_22.png"/>
+                    <pic:cNvPr id="1" name=""/>
                     <pic:cNvPicPr/>
                   </pic:nvPicPr>
                   <pic:blipFill>
@@ -17454,7 +17453,7 @@
                   <pic:spPr>
                     <a:xfrm>
                       <a:off x="0" y="0"/>
-                      <a:ext cx="5940000" cy="3041566"/>
+                      <a:ext cx="5305425" cy="4343400"/>
                     </a:xfrm>
                     <a:prstGeom prst="rect">
                       <a:avLst/>
@@ -17509,7 +17508,30 @@
           <w:color w:val="000000"/>
           <w:sz w:val="28"/>
         </w:rPr>
-        <w:t>Ожидаемая разность T2 − T1 ≈ 0,660569 с. Заданная длительность 0,66 с соблюдается с погрешностью округления около +0,0863 %. RUN во время этих импульсов должен сохранять единицу. Амплитуды нарисованы как условные логические уровни, а не гарантированные аналоговые напряжения TTL.</w:t>
+        <w:t xml:space="preserve">Ожидаемая разность T2 − T1 ≈ </w:t>
+      </w:r>
+      <w:r>
+        <w:rPr>
+          <w:color w:val="000000"/>
+          <w:sz w:val="28"/>
+          <w:highlight w:val="yellow"/>
+        </w:rPr>
+        <w:t>0,660569</w:t>
+      </w:r>
+      <w:r>
+        <w:rPr>
+          <w:color w:val="000000"/>
+          <w:sz w:val="28"/>
+        </w:rPr>
+        <w:t xml:space="preserve"> с. Заданная длительность 0,66 с соблюдается с погрешностью округления около +0,0863 %. RUN во время этих </w:t>
+      </w:r>
+      <w:r>
+        <w:rPr>
+          <w:color w:val="000000"/>
+          <w:sz w:val="28"/>
+        </w:rPr>
+        <w:lastRenderedPageBreak/>
+        <w:t>импульсов должен сохранять единицу. Амплитуды нарисованы как условные логические уровни, а не гарантированные аналоговые напряжения TTL.</w:t>
       </w:r>
     </w:p>
     <w:p>
@@ -17523,15 +17545,7 @@
           <w:color w:val="000000"/>
           <w:sz w:val="28"/>
         </w:rPr>
-        <w:t xml:space="preserve">Для отчёта эту иллюстрацию следует заменить собственным снимком XSC1 с видимыми курсорами и полем разности времени. Если измеренная длительность заметно отличается, сначала проверяется точка CLK после инвертора, затем </w:t>
-      </w:r>
-      <w:r>
-        <w:rPr>
-          <w:color w:val="000000"/>
-          <w:sz w:val="28"/>
-        </w:rPr>
-        <w:lastRenderedPageBreak/>
-        <w:t>номиналы R2 и C1. Одного визуального сходства формы сигнала недостаточно.</w:t>
+        <w:t>Для отчёта эту иллюстрацию следует заменить собственным снимком XSC1 с видимыми курсорами и полем разности времени. Если измеренная длительность заметно отличается, сначала проверяется точка CLK после инвертора, затем номиналы R2 и C1. Одного визуального сходства формы сигнала недостаточно.</w:t>
       </w:r>
     </w:p>
     <w:p>
@@ -17570,10 +17584,10 @@
           <w:noProof/>
         </w:rPr>
         <w:drawing>
-          <wp:inline distT="0" distB="0" distL="0" distR="0" wp14:anchorId="640689DB" wp14:editId="69E381DB">
-            <wp:extent cx="5940000" cy="3041566"/>
-            <wp:effectExtent l="0" t="0" r="0" b="0"/>
-            <wp:docPr id="918597030" name="Picture 918597030" descr="Рисунок 2.23 – Расчётная диаграмма измерения периода повторения CLK"/>
+          <wp:inline distT="0" distB="0" distL="0" distR="0" wp14:anchorId="7385AEC3" wp14:editId="6A8E5650">
+            <wp:extent cx="5305425" cy="4343400"/>
+            <wp:effectExtent l="0" t="0" r="9525" b="0"/>
+            <wp:docPr id="22" name="Рисунок 22"/>
             <wp:cNvGraphicFramePr>
               <a:graphicFrameLocks xmlns:a="http://schemas.openxmlformats.org/drawingml/2006/main" noChangeAspect="1"/>
             </wp:cNvGraphicFramePr>
@@ -17581,7 +17595,7 @@
               <a:graphicData uri="http://schemas.openxmlformats.org/drawingml/2006/picture">
                 <pic:pic xmlns:pic="http://schemas.openxmlformats.org/drawingml/2006/picture">
                   <pic:nvPicPr>
-                    <pic:cNvPr id="0" name="fig_2_23.png"/>
+                    <pic:cNvPr id="1" name=""/>
                     <pic:cNvPicPr/>
                   </pic:nvPicPr>
                   <pic:blipFill>
@@ -17593,7 +17607,7 @@
                   <pic:spPr>
                     <a:xfrm>
                       <a:off x="0" y="0"/>
-                      <a:ext cx="5940000" cy="3041566"/>
+                      <a:ext cx="5305425" cy="4343400"/>
                     </a:xfrm>
                     <a:prstGeom prst="rect">
                       <a:avLst/>
@@ -17648,7 +17662,30 @@
           <w:color w:val="000000"/>
           <w:sz w:val="28"/>
         </w:rPr>
-        <w:t>Ожидаемый период T2 − T1 ≈ 1,351082 с, что отличается от заданных 1,35 с приблизительно на +0,0802 %. Длительность низкого уровня составляет 0,690513 с. После проверки tH период уточняется подбором R1, затем оба параметра измеряются повторно.</w:t>
+        <w:t xml:space="preserve">Ожидаемый период T2 − T1 ≈ </w:t>
+      </w:r>
+      <w:r>
+        <w:rPr>
+          <w:color w:val="000000"/>
+          <w:sz w:val="28"/>
+          <w:highlight w:val="yellow"/>
+        </w:rPr>
+        <w:t>1,351082</w:t>
+      </w:r>
+      <w:r>
+        <w:rPr>
+          <w:color w:val="000000"/>
+          <w:sz w:val="28"/>
+        </w:rPr>
+        <w:t xml:space="preserve"> с, что отличается от заданных 1,35 с приблизительно на +0,0802 %. Длительность низкого уровня составляет 0,690513 с. После проверки tH период уточняется подбором R1, затем оба параметра </w:t>
+      </w:r>
+      <w:r>
+        <w:rPr>
+          <w:color w:val="000000"/>
+          <w:sz w:val="28"/>
+        </w:rPr>
+        <w:lastRenderedPageBreak/>
+        <w:t>измеряются повторно.</w:t>
       </w:r>
     </w:p>
     <w:p>
@@ -17736,10 +17773,10 @@
           <w:noProof/>
         </w:rPr>
         <w:drawing>
-          <wp:inline distT="0" distB="0" distL="0" distR="0" wp14:anchorId="57F98C98" wp14:editId="1B937B7D">
-            <wp:extent cx="5508000" cy="3702600"/>
+          <wp:inline distT="0" distB="0" distL="0" distR="0" wp14:anchorId="35ACF412" wp14:editId="2F645847">
+            <wp:extent cx="6480810" cy="4694555"/>
             <wp:effectExtent l="0" t="0" r="0" b="0"/>
-            <wp:docPr id="918597031" name="Picture 918597031" descr="Рисунок 3.1 – Расчётная функциональная схема управляющего устройства"/>
+            <wp:docPr id="13" name="Рисунок 13"/>
             <wp:cNvGraphicFramePr>
               <a:graphicFrameLocks xmlns:a="http://schemas.openxmlformats.org/drawingml/2006/main" noChangeAspect="1"/>
             </wp:cNvGraphicFramePr>
@@ -17747,7 +17784,7 @@
               <a:graphicData uri="http://schemas.openxmlformats.org/drawingml/2006/picture">
                 <pic:pic xmlns:pic="http://schemas.openxmlformats.org/drawingml/2006/picture">
                   <pic:nvPicPr>
-                    <pic:cNvPr id="0" name="fig_3_1_system.png"/>
+                    <pic:cNvPr id="1" name=""/>
                     <pic:cNvPicPr/>
                   </pic:nvPicPr>
                   <pic:blipFill>
@@ -17759,7 +17796,7 @@
                   <pic:spPr>
                     <a:xfrm>
                       <a:off x="0" y="0"/>
-                      <a:ext cx="5508000" cy="3702600"/>
+                      <a:ext cx="6480810" cy="4694555"/>
                     </a:xfrm>
                     <a:prstGeom prst="rect">
                       <a:avLst/>
@@ -17787,7 +17824,6 @@
         <w:rPr>
           <w:color w:val="000000"/>
           <w:sz w:val="28"/>
-          <w:highlight w:val="yellow"/>
         </w:rPr>
         <w:t>Рисунок 3.1 – Расчётная функциональная схема управляющего устройства</w:t>
       </w:r>
@@ -17814,7 +17850,15 @@
           <w:color w:val="000000"/>
           <w:sz w:val="28"/>
         </w:rPr>
-        <w:t>На схеме используются ранее полученные блоки Logic_D, D_Counter, DC1, CLK_GEN и P_RES_GEN. Линия обратной связи передаёт прямые и инверсные выходы регистра на комбинационную логику. Четыре Probe показывают значения D3…D0, четырнадцать Probe — активный управляющий выход; HEX-индикатор отображает текущее состояние.</w:t>
+        <w:t xml:space="preserve">На схеме используются ранее полученные блоки Logic_D, D_Counter, DC1, CLK_GEN и P_RES_GEN. Линия обратной связи передаёт прямые и инверсные выходы регистра на комбинационную логику. Четыре Probe показывают значения </w:t>
+      </w:r>
+      <w:r>
+        <w:rPr>
+          <w:color w:val="000000"/>
+          <w:sz w:val="28"/>
+        </w:rPr>
+        <w:lastRenderedPageBreak/>
+        <w:t>D3…D0, четырнадцать Probe — активный управляющий выход; HEX-индикатор отображает текущее состояние.</w:t>
       </w:r>
     </w:p>
     <w:p>
@@ -17828,15 +17872,7 @@
           <w:color w:val="000000"/>
           <w:sz w:val="28"/>
         </w:rPr>
-        <w:t xml:space="preserve">XLA1 записывает выходы Y по карте рисунка 2.11; для общей диаграммы </w:t>
-      </w:r>
-      <w:r>
-        <w:rPr>
-          <w:color w:val="000000"/>
-          <w:sz w:val="28"/>
-        </w:rPr>
-        <w:lastRenderedPageBreak/>
-        <w:t>он перенастраивается, как описано в 3.2. Старый тестовый генератор отключается: выходы двух генераторов нельзя соединять между собой.</w:t>
+        <w:t>XLA1 записывает выходы Y по карте рисунка 2.11; для общей диаграммы он перенастраивается, как описано в 3.2. Старый тестовый генератор отключается: выходы двух генераторов нельзя соединять между собой.</w:t>
       </w:r>
     </w:p>
     <w:p>
@@ -18491,7 +18527,15 @@
           <w:color w:val="000000"/>
           <w:sz w:val="28"/>
         </w:rPr>
-        <w:t>Начальная установка формируется RC-цепью R3 = 10 кОм, C4 = 10 мкФ и двумя инверторами Шмитта 74HC14. Буфер 74LS07 с подтяжкой R4 = 1 кОм обеспечивает нагрузочную способность линии P_RES [3–5]. Питание всех блоков составляет 5 В, земля общая; у каждого корпуса предусматривается развязывающий конденсатор 100 нФ.</w:t>
+        <w:t xml:space="preserve">Начальная установка формируется RC-цепью R3 = 10 кОм, C4 = 10 мкФ и двумя инверторами Шмитта 74HC14. Буфер 74LS07 с подтяжкой R4 = 1 кОм </w:t>
+      </w:r>
+      <w:r>
+        <w:rPr>
+          <w:color w:val="000000"/>
+          <w:sz w:val="28"/>
+        </w:rPr>
+        <w:lastRenderedPageBreak/>
+        <w:t>обеспечивает нагрузочную способность линии P_RES [3–5]. Питание всех блоков составляет 5 В, земля общая; у каждого корпуса предусматривается развязывающий конденсатор 100 нФ.</w:t>
       </w:r>
     </w:p>
     <w:p>
@@ -18509,7 +18553,6 @@
           <w:color w:val="000000"/>
           <w:sz w:val="28"/>
         </w:rPr>
-        <w:lastRenderedPageBreak/>
         <w:t>Работа ПСУ подтверждена моделями Logic_D и D_Counter. Для общей схемы остаётся проверить запуск, дешифрацию и остановку по STOP.</w:t>
       </w:r>
     </w:p>
@@ -18589,10 +18632,10 @@
           <w:noProof/>
         </w:rPr>
         <w:drawing>
-          <wp:inline distT="0" distB="0" distL="0" distR="0" wp14:anchorId="03F51CD7" wp14:editId="6D6020F2">
-            <wp:extent cx="5760000" cy="3274105"/>
-            <wp:effectExtent l="0" t="0" r="0" b="0"/>
-            <wp:docPr id="918597032" name="Picture 918597032" descr="Рисунок 3.2 – Расчётная временная диаграмма сигналов управляющего устройства"/>
+          <wp:inline distT="0" distB="0" distL="0" distR="0" wp14:anchorId="0BD21643" wp14:editId="15ACB261">
+            <wp:extent cx="5186465" cy="4601552"/>
+            <wp:effectExtent l="0" t="0" r="0" b="8890"/>
+            <wp:docPr id="23" name="Рисунок 23"/>
             <wp:cNvGraphicFramePr>
               <a:graphicFrameLocks xmlns:a="http://schemas.openxmlformats.org/drawingml/2006/main" noChangeAspect="1"/>
             </wp:cNvGraphicFramePr>
@@ -18600,7 +18643,7 @@
               <a:graphicData uri="http://schemas.openxmlformats.org/drawingml/2006/picture">
                 <pic:pic xmlns:pic="http://schemas.openxmlformats.org/drawingml/2006/picture">
                   <pic:nvPicPr>
-                    <pic:cNvPr id="0" name="fig_3_2_timing.png"/>
+                    <pic:cNvPr id="1" name=""/>
                     <pic:cNvPicPr/>
                   </pic:nvPicPr>
                   <pic:blipFill>
@@ -18612,7 +18655,7 @@
                   <pic:spPr>
                     <a:xfrm>
                       <a:off x="0" y="0"/>
-                      <a:ext cx="5760000" cy="3274105"/>
+                      <a:ext cx="5195878" cy="4609903"/>
                     </a:xfrm>
                     <a:prstGeom prst="rect">
                       <a:avLst/>
@@ -18667,6 +18710,7 @@
           <w:color w:val="000000"/>
           <w:sz w:val="28"/>
         </w:rPr>
+        <w:lastRenderedPageBreak/>
         <w:t>При START ↑ устанавливается RUN = 1, а CLK сначала падает. Первый положительный фронт возникает приблизительно через 1,0944 с при исходно разряженном C1; далее фронты следуют через 1,351082 с. Состояния меняются в порядке D–2–E–B–0–C–9–5–7–8–4–3–A–6.</w:t>
       </w:r>
     </w:p>
@@ -18681,15 +18725,7 @@
           <w:color w:val="000000"/>
           <w:sz w:val="28"/>
         </w:rPr>
-        <w:t xml:space="preserve">На тринадцатом фронте происходит переход A → 6 и устанавливается STOP. Время от START равно 1,0944 + 12 · 1,351082 ≈ 17,3074 с. RUN сбрасывается; CLK = 1, HEX = 6 и Y6 = 1 сохраняются. Задержки логики на </w:t>
-      </w:r>
-      <w:r>
-        <w:rPr>
-          <w:color w:val="000000"/>
-          <w:sz w:val="28"/>
-        </w:rPr>
-        <w:lastRenderedPageBreak/>
-        <w:t>расчётной диаграмме не показаны.</w:t>
+        <w:t>На тринадцатом фронте происходит переход A → 6 и устанавливается STOP. Время от START равно 1,0944 + 12 · 1,351082 ≈ 17,3074 с. RUN сбрасывается; CLK = 1, HEX = 6 и Y6 = 1 сохраняются. Задержки логики на расчётной диаграмме не показаны.</w:t>
       </w:r>
     </w:p>
     <w:p>
@@ -18794,7 +18830,15 @@
           <w:color w:val="000000"/>
           <w:sz w:val="28"/>
         </w:rPr>
-        <w:t>В состоянии 10 активен E10. На следующем фронте ПСУ принимает 6, а триггер STOP записывает единицу. NOT_STOP через AND2 сбрасывает RUN. В этот момент OUT таймера уже низкий, поэтому его сброс сохраняет высокий CLK без дополнительного положительного фронта. Состояние 6 удерживается до общей начальной установки.</w:t>
+        <w:t xml:space="preserve">В состоянии 10 активен E10. На следующем фронте ПСУ принимает 6, а триггер STOP записывает единицу. NOT_STOP через AND2 сбрасывает RUN. В </w:t>
+      </w:r>
+      <w:r>
+        <w:rPr>
+          <w:color w:val="000000"/>
+          <w:sz w:val="28"/>
+        </w:rPr>
+        <w:lastRenderedPageBreak/>
+        <w:t>этот момент OUT таймера уже низкий, поэтому его сброс сохраняет высокий CLK без дополнительного положительного фронта. Состояние 6 удерживается до общей начальной установки.</w:t>
       </w:r>
     </w:p>
     <w:p>
@@ -18822,7 +18866,6 @@
           <w:color w:val="000000"/>
           <w:sz w:val="28"/>
         </w:rPr>
-        <w:lastRenderedPageBreak/>
         <w:t>Проверка минимизированной логики на исключённых кодах дала переходы 1 → 13 и 15 → 2. При разрешённом тактировании возврат в рабочую последовательность занимает один такт, но до него дешифратор может выдавать несколько единиц. Поэтому штатный запуск всегда выполняется после P_RES.</w:t>
       </w:r>
     </w:p>

</xml_diff>